<commit_message>
Pendencia 3: TCC oficial AquaSense no repositorio; rascunho vira historico
TCC_AQUASENSE.md transcreve fielmente o TCC da equipe (PDF) com as
correcoes fechadas: titulo sem placeholder, composicao oficial dos
R$260 mil, OPEX/reducao de 93,5%/payback/ROI na viabilidade,
grafia piezorresistivo/ESP32, BOM com custo de referencia e
marcadores [PREENCHER] nos anexos pendentes. TCC_ENTREGA.docx
regenerado (ABNT) a partir dele. TCC_RASCUNHO.md recebe nota de
documento historico/material-fonte.

Co-Authored-By: Claude Fable 5 <noreply@anthropic.com>
Claude-Session: https://claude.ai/code/session_01RKkR7Ama1X95U16pZjmgTV
</commit_message>
<xml_diff>
--- a/docs/tcc/TCC_ENTREGA.docx
+++ b/docs/tcc/TCC_ENTREGA.docx
@@ -18,10 +18,9 @@
         <w:rPr>
           <w:rFonts w:ascii="Arial" w:hAnsi="Arial" w:cs="Arial"/>
           <w:b/>
-          <w:color w:val="C00000"/>
           <w:sz w:val="24"/>
         </w:rPr>
-        <w:t>[PREENCHER: unidade]</w:t>
+        <w:t>Belo Horizonte HORTO</w:t>
       </w:r>
     </w:p>
     <w:p>
@@ -55,10 +54,9 @@
         <w:rPr>
           <w:rFonts w:ascii="Arial" w:hAnsi="Arial" w:cs="Arial"/>
           <w:b/>
-          <w:color w:val="C00000"/>
           <w:sz w:val="24"/>
         </w:rPr>
-        <w:t>[PREENCHER: nomes dos alunos]</w:t>
+        <w:t>Gustavo, Marcelo, Matheus, Isadora</w:t>
       </w:r>
     </w:p>
     <w:p>
@@ -195,7 +193,7 @@
           <w:i w:val="0"/>
           <w:sz w:val="28"/>
         </w:rPr>
-        <w:t>SISTEMA IOT DE MONITORAMENTO ONLINE DO NÍVEL D'ÁGUA EM PIEZÔMETROS DE BARRAGENS DE MINERAÇÃO</w:t>
+        <w:t>AQUASENSE: SISTEMA DE TELEMETRIA E MONITORAMENTO GEOTÉCNICO REMOTO E CONTÍNUO PARA PIEZÔMETROS VIA IOT</w:t>
       </w:r>
     </w:p>
     <w:p>
@@ -365,10 +363,9 @@
         <w:rPr>
           <w:rFonts w:ascii="Arial" w:hAnsi="Arial" w:cs="Arial"/>
           <w:b/>
-          <w:color w:val="C00000"/>
           <w:sz w:val="24"/>
         </w:rPr>
-        <w:t>[PREENCHER: nomes dos alunos]</w:t>
+        <w:t>Gustavo, Marcelo, Matheus, Isadora</w:t>
       </w:r>
     </w:p>
     <w:p>
@@ -417,7 +414,7 @@
           <w:i w:val="0"/>
           <w:sz w:val="28"/>
         </w:rPr>
-        <w:t>SISTEMA IOT DE MONITORAMENTO ONLINE DO NÍVEL D'ÁGUA EM PIEZÔMETROS DE BARRAGENS DE MINERAÇÃO</w:t>
+        <w:t>AQUASENSE: SISTEMA DE TELEMETRIA E MONITORAMENTO GEOTÉCNICO REMOTO E CONTÍNUO PARA PIEZÔMETROS VIA IOT</w:t>
       </w:r>
     </w:p>
     <w:p>
@@ -497,23 +494,7 @@
           <w:rFonts w:ascii="Arial" w:hAnsi="Arial" w:cs="Arial"/>
           <w:sz w:val="20"/>
         </w:rPr>
-        <w:t xml:space="preserve">Projeto apresentado ao SENAI </w:t>
-      </w:r>
-      <w:r>
-        <w:rPr>
-          <w:rFonts w:ascii="Arial" w:hAnsi="Arial" w:cs="Arial"/>
-          <w:b/>
-          <w:color w:val="C00000"/>
-          <w:sz w:val="20"/>
-        </w:rPr>
-        <w:t>[PREENCHER: unidade]</w:t>
-      </w:r>
-      <w:r>
-        <w:rPr>
-          <w:rFonts w:ascii="Arial" w:hAnsi="Arial" w:cs="Arial"/>
-          <w:sz w:val="20"/>
-        </w:rPr>
-        <w:t xml:space="preserve"> como parte da avaliação do desafio SAGA (Samarco), sob orientação de </w:t>
+        <w:t xml:space="preserve">Projeto apresentado ao SENAI Belo Horizonte HORTO como parte da avaliação do desafio SAGA (Samarco), sob orientação de </w:t>
       </w:r>
       <w:r>
         <w:rPr>
@@ -706,6 +687,20 @@
           <w:rFonts w:ascii="Arial" w:hAnsi="Arial" w:cs="Arial"/>
           <w:sz w:val="24"/>
         </w:rPr>
+        <w:t>1 TÍTULO</w:t>
+      </w:r>
+    </w:p>
+    <w:p>
+      <w:pPr>
+        <w:spacing w:lineRule="auto" w:line="360" w:after="80"/>
+        <w:ind w:firstLine="0"/>
+        <w:jc w:val="left"/>
+      </w:pPr>
+      <w:r>
+        <w:rPr>
+          <w:rFonts w:ascii="Arial" w:hAnsi="Arial" w:cs="Arial"/>
+          <w:sz w:val="24"/>
+        </w:rPr>
         <w:t>1.1 EQUIPE</w:t>
       </w:r>
     </w:p>
@@ -860,7 +855,7 @@
           <w:rFonts w:ascii="Arial" w:hAnsi="Arial" w:cs="Arial"/>
           <w:sz w:val="24"/>
         </w:rPr>
-        <w:t>1.4.1 BMG Canvas</w:t>
+        <w:t>1.4.1 Orçamento Estimado (BOM)</w:t>
       </w:r>
     </w:p>
     <w:p>
@@ -874,7 +869,21 @@
           <w:rFonts w:ascii="Arial" w:hAnsi="Arial" w:cs="Arial"/>
           <w:sz w:val="24"/>
         </w:rPr>
-        <w:t>1.4.2 Situação de aprendizagem</w:t>
+        <w:t>1.4.2 BMG Canvas</w:t>
+      </w:r>
+    </w:p>
+    <w:p>
+      <w:pPr>
+        <w:spacing w:lineRule="auto" w:line="360" w:after="80"/>
+        <w:ind w:firstLine="0"/>
+        <w:jc w:val="left"/>
+      </w:pPr>
+      <w:r>
+        <w:rPr>
+          <w:rFonts w:ascii="Arial" w:hAnsi="Arial" w:cs="Arial"/>
+          <w:sz w:val="24"/>
+        </w:rPr>
+        <w:t>1.4.3 Situação de Aprendizagem</w:t>
       </w:r>
     </w:p>
     <w:p>
@@ -919,7 +928,59 @@
           <w:b/>
           <w:sz w:val="24"/>
         </w:rPr>
+        <w:t>AQUASENSE: SISTEMA DE TELEMETRIA E MONITORAMENTO GEOTÉCNICO REMOTO E CONTÍNUO PARA PIEZÔMETROS VIA IOT</w:t>
+      </w:r>
+    </w:p>
+    <w:p>
+      <w:pPr>
+        <w:spacing w:lineRule="auto" w:line="360" w:after="120" w:before="240"/>
+        <w:ind w:firstLine="0"/>
+        <w:jc w:val="left"/>
+      </w:pPr>
+      <w:r>
+        <w:rPr>
+          <w:rFonts w:ascii="Arial" w:hAnsi="Arial" w:cs="Arial"/>
+          <w:b/>
+          <w:sz w:val="24"/>
+        </w:rPr>
         <w:t>1.1 EQUIPE</w:t>
+      </w:r>
+    </w:p>
+    <w:p>
+      <w:pPr>
+        <w:spacing w:lineRule="auto" w:line="360" w:after="120" w:before="0"/>
+        <w:ind w:firstLine="709"/>
+        <w:jc w:val="both"/>
+      </w:pPr>
+      <w:r>
+        <w:rPr>
+          <w:rFonts w:ascii="Arial" w:hAnsi="Arial" w:cs="Arial"/>
+          <w:sz w:val="24"/>
+        </w:rPr>
+        <w:t>Unidade SENAI: Belo Horizonte HORTO</w:t>
+      </w:r>
+    </w:p>
+    <w:p>
+      <w:pPr>
+        <w:spacing w:lineRule="auto" w:line="360" w:after="120" w:before="0"/>
+        <w:ind w:firstLine="709"/>
+        <w:jc w:val="both"/>
+      </w:pPr>
+      <w:r>
+        <w:rPr>
+          <w:rFonts w:ascii="Arial" w:hAnsi="Arial" w:cs="Arial"/>
+          <w:sz w:val="24"/>
+        </w:rPr>
+        <w:t xml:space="preserve">Instrutor orientador: </w:t>
+      </w:r>
+      <w:r>
+        <w:rPr>
+          <w:rFonts w:ascii="Arial" w:hAnsi="Arial" w:cs="Arial"/>
+          <w:b/>
+          <w:color w:val="C00000"/>
+          <w:sz w:val="24"/>
+        </w:rPr>
+        <w:t>[PREENCHER: instrutor orientador]</w:t>
       </w:r>
     </w:p>
     <w:tbl>
@@ -951,7 +1012,7 @@
                 <w:b/>
                 <w:sz w:val="20"/>
               </w:rPr>
-              <w:t>Aluno</w:t>
+              <w:t>ALUNO</w:t>
             </w:r>
           </w:p>
         </w:tc>
@@ -971,7 +1032,7 @@
                 <w:b/>
                 <w:sz w:val="20"/>
               </w:rPr>
-              <w:t>Curso</w:t>
+              <w:t>CURSO</w:t>
             </w:r>
           </w:p>
         </w:tc>
@@ -991,7 +1052,7 @@
                 <w:b/>
                 <w:sz w:val="20"/>
               </w:rPr>
-              <w:t>Função no projeto</w:t>
+              <w:t>FUNÇÃO NO PROJETO</w:t>
             </w:r>
           </w:p>
         </w:tc>
@@ -1010,11 +1071,9 @@
             <w:r>
               <w:rPr>
                 <w:rFonts w:ascii="Arial" w:hAnsi="Arial" w:cs="Arial"/>
-                <w:b/>
-                <w:color w:val="C00000"/>
                 <w:sz w:val="20"/>
               </w:rPr>
-              <w:t>[PREENCHER]</w:t>
+              <w:t>Gustavo</w:t>
             </w:r>
           </w:p>
         </w:tc>
@@ -1031,11 +1090,9 @@
             <w:r>
               <w:rPr>
                 <w:rFonts w:ascii="Arial" w:hAnsi="Arial" w:cs="Arial"/>
-                <w:b/>
-                <w:color w:val="C00000"/>
                 <w:sz w:val="20"/>
               </w:rPr>
-              <w:t>[PREENCHER]</w:t>
+              <w:t>Técnico em Automação Industrial</w:t>
             </w:r>
           </w:p>
         </w:tc>
@@ -1052,11 +1109,9 @@
             <w:r>
               <w:rPr>
                 <w:rFonts w:ascii="Arial" w:hAnsi="Arial" w:cs="Arial"/>
-                <w:b/>
-                <w:color w:val="C00000"/>
                 <w:sz w:val="20"/>
               </w:rPr>
-              <w:t>[PREENCHER]</w:t>
+              <w:t>Programação do firmware em C/C++ para o microcontrolador ESP32, implementação do mecanismo de store &amp; forward com carimbo de tempo, controle do modo deep sleep e integração com o backend em nuvem.</w:t>
             </w:r>
           </w:p>
         </w:tc>
@@ -1075,11 +1130,9 @@
             <w:r>
               <w:rPr>
                 <w:rFonts w:ascii="Arial" w:hAnsi="Arial" w:cs="Arial"/>
-                <w:b/>
-                <w:color w:val="C00000"/>
                 <w:sz w:val="20"/>
               </w:rPr>
-              <w:t>[PREENCHER]</w:t>
+              <w:t>Marcelo</w:t>
             </w:r>
           </w:p>
         </w:tc>
@@ -1096,11 +1149,9 @@
             <w:r>
               <w:rPr>
                 <w:rFonts w:ascii="Arial" w:hAnsi="Arial" w:cs="Arial"/>
-                <w:b/>
-                <w:color w:val="C00000"/>
                 <w:sz w:val="20"/>
               </w:rPr>
-              <w:t>[PREENCHER]</w:t>
+              <w:t>Técnico em Automação Industrial</w:t>
             </w:r>
           </w:p>
         </w:tc>
@@ -1117,11 +1168,9 @@
             <w:r>
               <w:rPr>
                 <w:rFonts w:ascii="Arial" w:hAnsi="Arial" w:cs="Arial"/>
-                <w:b/>
-                <w:color w:val="C00000"/>
                 <w:sz w:val="20"/>
               </w:rPr>
-              <w:t>[PREENCHER]</w:t>
+              <w:t>Projeto e dimensionamento do circuito de alimentação autônoma (painel solar, controlador de carga e bateria selada de 12 V 18 Ah) e calibração do sinal de corrente de 4 a 20 mA.</w:t>
             </w:r>
           </w:p>
         </w:tc>
@@ -1140,11 +1189,9 @@
             <w:r>
               <w:rPr>
                 <w:rFonts w:ascii="Arial" w:hAnsi="Arial" w:cs="Arial"/>
-                <w:b/>
-                <w:color w:val="C00000"/>
                 <w:sz w:val="20"/>
               </w:rPr>
-              <w:t>[PREENCHER]</w:t>
+              <w:t>Matheus</w:t>
             </w:r>
           </w:p>
         </w:tc>
@@ -1161,11 +1208,9 @@
             <w:r>
               <w:rPr>
                 <w:rFonts w:ascii="Arial" w:hAnsi="Arial" w:cs="Arial"/>
-                <w:b/>
-                <w:color w:val="C00000"/>
                 <w:sz w:val="20"/>
               </w:rPr>
-              <w:t>[PREENCHER]</w:t>
+              <w:t>Técnico em Automação Industrial</w:t>
             </w:r>
           </w:p>
         </w:tc>
@@ -1182,11 +1227,9 @@
             <w:r>
               <w:rPr>
                 <w:rFonts w:ascii="Arial" w:hAnsi="Arial" w:cs="Arial"/>
-                <w:b/>
-                <w:color w:val="C00000"/>
                 <w:sz w:val="20"/>
               </w:rPr>
-              <w:t>[PREENCHER]</w:t>
+              <w:t>Construção e dimensionamento da bancada física de simulação hidráulica vertical em PVC para testes experimentais e desenvolvimento do gabinete de proteção IP66.</w:t>
             </w:r>
           </w:p>
         </w:tc>
@@ -1205,11 +1248,9 @@
             <w:r>
               <w:rPr>
                 <w:rFonts w:ascii="Arial" w:hAnsi="Arial" w:cs="Arial"/>
-                <w:b/>
-                <w:color w:val="C00000"/>
                 <w:sz w:val="20"/>
               </w:rPr>
-              <w:t>[PREENCHER]</w:t>
+              <w:t>Isadora</w:t>
             </w:r>
           </w:p>
         </w:tc>
@@ -1226,11 +1267,9 @@
             <w:r>
               <w:rPr>
                 <w:rFonts w:ascii="Arial" w:hAnsi="Arial" w:cs="Arial"/>
-                <w:b/>
-                <w:color w:val="C00000"/>
                 <w:sz w:val="20"/>
               </w:rPr>
-              <w:t>[PREENCHER]</w:t>
+              <w:t>Técnico em Automação Industrial</w:t>
             </w:r>
           </w:p>
         </w:tc>
@@ -1247,11 +1286,9 @@
             <w:r>
               <w:rPr>
                 <w:rFonts w:ascii="Arial" w:hAnsi="Arial" w:cs="Arial"/>
-                <w:b/>
-                <w:color w:val="C00000"/>
                 <w:sz w:val="20"/>
               </w:rPr>
-              <w:t>[PREENCHER]</w:t>
+              <w:t>Modelagem 3D do gabinete e dos suportes dos sensores, redação da documentação técnica oficial do projeto, cotação comercial de componentes e elaboração do orçamento de hardware (BOM).</w:t>
             </w:r>
           </w:p>
         </w:tc>
@@ -1261,68 +1298,6 @@
       <w:pPr>
         <w:spacing w:after="120"/>
       </w:pPr>
-    </w:p>
-    <w:p>
-      <w:pPr>
-        <w:spacing w:lineRule="auto" w:line="360" w:after="120" w:before="0"/>
-        <w:ind w:firstLine="709"/>
-        <w:jc w:val="both"/>
-      </w:pPr>
-      <w:r>
-        <w:rPr>
-          <w:rFonts w:ascii="Arial" w:hAnsi="Arial" w:cs="Arial"/>
-          <w:b/>
-          <w:sz w:val="24"/>
-        </w:rPr>
-        <w:t>Unidade SENAI:</w:t>
-      </w:r>
-      <w:r>
-        <w:rPr>
-          <w:rFonts w:ascii="Arial" w:hAnsi="Arial" w:cs="Arial"/>
-          <w:sz w:val="24"/>
-        </w:rPr>
-        <w:t xml:space="preserve"> </w:t>
-      </w:r>
-      <w:r>
-        <w:rPr>
-          <w:rFonts w:ascii="Arial" w:hAnsi="Arial" w:cs="Arial"/>
-          <w:b/>
-          <w:color w:val="C00000"/>
-          <w:sz w:val="24"/>
-        </w:rPr>
-        <w:t>[PREENCHER]</w:t>
-      </w:r>
-    </w:p>
-    <w:p>
-      <w:pPr>
-        <w:spacing w:lineRule="auto" w:line="360" w:after="120" w:before="0"/>
-        <w:ind w:firstLine="709"/>
-        <w:jc w:val="both"/>
-      </w:pPr>
-      <w:r>
-        <w:rPr>
-          <w:rFonts w:ascii="Arial" w:hAnsi="Arial" w:cs="Arial"/>
-          <w:b/>
-          <w:sz w:val="24"/>
-        </w:rPr>
-        <w:t>Instrutor orientador:</w:t>
-      </w:r>
-      <w:r>
-        <w:rPr>
-          <w:rFonts w:ascii="Arial" w:hAnsi="Arial" w:cs="Arial"/>
-          <w:sz w:val="24"/>
-        </w:rPr>
-        <w:t xml:space="preserve"> </w:t>
-      </w:r>
-      <w:r>
-        <w:rPr>
-          <w:rFonts w:ascii="Arial" w:hAnsi="Arial" w:cs="Arial"/>
-          <w:b/>
-          <w:color w:val="C00000"/>
-          <w:sz w:val="24"/>
-        </w:rPr>
-        <w:t>[PREENCHER]</w:t>
-      </w:r>
     </w:p>
     <w:p>
       <w:pPr>
@@ -1350,7 +1325,7 @@
           <w:rFonts w:ascii="Arial" w:hAnsi="Arial" w:cs="Arial"/>
           <w:sz w:val="24"/>
         </w:rPr>
-        <w:t>A segurança de barragens de mineração depende, entre outros fatores, do monitoramento contínuo da poropressão no maciço, isto é, da pressão da água nos poros do solo, medida por instrumentos chamados piezômetros. Pelo princípio das tensões efetivas de Terzaghi (σ' = σ − u), quando a poropressão (u) sobe sem que a tensão total (σ) mude, a tensão efetiva (σ') cai, reduzindo a resistência ao cisalhamento do maciço e aumentando o risco de liquefação. Foi exatamente esse mecanismo, linha freática alta sem rebaixamento efetivo e auscultação deficiente, que os relatórios oficiais apontam como fator nas rupturas das barragens de Fundão (Mariana, 2015, 19 mortos) e B1 (Brumadinho, 2019, 270 mortos).</w:t>
+        <w:t>O monitoramento da estabilidade geotécnica de barragens de contenção de rejeitos, taludes e cavas de mineração depende, em grande medida, do acompanhamento contínuo do nível do lençol freático interno das estruturas. Esse acompanhamento é realizado por meio de piezômetros, instrumentos instalados em poços verticais que indicam a poropressão da água dentro do maciço. Quando esse nível se eleva além dos limites previstos em projeto, cresce o risco de saturação e de perda de estabilidade da estrutura, o que torna a leitura periódica desses instrumentos uma atividade crítica de segurança.</w:t>
       </w:r>
     </w:p>
     <w:p>
@@ -1364,7 +1339,7 @@
           <w:rFonts w:ascii="Arial" w:hAnsi="Arial" w:cs="Arial"/>
           <w:sz w:val="24"/>
         </w:rPr>
-        <w:t>O desafio SAGA, proposto pela Samarco Mineração S.A., parte de uma demanda concreta: hoje a leitura de piezômetros em boa parte das instalações ainda é feita manualmente, por equipe terceirizada que se desloca até o local com frequência periódica (semanal a mensal, em operação estabilizada). Esse modelo carrega três problemas: um custo recorrente relevante (a Samarco declara, no próprio edital do desafio, uma economia estimada de R$ 600 mil por ano ao substituir a medição manual terceirizada por monitoramento automatizado), o risco de a frequência de leitura não acompanhar a velocidade real de uma anomalia (uma leitura semanal pode não capturar a elevação de poropressão a tempo de disparar uma resposta) e a dependência de que alguém, fisicamente, esteja olhando o dado no momento certo.</w:t>
+        <w:t>Na prática ainda amplamente adotada, essa leitura é feita manualmente, com equipes técnicas que se deslocam até o campo para medir o nível de água em cada poço com trenas elétricas ou sonoras. Esse método manual concentra três problemas relevantes. O primeiro é o risco à saúde e à segurança do trabalho, uma vez que os operadores precisam caminhar e permanecer periodicamente em áreas de alta periculosidade, muitas vezes dentro de zonas de autossalvamento de barragens de mineração. O segundo é a baixa resolução temporal dos dados coletados, já que leituras realizadas apenas uma vez por semana ou por mês não são capazes de capturar transientes hidráulicos rápidos provocados por chuvas intensas, comprometendo a capacidade de mitigação preventiva de incidentes. O terceiro é o custo operacional elevado, decorrente da contratação de equipes de campo, do deslocamento de veículos e do consumo de combustível associados a rotinas de leitura recorrentes.</w:t>
       </w:r>
     </w:p>
     <w:p>
@@ -1378,7 +1353,7 @@
           <w:rFonts w:ascii="Arial" w:hAnsi="Arial" w:cs="Arial"/>
           <w:sz w:val="24"/>
         </w:rPr>
-        <w:t>O problema, porém, é maior do que uma barragem específica. A legislação pós-Brumadinho (Lei 14.066/2020 e Resolução ANM 95/2022) passou a exigir monitoramento automatizado, em tempo real e em período integral, para barragens de Dano Potencial Associado (DPA) alto, mas essa automação profissional (piezômetros de corda vibrante, dataloggers, telemetria industrial) tem custo elevado e preço tipicamente "sob consulta". Segundo o Sistema Nacional de Informações sobre Segurança de Barragens (SNISB), o Brasil tem 28.043 barragens cadastradas, das quais apenas 6.210 estão enquadradas na Política Nacional de Segurança de Barragens (PNSB), ou seja, a esmagadora maioria das estruturas do país, incluindo pequenas barragens de água, açudes e aterros sanitários, segue sem instrumentação automatizada, lida manualmente ou não lida.</w:t>
+        <w:t>A dimensão do problema no Brasil reforça a relevância do tema. Segundo o Sistema Nacional de Informações sobre Segurança de Barragens, existem cerca de 28.043 barragens cadastradas no país, das quais apenas aproximadamente 6.210 estão enquadradas na Política Nacional de Segurança de Barragens. A ampla maioria das estruturas segue, portanto, sem qualquer automação de monitoramento, dependendo de leitura manual ou mesmo da ausência completa de leitura, o que inclui pequenas barragens de água e açudes, aterros sanitários com piezômetros de chorume, diques, encostas urbanas monitoradas por defesa civil e pilhas de estéril que não se enquadram na categoria de Dano Potencial Associado alto.</w:t>
       </w:r>
     </w:p>
     <w:p>
@@ -1392,7 +1367,21 @@
           <w:rFonts w:ascii="Arial" w:hAnsi="Arial" w:cs="Arial"/>
           <w:sz w:val="24"/>
         </w:rPr>
-        <w:t>Este projeto responde à demanda oficial do desafio SAGA (monitoramento contínuo de piezômetro, transmissão em tempo real, dashboard, histórico e alertas preventivos) e, ao mesmo tempo, evidencia que a solução construída se aplica à camada de estruturas que hoje não tem acesso a monitoramento automatizado por barreira de custo, não apenas às barragens de DPA alto que já são obrigadas por lei a monitorar.</w:t>
+        <w:t>A Resolução ANM 95/2022 estabelece a obrigatoriedade de monitoramento automatizado em tempo real e período integral, com redundância de energia e centro de monitoramento dedicado, exclusivamente para barragens classificadas com Dano Potencial Associado alto. Essa exigência regulatória atende apenas a uma parcela pequena do universo total de estruturas geotécnicas do país, deixando descoberta uma camada expressiva de barragens, açudes, aterros e taludes que hoje não têm nenhuma automação e que, por restrição orçamentária, não conseguem contratar as soluções comerciais de telemetria disponíveis no mercado, tipicamente cotadas na casa de dezenas de milhares de reais por ponto de monitoramento.</w:t>
+      </w:r>
+    </w:p>
+    <w:p>
+      <w:pPr>
+        <w:spacing w:lineRule="auto" w:line="360" w:after="120" w:before="0"/>
+        <w:ind w:firstLine="709"/>
+        <w:jc w:val="both"/>
+      </w:pPr>
+      <w:r>
+        <w:rPr>
+          <w:rFonts w:ascii="Arial" w:hAnsi="Arial" w:cs="Arial"/>
+          <w:sz w:val="24"/>
+        </w:rPr>
+        <w:t>O AquaSense parte, portanto, de uma demanda real de monitoramento contínuo de piezômetros em barragens de mineração, na qual a substituição da leitura manual terceirizada por sensoriamento automático foi apontada como necessidade explícita para reduzir custo operacional, aumentar a segurança das equipes de campo e assegurar a disponibilidade de dados em tempo real para a tomada de decisão.</w:t>
       </w:r>
     </w:p>
     <w:p>
@@ -1412,34 +1401,6 @@
     </w:p>
     <w:p>
       <w:pPr>
-        <w:spacing w:lineRule="auto" w:line="360" w:after="120" w:before="0"/>
-        <w:ind w:firstLine="709"/>
-        <w:jc w:val="both"/>
-      </w:pPr>
-      <w:r>
-        <w:rPr>
-          <w:rFonts w:ascii="Arial" w:hAnsi="Arial" w:cs="Arial"/>
-          <w:sz w:val="24"/>
-        </w:rPr>
-        <w:t>O sistema é composto por um ESP32 com sensor de nível d'água que envia leituras a cada 10 segundos, via HTTP autenticado, para um Cloudflare Worker que grava os dados em um banco Cloudflare D1 (SQLite gerenciado). Um cron trigger de 1 minuto no próprio Worker executa um motor de alertas em três camadas que classifica cada leitura em NORMAL, ATENÇÃO ou CRÍTICO e dispara notificações por Telegram e/ou SMS (Twilio) nas transições de faixa. Um dashboard web hospedado no GitHub Pages consome os mesmos dados (últimas leituras e séries históricas) para exibir gráficos, mapa e histórico de eventos em tempo real. O firmware implementa store and forward: leituras feitas sem conectividade ficam retidas em buffer local, com timestamp obtido por NTP, e são reenviadas assim que a rede volta, sem perda de dados.</w:t>
-      </w:r>
-    </w:p>
-    <w:p>
-      <w:pPr>
-        <w:spacing w:lineRule="auto" w:line="360" w:after="120" w:before="0"/>
-        <w:ind w:firstLine="709"/>
-        <w:jc w:val="both"/>
-      </w:pPr>
-      <w:r>
-        <w:rPr>
-          <w:rFonts w:ascii="Arial" w:hAnsi="Arial" w:cs="Arial"/>
-          <w:sz w:val="24"/>
-        </w:rPr>
-        <w:t>Cabe deixar claro, desde já, o papel de cada parte deste trabalho. O protótipo, montado com componentes de bancada, é a representação funcional da ideia: existe para demonstrar a arquitetura operando de ponta a ponta, do sensor ao alerta no celular. O produto do trabalho é maior do que ele e independe dele: é a plataforma de software completa (backend, banco, motor de alertas e dashboard, todos em produção), a especificação de engenharia da versão profissional, a pesquisa de mercado com fontes, a análise de viabilidade econômica com preço e retorno calculados e o protocolo de validação experimental, todos desenvolvidos pela equipe e apresentados nas seções seguintes.</w:t>
-      </w:r>
-    </w:p>
-    <w:p>
-      <w:pPr>
         <w:spacing w:lineRule="auto" w:line="360" w:after="120" w:before="120"/>
         <w:ind w:firstLine="0"/>
         <w:jc w:val="left"/>
@@ -1464,7 +1425,7 @@
           <w:rFonts w:ascii="Arial" w:hAnsi="Arial" w:cs="Arial"/>
           <w:sz w:val="24"/>
         </w:rPr>
-        <w:t>Internet das Coisas (IoT) e sistemas embarcados, computação em nuvem serverless (Cloudflare Workers, D1 e KV) e instrumentação geotécnica aplicada à segurança de barragens.</w:t>
+        <w:t>O projeto está inserido nas áreas de Automação Industrial, Internet das Coisas Industrial e Tecnologia da Informação aplicada à computação em nuvem, reunindo instrumentação eletrônica de campo, comunicação de dados via rede celular e desenvolvimento de sistemas de software para ingestão, armazenamento e visualização de dados em tempo real.</w:t>
       </w:r>
     </w:p>
     <w:p>
@@ -1493,7 +1454,7 @@
           <w:rFonts w:ascii="Arial" w:hAnsi="Arial" w:cs="Arial"/>
           <w:sz w:val="24"/>
         </w:rPr>
-        <w:t>Soluções comerciais de automação de instrumentação geotécnica (piezômetro de corda vibrante, datalogger e telemetria industrial) já existem e atendem bem às barragens de DPA alto, mas a preço tipicamente "sob consulta", o que naturalmente restringe sua adoção à camada de estruturas com orçamento e obrigação legal para isso. Uma pesquisa de mercado conduzida durante o projeto confirmou esse ponto de forma direta: nenhum dos oito fabricantes e integradores pesquisados (Worldsensing, Geokon, Sisgeo, Ackcio, Encardio-rite, RST Instruments e Canary Systems, além de revendedores brasileiros) publica uma tabela de preços; todos direcionam o interessado para "fale com vendas". O único número concreto de custo de automação de instrumentação encontrado na pesquisa vem de um artigo técnico do IBRACON de 2007 sobre automação de medidores triortogonais (não piezômetros de corda vibrante, mas o dado mais próximo disponível): entre US$ 1.636 e US$ 2.370 por instrumento, quase vinte anos atrás.</w:t>
+        <w:t>O AquaSense promove a transformação digital do monitoramento geotécnico, substituindo a coleta manual e intermitente por medições elétricas automatizadas e contínuas. Do ponto de vista técnico, o projeto integra instrumentação industrial de referência, como o loop de corrente de 4 a 20 mA e a conversão analógico digital de alta resolução, a uma arquitetura de nuvem moderna, capaz de processar alertas em tempo real sem depender de infraestrutura própria de servidores.</w:t>
       </w:r>
     </w:p>
     <w:p>
@@ -1507,7 +1468,7 @@
           <w:rFonts w:ascii="Arial" w:hAnsi="Arial" w:cs="Arial"/>
           <w:sz w:val="24"/>
         </w:rPr>
-        <w:t>Este projeto não compete com essa automação profissional: ele democratiza o conceito de centro de monitoramento contínuo com alertas automáticos para a camada de barragens, açudes e aterros que hoje é lida à mão, a um custo de hardware por ponto estimado em R$ 150 a R$ 220 no cenário de protótipo (ESP32, sensor ultrassônico, display OLED, sinalização luminosa e sonora e acessórios de montagem), somado a um backend que opera dentro do free tier da Cloudflare. A proposta de valor central é trocar a detecção tardia (uma leitura manual periódica que só revela uma anomalia dias ou semanas depois de ela começar) por alerta preventivo, com notificação em até aproximadamente um minuto após a transição de faixa.</w:t>
+        <w:t>Do ponto de vista econômico, a substituição da rotina de deslocamento de equipes e veículos por um sistema de telemetria contínua reduz de forma expressiva o custo operacional recorrente, com retorno de investimento estimado em poucos meses, conforme detalhado na análise de viabilidade econômica.</w:t>
       </w:r>
     </w:p>
     <w:p>
@@ -1521,35 +1482,7 @@
           <w:rFonts w:ascii="Arial" w:hAnsi="Arial" w:cs="Arial"/>
           <w:sz w:val="24"/>
         </w:rPr>
-        <w:t>Cabe uma ressalva honesta de terminologia: o protótipo, como construído hoje, mede coluna d'água por meio de um sensor ultrassônico, o que é tecnicamente mais próximo de um INA (indicador de nível d'água), que mede o nível freático geral, do que de um piezômetro de corda vibrante, cujo bulbo é selado com bentonita para isolar e medir a poropressão de uma camada específica do maciço. A diferença entre os dois está no elemento sensor e na instalação, não na eletrônica: toda a cadeia de telemetria, alertas e dashboard é idêntica para ambos os casos. Por isso o firmware foi desenhado com um contrato de "adapter" de sensor (</w:t>
-      </w:r>
-      <w:r>
-        <w:rPr>
-          <w:rFonts w:ascii="Courier New" w:hAnsi="Courier New" w:cs="Courier New"/>
-          <w:sz w:val="20"/>
-        </w:rPr>
-        <w:t>piezometro_core.h</w:t>
-      </w:r>
-      <w:r>
-        <w:rPr>
-          <w:rFonts w:ascii="Arial" w:hAnsi="Arial" w:cs="Arial"/>
-          <w:sz w:val="24"/>
-        </w:rPr>
-        <w:t xml:space="preserve"> mais arquivos </w:t>
-      </w:r>
-      <w:r>
-        <w:rPr>
-          <w:rFonts w:ascii="Courier New" w:hAnsi="Courier New" w:cs="Courier New"/>
-          <w:sz w:val="20"/>
-        </w:rPr>
-        <w:t>sketch_*.ino</w:t>
-      </w:r>
-      <w:r>
-        <w:rPr>
-          <w:rFonts w:ascii="Arial" w:hAnsi="Arial" w:cs="Arial"/>
-          <w:sz w:val="24"/>
-        </w:rPr>
-        <w:t xml:space="preserve"> intercambiáveis): para operar com um transdutor de pressão ou piezômetro de corda vibrante de verdade, bastaria escrever um novo adapter que leia o sinal do instrumento real e devolva a mesma grandeza (nível ou pressão), sem alterar o restante do sistema.</w:t>
+        <w:t>Do ponto de vista social e ambiental, o projeto elimina a exposição constante de trabalhadores a áreas de risco geotécnico e amplia o acesso ao monitoramento automatizado para estruturas que hoje não têm nenhuma automação, por não se enquadrarem nas exigências regulatórias voltadas apenas às barragens de maior porte. A lição central do projeto é a de que o dado coletado só tem valor quando se transforma em ação a tempo: um sistema que mede continuamente, mas não avisa ninguém quando o nível ultrapassa o limite seguro, não cumpre o papel de prevenção que o monitoramento geotécnico exige.</w:t>
       </w:r>
     </w:p>
     <w:p>
@@ -1578,7 +1511,7 @@
           <w:rFonts w:ascii="Arial" w:hAnsi="Arial" w:cs="Arial"/>
           <w:sz w:val="24"/>
         </w:rPr>
-        <w:t>O objetivo geral do projeto é desenvolver e demonstrar um sistema IoT de baixo custo para monitoramento contínuo do nível d'água em piezômetros de barragens, com transmissão em tempo real, histórico persistido e alertas preventivos automáticos.</w:t>
+        <w:t>Objetivo Geral: Desenvolver, integrar e homologar uma Unidade de Controle e Telemetria de baixo consumo para o monitoramento contínuo e remoto de piezômetros industriais, com processamento em nuvem, dashboard interativo e alertas preventivos em dupla via.</w:t>
       </w:r>
     </w:p>
     <w:p>
@@ -1592,7 +1525,175 @@
           <w:rFonts w:ascii="Arial" w:hAnsi="Arial" w:cs="Arial"/>
           <w:sz w:val="24"/>
         </w:rPr>
-        <w:t>Como objetivos específicos, o projeto se propõe a medir continuamente o nível d'água por meio de um sensor embarcado no ESP32, a intervalos regulares de 10 segundos no protótipo, e a transmitir cada leitura em tempo real para um backend em nuvem, autenticado por chave de dispositivo. Propõe também persistir o histórico completo das leituras em um banco de dados consultável, sem limite de retenção dentro do free tier utilizado, e classificar cada leitura em três faixas de risco (NORMAL, ATENÇÃO e CRÍTICO) com limiares parametrizáveis, cujo padrão é 12 m e 15 m, refletindo que os valores de controle reais são definidos caso a caso pelo projetista geotécnico. A isso se soma a emissão de alertas automáticos por Telegram e/ou SMS em até aproximadamente um minuto após uma transição de faixa, mesmo sem ninguém observando o dashboard no momento, e por fim a operação com resiliência a queda de conectividade, por meio de store and forward com buffer local e timestamp via NTP, sem perda de leituras.</w:t>
+        <w:t>Objetivos Específicos:</w:t>
+      </w:r>
+    </w:p>
+    <w:p>
+      <w:pPr>
+        <w:spacing w:lineRule="auto" w:line="360" w:after="80" w:before="0"/>
+        <w:ind w:left="709" w:firstLine="0"/>
+        <w:jc w:val="both"/>
+      </w:pPr>
+      <w:r>
+        <w:rPr>
+          <w:rFonts w:ascii="Arial" w:hAnsi="Arial" w:cs="Arial"/>
+          <w:sz w:val="24"/>
+        </w:rPr>
+        <w:t xml:space="preserve">•  </w:t>
+      </w:r>
+      <w:r>
+        <w:rPr>
+          <w:rFonts w:ascii="Arial" w:hAnsi="Arial" w:cs="Arial"/>
+          <w:sz w:val="24"/>
+        </w:rPr>
+        <w:t>Programar o firmware do microcontrolador ESP32 responsável pela leitura do sensor, pelo mecanismo de store &amp; forward com carimbo de tempo e pelo envio periódico dos dados para a nuvem.</w:t>
+      </w:r>
+    </w:p>
+    <w:p>
+      <w:pPr>
+        <w:spacing w:lineRule="auto" w:line="360" w:after="80" w:before="0"/>
+        <w:ind w:left="709" w:firstLine="0"/>
+        <w:jc w:val="both"/>
+      </w:pPr>
+      <w:r>
+        <w:rPr>
+          <w:rFonts w:ascii="Arial" w:hAnsi="Arial" w:cs="Arial"/>
+          <w:sz w:val="24"/>
+        </w:rPr>
+        <w:t xml:space="preserve">•  </w:t>
+      </w:r>
+      <w:r>
+        <w:rPr>
+          <w:rFonts w:ascii="Arial" w:hAnsi="Arial" w:cs="Arial"/>
+          <w:sz w:val="24"/>
+        </w:rPr>
+        <w:t>Desenvolver o backend em plataforma de computação em nuvem serverless, responsável pela ingestão, pelo armazenamento em banco de dados gerenciado e pela execução do motor de alertas por gatilho de tempo a cada minuto.</w:t>
+      </w:r>
+    </w:p>
+    <w:p>
+      <w:pPr>
+        <w:spacing w:lineRule="auto" w:line="360" w:after="80" w:before="0"/>
+        <w:ind w:left="709" w:firstLine="0"/>
+        <w:jc w:val="both"/>
+      </w:pPr>
+      <w:r>
+        <w:rPr>
+          <w:rFonts w:ascii="Arial" w:hAnsi="Arial" w:cs="Arial"/>
+          <w:sz w:val="24"/>
+        </w:rPr>
+        <w:t xml:space="preserve">•  </w:t>
+      </w:r>
+      <w:r>
+        <w:rPr>
+          <w:rFonts w:ascii="Arial" w:hAnsi="Arial" w:cs="Arial"/>
+          <w:sz w:val="24"/>
+        </w:rPr>
+        <w:t>Construir um dashboard web interativo capaz de exibir a leitura atual, o histórico em série temporal e os eventos de alerta de cada instrumento monitorado.</w:t>
+      </w:r>
+    </w:p>
+    <w:p>
+      <w:pPr>
+        <w:spacing w:lineRule="auto" w:line="360" w:after="80" w:before="0"/>
+        <w:ind w:left="709" w:firstLine="0"/>
+        <w:jc w:val="both"/>
+      </w:pPr>
+      <w:r>
+        <w:rPr>
+          <w:rFonts w:ascii="Arial" w:hAnsi="Arial" w:cs="Arial"/>
+          <w:sz w:val="24"/>
+        </w:rPr>
+        <w:t xml:space="preserve">•  </w:t>
+      </w:r>
+      <w:r>
+        <w:rPr>
+          <w:rFonts w:ascii="Arial" w:hAnsi="Arial" w:cs="Arial"/>
+          <w:sz w:val="24"/>
+        </w:rPr>
+        <w:t>Implementar o sistema de alertas preventivos em dupla via, por Telegram e por SMS, disparado nas transições de faixa de nível e repetido enquanto persistir a condição crítica.</w:t>
+      </w:r>
+    </w:p>
+    <w:p>
+      <w:pPr>
+        <w:spacing w:lineRule="auto" w:line="360" w:after="80" w:before="0"/>
+        <w:ind w:left="709" w:firstLine="0"/>
+        <w:jc w:val="both"/>
+      </w:pPr>
+      <w:r>
+        <w:rPr>
+          <w:rFonts w:ascii="Arial" w:hAnsi="Arial" w:cs="Arial"/>
+          <w:sz w:val="24"/>
+        </w:rPr>
+        <w:t xml:space="preserve">•  </w:t>
+      </w:r>
+      <w:r>
+        <w:rPr>
+          <w:rFonts w:ascii="Arial" w:hAnsi="Arial" w:cs="Arial"/>
+          <w:sz w:val="24"/>
+        </w:rPr>
+        <w:t>Projetar a Unidade de Controle e Telemetria industrial, incluindo o transdutor piezorresistivo submersível de 4 a 20 mA, o conversor analógico digital de 16 bits e o módulo de comunicação celular 4G.</w:t>
+      </w:r>
+    </w:p>
+    <w:p>
+      <w:pPr>
+        <w:spacing w:lineRule="auto" w:line="360" w:after="80" w:before="0"/>
+        <w:ind w:left="709" w:firstLine="0"/>
+        <w:jc w:val="both"/>
+      </w:pPr>
+      <w:r>
+        <w:rPr>
+          <w:rFonts w:ascii="Arial" w:hAnsi="Arial" w:cs="Arial"/>
+          <w:sz w:val="24"/>
+        </w:rPr>
+        <w:t xml:space="preserve">•  </w:t>
+      </w:r>
+      <w:r>
+        <w:rPr>
+          <w:rFonts w:ascii="Arial" w:hAnsi="Arial" w:cs="Arial"/>
+          <w:sz w:val="24"/>
+        </w:rPr>
+        <w:t>Dimensionar o sistema de alimentação autônoma da unidade de campo, composto por painel solar, controlador de carga e bateria selada, garantindo autonomia energética prolongada.</w:t>
+      </w:r>
+    </w:p>
+    <w:p>
+      <w:pPr>
+        <w:spacing w:lineRule="auto" w:line="360" w:after="80" w:before="0"/>
+        <w:ind w:left="709" w:firstLine="0"/>
+        <w:jc w:val="both"/>
+      </w:pPr>
+      <w:r>
+        <w:rPr>
+          <w:rFonts w:ascii="Arial" w:hAnsi="Arial" w:cs="Arial"/>
+          <w:sz w:val="24"/>
+        </w:rPr>
+        <w:t xml:space="preserve">•  </w:t>
+      </w:r>
+      <w:r>
+        <w:rPr>
+          <w:rFonts w:ascii="Arial" w:hAnsi="Arial" w:cs="Arial"/>
+          <w:sz w:val="24"/>
+        </w:rPr>
+        <w:t>Especificar o invólucro de campo com grau de proteção IP66, prensa cabos e proteção contra surtos, adequado à exposição ambiental de instalações geotécnicas.</w:t>
+      </w:r>
+    </w:p>
+    <w:p>
+      <w:pPr>
+        <w:spacing w:lineRule="auto" w:line="360" w:after="80" w:before="0"/>
+        <w:ind w:left="709" w:firstLine="0"/>
+        <w:jc w:val="both"/>
+      </w:pPr>
+      <w:r>
+        <w:rPr>
+          <w:rFonts w:ascii="Arial" w:hAnsi="Arial" w:cs="Arial"/>
+          <w:sz w:val="24"/>
+        </w:rPr>
+        <w:t xml:space="preserve">•  </w:t>
+      </w:r>
+      <w:r>
+        <w:rPr>
+          <w:rFonts w:ascii="Arial" w:hAnsi="Arial" w:cs="Arial"/>
+          <w:sz w:val="24"/>
+        </w:rPr>
+        <w:t>Construir e homologar a bancada vertical de PVC destinada a simular fisicamente as variações do nível de água de um piezômetro, validando a integração entre sensor, eletrônica e software.</w:t>
       </w:r>
     </w:p>
     <w:p>
@@ -1619,745 +1720,65 @@
       <w:r>
         <w:rPr>
           <w:rFonts w:ascii="Arial" w:hAnsi="Arial" w:cs="Arial"/>
-          <w:b/>
           <w:sz w:val="24"/>
         </w:rPr>
-        <w:t>Arquitetura geral.</w:t>
+        <w:t>O desenvolvimento do AquaSense seguiu uma metodologia ágil, organizada em quatro fases distribuídas ao longo dos bimestres do curso, com participação conjunta dos quatro integrantes em cada etapa e responsabilidades específicas conforme a especialidade de cada um.</w:t>
       </w:r>
+    </w:p>
+    <w:p>
+      <w:pPr>
+        <w:spacing w:lineRule="auto" w:line="360" w:after="120" w:before="0"/>
+        <w:ind w:firstLine="709"/>
+        <w:jc w:val="both"/>
+      </w:pPr>
       <w:r>
         <w:rPr>
           <w:rFonts w:ascii="Arial" w:hAnsi="Arial" w:cs="Arial"/>
           <w:sz w:val="24"/>
         </w:rPr>
-        <w:t xml:space="preserve"> O ESP32, seja na simulação Wokwi ou na maquete física, lê o sensor de nível d'água a cada 10 segundos e publica cada leitura em </w:t>
+        <w:t>Na Fase I, de planejamento e especificações, correspondente ao primeiro bimestre, a equipe realizou o levantamento de requisitos da demanda e o estudo dos princípios de sensoriamento industrial de nível, culminando na seleção do transdutor piezorresistivo submersível com saída em corrente de 4 a 20 mA como sensor de referência do projeto. Nesta fase também foi definida a arquitetura geral do sistema, incluindo a decisão pelo uso de uma plataforma de computação em nuvem serverless para o backend, e Matheus elaborou o esboço mecânico da bancada vertical de simulação.</w:t>
       </w:r>
-      <w:r>
-        <w:rPr>
-          <w:rFonts w:ascii="Courier New" w:hAnsi="Courier New" w:cs="Courier New"/>
-          <w:sz w:val="20"/>
-        </w:rPr>
-        <w:t>POST /ingest</w:t>
-      </w:r>
+    </w:p>
+    <w:p>
+      <w:pPr>
+        <w:spacing w:lineRule="auto" w:line="360" w:after="120" w:before="0"/>
+        <w:ind w:firstLine="709"/>
+        <w:jc w:val="both"/>
+      </w:pPr>
       <w:r>
         <w:rPr>
           <w:rFonts w:ascii="Arial" w:hAnsi="Arial" w:cs="Arial"/>
           <w:sz w:val="24"/>
         </w:rPr>
-        <w:t xml:space="preserve">, em formato JSON, autenticado com a </w:t>
+        <w:t>Na Fase II, de prototipagem e testes modulares, correspondente ao segundo bimestre, Isadora conduziu a cotação e aquisição dos componentes eletrônicos, incluindo o conversor analógico digital e o resistor de shunt de precisão. Marcelo montou o circuito de alimentação fotovoltaica, compreendendo painel solar, controlador de carga e bateria selada. Gustavo desenvolveu a primeira versão do firmware, responsável pela leitura da porta analógica via barramento I2C e pela conexão de rede do microcontrolador. Em paralelo, Matheus montou fisicamente a tubulação de PVC de dois metros que compõem a bancada de ensaios.</w:t>
       </w:r>
-      <w:r>
-        <w:rPr>
-          <w:rFonts w:ascii="Courier New" w:hAnsi="Courier New" w:cs="Courier New"/>
-          <w:sz w:val="20"/>
-        </w:rPr>
-        <w:t>DEVICE_KEY</w:t>
-      </w:r>
+    </w:p>
+    <w:p>
+      <w:pPr>
+        <w:spacing w:lineRule="auto" w:line="360" w:after="120" w:before="0"/>
+        <w:ind w:firstLine="709"/>
+        <w:jc w:val="both"/>
+      </w:pPr>
       <w:r>
         <w:rPr>
           <w:rFonts w:ascii="Arial" w:hAnsi="Arial" w:cs="Arial"/>
           <w:sz w:val="24"/>
         </w:rPr>
-        <w:t xml:space="preserve"> no cabeçalho </w:t>
+        <w:t>Na Fase III, de integração e calibração, correspondente ao terceiro bimestre, a equipe conectou o transdutor à bancada vertical e realizou a calibração da leitura de tensão do conversor analógico digital, correlacionando a tensão medida sobre o resistor de shunt de precisão de 150 ohms ao nível físico da coluna de água no poço simulado, por meio de dois pontos de referência conhecidos. Em paralelo, foi desenvolvido o backend em nuvem, com os endpoints de ingestão e de leitura, o esquema do banco de dados gerenciado e o motor de alertas executado por gatilho de tempo a cada minuto, além do mecanismo de store &amp; forward do firmware para preservar leituras em caso de interrupção momentânea de rede.</w:t>
       </w:r>
-      <w:r>
-        <w:rPr>
-          <w:rFonts w:ascii="Courier New" w:hAnsi="Courier New" w:cs="Courier New"/>
-          <w:sz w:val="20"/>
-        </w:rPr>
-        <w:t>x-device-key</w:t>
-      </w:r>
+    </w:p>
+    <w:p>
+      <w:pPr>
+        <w:spacing w:lineRule="auto" w:line="360" w:after="120" w:before="0"/>
+        <w:ind w:firstLine="709"/>
+        <w:jc w:val="both"/>
+      </w:pPr>
       <w:r>
         <w:rPr>
           <w:rFonts w:ascii="Arial" w:hAnsi="Arial" w:cs="Arial"/>
           <w:sz w:val="24"/>
         </w:rPr>
-        <w:t xml:space="preserve">. O Cloudflare Worker recebe essa requisição, grava a leitura no Cloudflare D1 com deduplicação por índice único e, por meio de um cron trigger executado uma vez por minuto, roda o motor de alertas em três camadas, cujo estado fica em Cloudflare Workers KV; quando uma transição de faixa ocorre, o Worker aciona a Telegram Bot API e, opcionalmente, o Twilio para SMS. O dashboard, hospedado no GitHub Pages, apenas lê os dados por meio de </w:t>
-      </w:r>
-      <w:r>
-        <w:rPr>
-          <w:rFonts w:ascii="Courier New" w:hAnsi="Courier New" w:cs="Courier New"/>
-          <w:sz w:val="20"/>
-        </w:rPr>
-        <w:t>GET /ultimos</w:t>
-      </w:r>
-      <w:r>
-        <w:rPr>
-          <w:rFonts w:ascii="Arial" w:hAnsi="Arial" w:cs="Arial"/>
-          <w:sz w:val="24"/>
-        </w:rPr>
-        <w:t xml:space="preserve"> (última leitura de cada piezômetro) e </w:t>
-      </w:r>
-      <w:r>
-        <w:rPr>
-          <w:rFonts w:ascii="Courier New" w:hAnsi="Courier New" w:cs="Courier New"/>
-          <w:sz w:val="20"/>
-        </w:rPr>
-        <w:t>GET /dados</w:t>
-      </w:r>
-      <w:r>
-        <w:rPr>
-          <w:rFonts w:ascii="Arial" w:hAnsi="Arial" w:cs="Arial"/>
-          <w:sz w:val="24"/>
-        </w:rPr>
-        <w:t xml:space="preserve"> (série histórica agregada para os gráficos, com filtro por piezômetro e por janela de tempo). O ESP32 nunca fala diretamente com o banco de dados, e nenhum segredo de banco fica exposto no firmware nem no HTML público; todos os segredos ficam em secrets do Cloudflare, fora do repositório de código.</w:t>
-      </w:r>
-    </w:p>
-    <w:p>
-      <w:pPr>
-        <w:spacing w:lineRule="auto" w:line="360" w:after="120" w:before="0"/>
-        <w:ind w:firstLine="709"/>
-        <w:jc w:val="both"/>
-      </w:pPr>
-      <w:r>
-        <w:rPr>
-          <w:rFonts w:ascii="Arial" w:hAnsi="Arial" w:cs="Arial"/>
-          <w:sz w:val="24"/>
-        </w:rPr>
-        <w:t>Vale registrar, com honestidade metodológica, a evolução entre a primeira versão do sistema (v1) e a atual (v2, descrita acima). A v1 usava um proxy Node.js (</w:t>
-      </w:r>
-      <w:r>
-        <w:rPr>
-          <w:rFonts w:ascii="Courier New" w:hAnsi="Courier New" w:cs="Courier New"/>
-          <w:sz w:val="20"/>
-        </w:rPr>
-        <w:t>server.js</w:t>
-      </w:r>
-      <w:r>
-        <w:rPr>
-          <w:rFonts w:ascii="Arial" w:hAnsi="Arial" w:cs="Arial"/>
-          <w:sz w:val="24"/>
-        </w:rPr>
-        <w:t xml:space="preserve">) hospedado no Render, que ingeria as leituras do ESP32, repassava as consultas do dashboard ao InfluxDB Cloud e rodava o motor de alertas via </w:t>
-      </w:r>
-      <w:r>
-        <w:rPr>
-          <w:rFonts w:ascii="Courier New" w:hAnsi="Courier New" w:cs="Courier New"/>
-          <w:sz w:val="20"/>
-        </w:rPr>
-        <w:t>setInterval</w:t>
-      </w:r>
-      <w:r>
-        <w:rPr>
-          <w:rFonts w:ascii="Arial" w:hAnsi="Arial" w:cs="Arial"/>
-          <w:sz w:val="24"/>
-        </w:rPr>
-        <w:t>. Essa arquitetura foi substituída por três motivos documentados: o plano gratuito do Render hibernava após 15 minutos de inatividade, o que pausava o motor de alertas justamente quando ninguém estava olhando o dashboard, o pior momento possível para isso acontecer; o InfluxDB Cloud, no plano gratuito, tinha retenção de dados limitada a 30 dias em contas novas e exigia gerenciar tokens de leitura e escrita separados; e manter três serviços externos (Render, InfluxDB, GitHub Pages) para um protótipo de TCC adicionava complexidade operacional sem benefício correspondente. A v2 consolida ingestão, armazenamento e motor de alertas em uma única plataforma (Cloudflare), sem credenciais externas de banco de dados, com retenção ilimitada dentro do limite de armazenamento do free tier (cerca de 5 GB) e um cron trigger que nunca hiberna. A v1 não foi apagada do projeto: permanece preservada no histórico do git para eventual consulta comparativa, e a decisão de não voltar a ela é considerada fechada.</w:t>
-      </w:r>
-    </w:p>
-    <w:p>
-      <w:pPr>
-        <w:spacing w:lineRule="auto" w:line="360" w:after="120" w:before="0"/>
-        <w:ind w:firstLine="709"/>
-        <w:jc w:val="both"/>
-      </w:pPr>
-      <w:r>
-        <w:rPr>
-          <w:rFonts w:ascii="Arial" w:hAnsi="Arial" w:cs="Arial"/>
-          <w:b/>
-          <w:sz w:val="24"/>
-        </w:rPr>
-        <w:t>Firmware.</w:t>
-      </w:r>
-      <w:r>
-        <w:rPr>
-          <w:rFonts w:ascii="Arial" w:hAnsi="Arial" w:cs="Arial"/>
-          <w:sz w:val="24"/>
-        </w:rPr>
-        <w:t xml:space="preserve"> O firmware é dividido em um núcleo comum, </w:t>
-      </w:r>
-      <w:r>
-        <w:rPr>
-          <w:rFonts w:ascii="Courier New" w:hAnsi="Courier New" w:cs="Courier New"/>
-          <w:sz w:val="20"/>
-        </w:rPr>
-        <w:t>firmware/piezometro_core.h</w:t>
-      </w:r>
-      <w:r>
-        <w:rPr>
-          <w:rFonts w:ascii="Arial" w:hAnsi="Arial" w:cs="Arial"/>
-          <w:sz w:val="24"/>
-        </w:rPr>
-        <w:t xml:space="preserve">, que concentra a lógica de conexão WiFi, sincronização de hora via NTP, buffer de store and forward, envio HTTP, classificação de alertas locais e controle do display OLED, e em adapters de sensor específicos por cenário: </w:t>
-      </w:r>
-      <w:r>
-        <w:rPr>
-          <w:rFonts w:ascii="Courier New" w:hAnsi="Courier New" w:cs="Courier New"/>
-          <w:sz w:val="20"/>
-        </w:rPr>
-        <w:t>firmware/sketch.ino</w:t>
-      </w:r>
-      <w:r>
-        <w:rPr>
-          <w:rFonts w:ascii="Arial" w:hAnsi="Arial" w:cs="Arial"/>
-          <w:sz w:val="24"/>
-        </w:rPr>
-        <w:t xml:space="preserve"> para a simulação no Wokwi, que usa um BMP180, sensor barométrico, como stand-in (a pressão do slider é convertida em nível d'água simulado pela escala didática de 10 hPa igual a 1 m), e </w:t>
-      </w:r>
-      <w:r>
-        <w:rPr>
-          <w:rFonts w:ascii="Courier New" w:hAnsi="Courier New" w:cs="Courier New"/>
-          <w:sz w:val="20"/>
-        </w:rPr>
-        <w:t>firmware/sketch_fisico_jsn_sr04t.ino</w:t>
-      </w:r>
-      <w:r>
-        <w:rPr>
-          <w:rFonts w:ascii="Arial" w:hAnsi="Arial" w:cs="Arial"/>
-          <w:sz w:val="24"/>
-        </w:rPr>
-        <w:t xml:space="preserve"> para a maquete física (sensor ultrassônico JSN-SR04T medindo a distância até a água de verdade dentro de um tubo ou balde, convertida em nível pela escala </w:t>
-      </w:r>
-      <w:r>
-        <w:rPr>
-          <w:rFonts w:ascii="Courier New" w:hAnsi="Courier New" w:cs="Courier New"/>
-          <w:sz w:val="20"/>
-        </w:rPr>
-        <w:t>ESCALA_M_POR_CM = 0,5</w:t>
-      </w:r>
-      <w:r>
-        <w:rPr>
-          <w:rFonts w:ascii="Arial" w:hAnsi="Arial" w:cs="Arial"/>
-          <w:sz w:val="24"/>
-        </w:rPr>
-        <w:t>). Os dois adapters compartilham o mesmo núcleo; só a leitura do sensor muda, validando na prática o contrato de adapter descrito na justificativa.</w:t>
-      </w:r>
-    </w:p>
-    <w:p>
-      <w:pPr>
-        <w:spacing w:lineRule="auto" w:line="360" w:after="120" w:before="0"/>
-        <w:ind w:firstLine="709"/>
-        <w:jc w:val="both"/>
-      </w:pPr>
-      <w:r>
-        <w:rPr>
-          <w:rFonts w:ascii="Arial" w:hAnsi="Arial" w:cs="Arial"/>
-          <w:sz w:val="24"/>
-        </w:rPr>
-        <w:t>Em ambos os cenários, cada leitura recebe timestamp obtido por sincronização NTP, para que leituras acumuladas em buffer, durante uma queda de rede, sejam registradas com o instante real em que ocorreram, e não com o instante em que finalmente chegaram ao servidor. Alertas locais (LED verde, amarelo ou vermelho, buzzer, display OLED) reproduzem a mesma classificação de faixa do backend, de forma independente, e o sistema opera em modo degradado: uma falha no display OLED ou uma leitura de sensor fora da faixa válida não derruba a medição nem o envio dos dados; leituras inválidas simplesmente não entram no histórico, evitando poluir a série temporal com ruído de sensor. Na maquete física, essa robustez de leitura já parte do próprio sensor: o firmware calcula a mediana de cinco leituras espaçadas de 30 ms, descartando ecos fora da faixa útil (menor que 25 cm ou maior que 450 cm), o que se mostra mais robusto a ruído e eco espúrio do que uma leitura única.</w:t>
-      </w:r>
-    </w:p>
-    <w:p>
-      <w:pPr>
-        <w:spacing w:lineRule="auto" w:line="360" w:after="120" w:before="0"/>
-        <w:ind w:firstLine="709"/>
-        <w:jc w:val="both"/>
-      </w:pPr>
-      <w:r>
-        <w:rPr>
-          <w:rFonts w:ascii="Arial" w:hAnsi="Arial" w:cs="Arial"/>
-          <w:sz w:val="24"/>
-        </w:rPr>
-        <w:t>Além do modo sempre ligado usado na demonstração, o projeto já mantém, como opção de compilação independente do núcleo padrão, um modo de operação em campo baseado em deep sleep (</w:t>
-      </w:r>
-      <w:r>
-        <w:rPr>
-          <w:rFonts w:ascii="Courier New" w:hAnsi="Courier New" w:cs="Courier New"/>
-          <w:sz w:val="20"/>
-        </w:rPr>
-        <w:t>firmware/piezometro_deep_sleep.h</w:t>
-      </w:r>
-      <w:r>
-        <w:rPr>
-          <w:rFonts w:ascii="Arial" w:hAnsi="Arial" w:cs="Arial"/>
-          <w:sz w:val="24"/>
-        </w:rPr>
-        <w:t xml:space="preserve">). Nesse modo, o ESP32 acorda a cada cinco minutos, executa o ciclo completo de medição, conexão WiFi e envio em cerca de 15 segundos, e volta a dormir em modo de baixíssimo consumo. Como o </w:t>
-      </w:r>
-      <w:r>
-        <w:rPr>
-          <w:rFonts w:ascii="Courier New" w:hAnsi="Courier New" w:cs="Courier New"/>
-          <w:sz w:val="20"/>
-        </w:rPr>
-        <w:t>esp_deep_sleep_start()</w:t>
-      </w:r>
-      <w:r>
-        <w:rPr>
-          <w:rFonts w:ascii="Arial" w:hAnsi="Arial" w:cs="Arial"/>
-          <w:sz w:val="24"/>
-        </w:rPr>
-        <w:t xml:space="preserve"> reinicia o programa do zero a cada despertar, esse header mantém seu próprio buffer de leituras retidas em memória RTC, em vez de reaproveitar o buffer do núcleo padrão, e ressincroniza o NTP a cada ciclo. É um modo opt-in, habilitado por uma diretiva de compilação antes da inclusão do núcleo, pensado para a operação de campo real; a maquete de demonstração continua no modo sempre ligado, com LEDs, buzzer e OLED ativos o tempo todo, porque essa é a escolha certa para uma apresentação ao vivo à banca.</w:t>
-      </w:r>
-    </w:p>
-    <w:p>
-      <w:pPr>
-        <w:spacing w:lineRule="auto" w:line="360" w:after="120" w:before="0"/>
-        <w:ind w:firstLine="709"/>
-        <w:jc w:val="both"/>
-      </w:pPr>
-      <w:r>
-        <w:rPr>
-          <w:rFonts w:ascii="Arial" w:hAnsi="Arial" w:cs="Arial"/>
-          <w:b/>
-          <w:sz w:val="24"/>
-        </w:rPr>
-        <w:t>A cadeia de confiança do dado.</w:t>
-      </w:r>
-      <w:r>
-        <w:rPr>
-          <w:rFonts w:ascii="Arial" w:hAnsi="Arial" w:cs="Arial"/>
-          <w:sz w:val="24"/>
-        </w:rPr>
-        <w:t xml:space="preserve"> Um sistema de monitoramento de segurança de barragem só tem valor se o número exibido no dashboard for exatamente o que o sensor mediu, sem perda, duplicação ou disfarce no caminho. O projeto trata essa garantia de integridade como uma cadeia de elos explícitos. No transporte, a autenticação por </w:t>
-      </w:r>
-      <w:r>
-        <w:rPr>
-          <w:rFonts w:ascii="Courier New" w:hAnsi="Courier New" w:cs="Courier New"/>
-          <w:sz w:val="20"/>
-        </w:rPr>
-        <w:t>DEVICE_KEY</w:t>
-      </w:r>
-      <w:r>
-        <w:rPr>
-          <w:rFonts w:ascii="Arial" w:hAnsi="Arial" w:cs="Arial"/>
-          <w:sz w:val="24"/>
-        </w:rPr>
-        <w:t xml:space="preserve"> é fail-closed: sem a secret configurada no Worker, o endpoint </w:t>
-      </w:r>
-      <w:r>
-        <w:rPr>
-          <w:rFonts w:ascii="Courier New" w:hAnsi="Courier New" w:cs="Courier New"/>
-          <w:sz w:val="20"/>
-        </w:rPr>
-        <w:t>/ingest</w:t>
-      </w:r>
-      <w:r>
-        <w:rPr>
-          <w:rFonts w:ascii="Arial" w:hAnsi="Arial" w:cs="Arial"/>
-          <w:sz w:val="24"/>
-        </w:rPr>
-        <w:t xml:space="preserve"> responde com erro e nada entra no banco; com a secret configurada, uma chave incorreta é rejeitada, e a ausência ou o erro na chave nunca é tratado como "permitir e seguir". No armazenamento, um índice único sobre piezômetro e timestamp evita que o reenvio do buffer de store and forward (por exemplo, após uma confirmação HTTP perdida) duplique a mesma leitura, e cada linha guarda duas dimensões de tempo distintas: o instante da medição, definido pelo firmware via NTP, e o instante em que o Worker recebeu o dado, o que é necessário justamente porque, no store and forward, os dois instantes podem divergir. O histórico é, na prática, somente para inserção: a API não expõe nenhum endpoint de edição ou exclusão de leituras, apenas as rotas de ingestão e consulta. Na exibição, um dado velho nunca aparece disfarçado de normal: o frescor de cada piezômetro é calculado a partir do instante em que o servidor recebeu a última leitura, e não do relógio do dispositivo, de modo que, se esse prazo estourar, o painel mostra o estado neutro "sem sinal" em vez de continuar exibindo a última faixa de nível conhecida. Essa mesma lógica de "sem sinal" corresponde, no motor de alertas, à camada que trata o silêncio de um instrumento como uma condição de risco a ser monitorada, não como ausência de problema. O padrão comum a todas essas decisões é simples: na dúvida, o sistema prefere descartar, marcar como inválido ou exibir um estado neutro a inventar ou disfarçar um valor. Essa cadeia garante a integridade do dado por construção; ela não substitui a validade metrológica da medição, que depende de calibração contra uma referência e é tratada, em escala de bancada, no protocolo descrito na Viabilidade Técnica.</w:t>
-      </w:r>
-    </w:p>
-    <w:p>
-      <w:pPr>
-        <w:spacing w:lineRule="auto" w:line="360" w:after="120" w:before="0"/>
-        <w:ind w:firstLine="709"/>
-        <w:jc w:val="both"/>
-      </w:pPr>
-      <w:r>
-        <w:rPr>
-          <w:rFonts w:ascii="Arial" w:hAnsi="Arial" w:cs="Arial"/>
-          <w:b/>
-          <w:sz w:val="24"/>
-        </w:rPr>
-        <w:t>Backend.</w:t>
-      </w:r>
-      <w:r>
-        <w:rPr>
-          <w:rFonts w:ascii="Arial" w:hAnsi="Arial" w:cs="Arial"/>
-          <w:sz w:val="24"/>
-        </w:rPr>
-        <w:t xml:space="preserve"> O backend roda inteiramente em </w:t>
-      </w:r>
-      <w:r>
-        <w:rPr>
-          <w:rFonts w:ascii="Courier New" w:hAnsi="Courier New" w:cs="Courier New"/>
-          <w:sz w:val="20"/>
-        </w:rPr>
-        <w:t>cloudflare-worker/</w:t>
-      </w:r>
-      <w:r>
-        <w:rPr>
-          <w:rFonts w:ascii="Arial" w:hAnsi="Arial" w:cs="Arial"/>
-          <w:sz w:val="24"/>
-        </w:rPr>
-        <w:t xml:space="preserve">, dividido em sete módulos ES, cada um com uma responsabilidade única: </w:t>
-      </w:r>
-      <w:r>
-        <w:rPr>
-          <w:rFonts w:ascii="Courier New" w:hAnsi="Courier New" w:cs="Courier New"/>
-          <w:sz w:val="20"/>
-        </w:rPr>
-        <w:t>index.js</w:t>
-      </w:r>
-      <w:r>
-        <w:rPr>
-          <w:rFonts w:ascii="Arial" w:hAnsi="Arial" w:cs="Arial"/>
-          <w:sz w:val="24"/>
-        </w:rPr>
-        <w:t xml:space="preserve"> como roteador, que só orquestra </w:t>
-      </w:r>
-      <w:r>
-        <w:rPr>
-          <w:rFonts w:ascii="Courier New" w:hAnsi="Courier New" w:cs="Courier New"/>
-          <w:sz w:val="20"/>
-        </w:rPr>
-        <w:t>fetch</w:t>
-      </w:r>
-      <w:r>
-        <w:rPr>
-          <w:rFonts w:ascii="Arial" w:hAnsi="Arial" w:cs="Arial"/>
-          <w:sz w:val="24"/>
-        </w:rPr>
-        <w:t xml:space="preserve"> e </w:t>
-      </w:r>
-      <w:r>
-        <w:rPr>
-          <w:rFonts w:ascii="Courier New" w:hAnsi="Courier New" w:cs="Courier New"/>
-          <w:sz w:val="20"/>
-        </w:rPr>
-        <w:t>scheduled</w:t>
-      </w:r>
-      <w:r>
-        <w:rPr>
-          <w:rFonts w:ascii="Arial" w:hAnsi="Arial" w:cs="Arial"/>
-          <w:sz w:val="24"/>
-        </w:rPr>
-        <w:t xml:space="preserve">; </w:t>
-      </w:r>
-      <w:r>
-        <w:rPr>
-          <w:rFonts w:ascii="Courier New" w:hAnsi="Courier New" w:cs="Courier New"/>
-          <w:sz w:val="20"/>
-        </w:rPr>
-        <w:t>config.js</w:t>
-      </w:r>
-      <w:r>
-        <w:rPr>
-          <w:rFonts w:ascii="Arial" w:hAnsi="Arial" w:cs="Arial"/>
-          <w:sz w:val="24"/>
-        </w:rPr>
-        <w:t xml:space="preserve"> para configuração e constantes; </w:t>
-      </w:r>
-      <w:r>
-        <w:rPr>
-          <w:rFonts w:ascii="Courier New" w:hAnsi="Courier New" w:cs="Courier New"/>
-          <w:sz w:val="20"/>
-        </w:rPr>
-        <w:t>http.js</w:t>
-      </w:r>
-      <w:r>
-        <w:rPr>
-          <w:rFonts w:ascii="Arial" w:hAnsi="Arial" w:cs="Arial"/>
-          <w:sz w:val="24"/>
-        </w:rPr>
-        <w:t xml:space="preserve"> para CORS, respostas JSON e limites de payload; </w:t>
-      </w:r>
-      <w:r>
-        <w:rPr>
-          <w:rFonts w:ascii="Courier New" w:hAnsi="Courier New" w:cs="Courier New"/>
-          <w:sz w:val="20"/>
-        </w:rPr>
-        <w:t>db.js</w:t>
-      </w:r>
-      <w:r>
-        <w:rPr>
-          <w:rFonts w:ascii="Arial" w:hAnsi="Arial" w:cs="Arial"/>
-          <w:sz w:val="24"/>
-        </w:rPr>
-        <w:t xml:space="preserve"> para todas as queries ao D1; </w:t>
-      </w:r>
-      <w:r>
-        <w:rPr>
-          <w:rFonts w:ascii="Courier New" w:hAnsi="Courier New" w:cs="Courier New"/>
-          <w:sz w:val="20"/>
-        </w:rPr>
-        <w:t>alertas.js</w:t>
-      </w:r>
-      <w:r>
-        <w:rPr>
-          <w:rFonts w:ascii="Arial" w:hAnsi="Arial" w:cs="Arial"/>
-          <w:sz w:val="24"/>
-        </w:rPr>
-        <w:t xml:space="preserve"> para o motor de alertas e o estado no KV; </w:t>
-      </w:r>
-      <w:r>
-        <w:rPr>
-          <w:rFonts w:ascii="Courier New" w:hAnsi="Courier New" w:cs="Courier New"/>
-          <w:sz w:val="20"/>
-        </w:rPr>
-        <w:t>notificacoes.js</w:t>
-      </w:r>
-      <w:r>
-        <w:rPr>
-          <w:rFonts w:ascii="Arial" w:hAnsi="Arial" w:cs="Arial"/>
-          <w:sz w:val="24"/>
-        </w:rPr>
-        <w:t xml:space="preserve"> para a integração com Telegram e Twilio; e </w:t>
-      </w:r>
-      <w:r>
-        <w:rPr>
-          <w:rFonts w:ascii="Courier New" w:hAnsi="Courier New" w:cs="Courier New"/>
-          <w:sz w:val="20"/>
-        </w:rPr>
-        <w:t>rotas.js</w:t>
-      </w:r>
-      <w:r>
-        <w:rPr>
-          <w:rFonts w:ascii="Arial" w:hAnsi="Arial" w:cs="Arial"/>
-          <w:sz w:val="24"/>
-        </w:rPr>
-        <w:t xml:space="preserve"> para os handlers dos endpoints. Essa divisão segue uma regra de projeto adotada desde o início, de limite de aproximadamente 300 linhas por arquivo e uma responsabilidade por arquivo, para manter o código auditável.</w:t>
-      </w:r>
-    </w:p>
-    <w:p>
-      <w:pPr>
-        <w:spacing w:lineRule="auto" w:line="360" w:after="120" w:before="0"/>
-        <w:ind w:firstLine="709"/>
-        <w:jc w:val="both"/>
-      </w:pPr>
-      <w:r>
-        <w:rPr>
-          <w:rFonts w:ascii="Arial" w:hAnsi="Arial" w:cs="Arial"/>
-          <w:sz w:val="24"/>
-        </w:rPr>
-        <w:t xml:space="preserve">O motor de alertas roda em três camadas a cada ciclo do cron, de um minuto: a primeira é o nível, com histerese inspirada na norma ISA-18.2 de gerenciamento de alarmes, para evitar disparos repetidos por oscilação em torno do limiar; a segunda é a comunicação, que sinaliza quando um piezômetro para de enviar leituras; e a terceira é a taxa de variação, para sinalizar subidas anormalmente rápidas de nível. O estado de cada camada, incluindo a última faixa notificada e o histórico de reenvio, é persistido no Cloudflare Workers KV, já que um Worker não mantém estado em memória entre invocações; e, como o free tier de Workers KV permite apenas 1.000 escritas por dia, o motor grava no KV somente quando o estado muda de faixa, nunca de forma incondicional a cada ciclo, decisão de arquitetura deliberada. Outro cuidado relevante fica na agregação temporal usada pelos gráficos, que precisa dividir o timestamp por um bucket de tempo: o D1 e o SQLite fazem essa divisão em ponto flutuante por padrão, o que já foi identificado como um bug real em revisão de código e corrigido com um </w:t>
-      </w:r>
-      <w:r>
-        <w:rPr>
-          <w:rFonts w:ascii="Courier New" w:hAnsi="Courier New" w:cs="Courier New"/>
-          <w:sz w:val="20"/>
-        </w:rPr>
-        <w:t>CAST</w:t>
-      </w:r>
-      <w:r>
-        <w:rPr>
-          <w:rFonts w:ascii="Arial" w:hAnsi="Arial" w:cs="Arial"/>
-          <w:sz w:val="24"/>
-        </w:rPr>
-        <w:t xml:space="preserve"> explícito para inteiro; a regra é não regredir esse comportamento.</w:t>
-      </w:r>
-    </w:p>
-    <w:p>
-      <w:pPr>
-        <w:spacing w:lineRule="auto" w:line="360" w:after="120" w:before="0"/>
-        <w:ind w:firstLine="709"/>
-        <w:jc w:val="both"/>
-      </w:pPr>
-      <w:r>
-        <w:rPr>
-          <w:rFonts w:ascii="Arial" w:hAnsi="Arial" w:cs="Arial"/>
-          <w:b/>
-          <w:sz w:val="24"/>
-        </w:rPr>
-        <w:t>Exportação de relatórios.</w:t>
-      </w:r>
-      <w:r>
-        <w:rPr>
-          <w:rFonts w:ascii="Arial" w:hAnsi="Arial" w:cs="Arial"/>
-          <w:sz w:val="24"/>
-        </w:rPr>
-        <w:t xml:space="preserve"> O dashboard oferece dois formatos de exportação do histórico, ambos alimentados pela mesma função de coleta de dados, para que nunca divirjam entre si. O primeiro é um CSV pensado como evidência de auditoria: além das linhas de dados (data e hora, piezômetro, nível médio, mínimo, máximo, número de leituras no intervalo, status e qualidade), o arquivo carrega um bloco de metadados no topo com o instrumento consultado, o período solicitado, o intervalo de agregação, o momento em que o arquivo foi gerado, se a fonte era a API real ou o modo de simulação, e os limiares de atenção e crítico vigentes no momento da exportação. O segundo formato é uma planilha Excel formatada (gerada em SpreadsheetML), com título, cabeçalho colorido, status sinalizado por cor e uma seção de resumo do período, voltada a quem prefere um layout de leitura mais direta do que o CSV bruto. Em ambos os formatos, o status de cada intervalo é sempre calculado sobre o pico do intervalo, nunca sobre a média, para que um pico pontual de nível crítico dentro de um intervalo de média mais baixa não seja mascarado como normal.</w:t>
-      </w:r>
-    </w:p>
-    <w:p>
-      <w:pPr>
-        <w:spacing w:lineRule="auto" w:line="360" w:after="120" w:before="0"/>
-        <w:ind w:firstLine="709"/>
-        <w:jc w:val="both"/>
-      </w:pPr>
-      <w:r>
-        <w:rPr>
-          <w:rFonts w:ascii="Arial" w:hAnsi="Arial" w:cs="Arial"/>
-          <w:b/>
-          <w:sz w:val="24"/>
-        </w:rPr>
-        <w:t>Dashboard.</w:t>
-      </w:r>
-      <w:r>
-        <w:rPr>
-          <w:rFonts w:ascii="Arial" w:hAnsi="Arial" w:cs="Arial"/>
-          <w:sz w:val="24"/>
-        </w:rPr>
-        <w:t xml:space="preserve"> O dashboard (</w:t>
-      </w:r>
-      <w:r>
-        <w:rPr>
-          <w:rFonts w:ascii="Courier New" w:hAnsi="Courier New" w:cs="Courier New"/>
-          <w:sz w:val="20"/>
-        </w:rPr>
-        <w:t>index.html</w:t>
-      </w:r>
-      <w:r>
-        <w:rPr>
-          <w:rFonts w:ascii="Arial" w:hAnsi="Arial" w:cs="Arial"/>
-          <w:sz w:val="24"/>
-        </w:rPr>
-        <w:t xml:space="preserve"> mais </w:t>
-      </w:r>
-      <w:r>
-        <w:rPr>
-          <w:rFonts w:ascii="Courier New" w:hAnsi="Courier New" w:cs="Courier New"/>
-          <w:sz w:val="20"/>
-        </w:rPr>
-        <w:t>assets/</w:t>
-      </w:r>
-      <w:r>
-        <w:rPr>
-          <w:rFonts w:ascii="Arial" w:hAnsi="Arial" w:cs="Arial"/>
-          <w:sz w:val="24"/>
-        </w:rPr>
-        <w:t xml:space="preserve">) roda inteiramente no GitHub Pages, sem bundler: o HTML concentra apenas a estrutura, com cerca de 280 linhas, o CSS fica em </w:t>
-      </w:r>
-      <w:r>
-        <w:rPr>
-          <w:rFonts w:ascii="Courier New" w:hAnsi="Courier New" w:cs="Courier New"/>
-          <w:sz w:val="20"/>
-        </w:rPr>
-        <w:t>assets/styles.css</w:t>
-      </w:r>
-      <w:r>
-        <w:rPr>
-          <w:rFonts w:ascii="Arial" w:hAnsi="Arial" w:cs="Arial"/>
-          <w:sz w:val="24"/>
-        </w:rPr>
-        <w:t xml:space="preserve"> e a lógica é dividida em oito módulos JavaScript carregados em ordem de dependência (</w:t>
-      </w:r>
-      <w:r>
-        <w:rPr>
-          <w:rFonts w:ascii="Courier New" w:hAnsi="Courier New" w:cs="Courier New"/>
-          <w:sz w:val="20"/>
-        </w:rPr>
-        <w:t>config</w:t>
-      </w:r>
-      <w:r>
-        <w:rPr>
-          <w:rFonts w:ascii="Arial" w:hAnsi="Arial" w:cs="Arial"/>
-          <w:sz w:val="24"/>
-        </w:rPr>
-        <w:t xml:space="preserve">, </w:t>
-      </w:r>
-      <w:r>
-        <w:rPr>
-          <w:rFonts w:ascii="Courier New" w:hAnsi="Courier New" w:cs="Courier New"/>
-          <w:sz w:val="20"/>
-        </w:rPr>
-        <w:t>util</w:t>
-      </w:r>
-      <w:r>
-        <w:rPr>
-          <w:rFonts w:ascii="Arial" w:hAnsi="Arial" w:cs="Arial"/>
-          <w:sz w:val="24"/>
-        </w:rPr>
-        <w:t xml:space="preserve">, </w:t>
-      </w:r>
-      <w:r>
-        <w:rPr>
-          <w:rFonts w:ascii="Courier New" w:hAnsi="Courier New" w:cs="Courier New"/>
-          <w:sz w:val="20"/>
-        </w:rPr>
-        <w:t>fontes</w:t>
-      </w:r>
-      <w:r>
-        <w:rPr>
-          <w:rFonts w:ascii="Arial" w:hAnsi="Arial" w:cs="Arial"/>
-          <w:sz w:val="24"/>
-        </w:rPr>
-        <w:t xml:space="preserve">, </w:t>
-      </w:r>
-      <w:r>
-        <w:rPr>
-          <w:rFonts w:ascii="Courier New" w:hAnsi="Courier New" w:cs="Courier New"/>
-          <w:sz w:val="20"/>
-        </w:rPr>
-        <w:t>estado</w:t>
-      </w:r>
-      <w:r>
-        <w:rPr>
-          <w:rFonts w:ascii="Arial" w:hAnsi="Arial" w:cs="Arial"/>
-          <w:sz w:val="24"/>
-        </w:rPr>
-        <w:t xml:space="preserve">, </w:t>
-      </w:r>
-      <w:r>
-        <w:rPr>
-          <w:rFonts w:ascii="Courier New" w:hAnsi="Courier New" w:cs="Courier New"/>
-          <w:sz w:val="20"/>
-        </w:rPr>
-        <w:t>graficos</w:t>
-      </w:r>
-      <w:r>
-        <w:rPr>
-          <w:rFonts w:ascii="Arial" w:hAnsi="Arial" w:cs="Arial"/>
-          <w:sz w:val="24"/>
-        </w:rPr>
-        <w:t xml:space="preserve">, </w:t>
-      </w:r>
-      <w:r>
-        <w:rPr>
-          <w:rFonts w:ascii="Courier New" w:hAnsi="Courier New" w:cs="Courier New"/>
-          <w:sz w:val="20"/>
-        </w:rPr>
-        <w:t>paineis</w:t>
-      </w:r>
-      <w:r>
-        <w:rPr>
-          <w:rFonts w:ascii="Arial" w:hAnsi="Arial" w:cs="Arial"/>
-          <w:sz w:val="24"/>
-        </w:rPr>
-        <w:t xml:space="preserve">, </w:t>
-      </w:r>
-      <w:r>
-        <w:rPr>
-          <w:rFonts w:ascii="Courier New" w:hAnsi="Courier New" w:cs="Courier New"/>
-          <w:sz w:val="20"/>
-        </w:rPr>
-        <w:t>exportar</w:t>
-      </w:r>
-      <w:r>
-        <w:rPr>
-          <w:rFonts w:ascii="Arial" w:hAnsi="Arial" w:cs="Arial"/>
-          <w:sz w:val="24"/>
-        </w:rPr>
-        <w:t xml:space="preserve">, </w:t>
-      </w:r>
-      <w:r>
-        <w:rPr>
-          <w:rFonts w:ascii="Courier New" w:hAnsi="Courier New" w:cs="Courier New"/>
-          <w:sz w:val="20"/>
-        </w:rPr>
-        <w:t>app</w:t>
-      </w:r>
-      <w:r>
-        <w:rPr>
-          <w:rFonts w:ascii="Arial" w:hAnsi="Arial" w:cs="Arial"/>
-          <w:sz w:val="24"/>
-        </w:rPr>
-        <w:t>). Entre as funcionalidades principais estão a atualização em tempo real por polling a cada 10 segundos, os gráficos com média e pico por janela de tempo, o mapa dos piezômetros, a distinção visual entre alarme (condição atual) e evento (transição registrada no histórico), a indicação explícita de "sem sinal" quando um instrumento para de enviar leituras, e a exportação do histórico já descrita acima. Quando o backend não está acessível, o dashboard ativa um modo de simulação sinalizado por um banner destacado no topo da página, para que dados fictícios de demonstração nunca sejam confundidos com leituras reais.</w:t>
-      </w:r>
-    </w:p>
-    <w:p>
-      <w:pPr>
-        <w:spacing w:lineRule="auto" w:line="360" w:after="120" w:before="0"/>
-        <w:ind w:firstLine="709"/>
-        <w:jc w:val="both"/>
-      </w:pPr>
-      <w:r>
-        <w:rPr>
-          <w:rFonts w:ascii="Arial" w:hAnsi="Arial" w:cs="Arial"/>
-          <w:b/>
-          <w:sz w:val="24"/>
-        </w:rPr>
-        <w:t>A versão de produção.</w:t>
-      </w:r>
-      <w:r>
-        <w:rPr>
-          <w:rFonts w:ascii="Arial" w:hAnsi="Arial" w:cs="Arial"/>
-          <w:sz w:val="24"/>
-        </w:rPr>
-        <w:t xml:space="preserve"> O trabalho não termina no protótipo: especificamos a versão profissional do sistema sobre a mesma plataforma, seguindo o princípio de que profissionalizar significa trocar as pontas e manter o núcleo. O sensor de bancada dá lugar a um transdutor de pressão submersível (com o piezômetro de corda vibrante como opção premium), conectado pelo mesmo contrato de adapter do firmware, sem alterar backend, dashboard ou motor de alertas; a alimentação passa a painel solar com bateria operando em deep sleep, modo que já implementamos e que reduz o consumo em cerca de trinta vezes; e a comunicação ganha a opção LoRaWAN para locais sem cobertura WiFi. Parte dessa versão já está em produção no software: cada dispositivo passou a ter chave de autenticação própria, revogável individualmente sem afetar os demais, e o banco consolida automaticamente as leituras antigas em resumos diários, mantendo histórico de tendência ilimitado com armazenamento controlado. O plano de implantação prevê três fases, do piloto interno de cinco pontos ao produto em escala, com custo por ponto entre R$ 1.800 e R$ 2.200 na configuração padrão, abaixo do preço de venda definido na viabilidade econômica.</w:t>
-      </w:r>
-    </w:p>
-    <w:p>
-      <w:pPr>
-        <w:spacing w:lineRule="auto" w:line="360" w:after="120" w:before="0"/>
-        <w:ind w:firstLine="709"/>
-        <w:jc w:val="both"/>
-      </w:pPr>
-      <w:r>
-        <w:rPr>
-          <w:rFonts w:ascii="Arial" w:hAnsi="Arial" w:cs="Arial"/>
-          <w:b/>
-          <w:sz w:val="24"/>
-        </w:rPr>
-        <w:t>Metodologia de trabalho.</w:t>
-      </w:r>
-      <w:r>
-        <w:rPr>
-          <w:rFonts w:ascii="Arial" w:hAnsi="Arial" w:cs="Arial"/>
-          <w:sz w:val="24"/>
-        </w:rPr>
-        <w:t xml:space="preserve"> O desenvolvimento seguiu duas frentes paralelas e complementares: simulação no Wokwi, para iteração rápida de firmware e testes de alerta sem depender de hardware físico, e montagem de uma maquete física real (ESP32, sensor JSN-SR04T e tubo com água), ambas falando com o mesmo backend em produção. O código foi versionado em git ao longo de todo o projeto, com a v1 preservada no histórico para rastreabilidade da decisão de migração, e o backend é publicado por deploy contínuo a partir do repositório, incluindo a aplicação automática das migrações de banco antes de cada publicação.</w:t>
+        <w:t>Na Fase IV, de homologação e fechamento, correspondente ao quarto bimestre, a equipe integrou o dashboard web interativo ao backend, validando a exibição em tempo real e o histórico em série temporal, e realizou testes de ponta a ponta do sistema de alertas em dupla via, por Telegram e por SMS, verificando o disparo correto nas transições entre os níveis normal, atenção e crítico. Em paralelo, a equipe avançou na especificação do gabinete industrial com grau de proteção IP66 e prensa cabos, e teve início o processo de montagem física e homologação da Unidade de Controle e Telemetria na bancada vertical, etapa que segue em andamento.</w:t>
       </w:r>
     </w:p>
     <w:p>
@@ -2386,7 +1807,7 @@
           <w:rFonts w:ascii="Arial" w:hAnsi="Arial" w:cs="Arial"/>
           <w:sz w:val="24"/>
         </w:rPr>
-        <w:t>Todos os componentes de hardware usados no protótipo são de fácil acesso no mercado nacional (ESP32, sensor ultrassônico JSN-SR04T, display OLED, LEDs e buzzer, todos disponíveis em fornecedores nacionais de componentes eletrônicos), sem depender de importação ou de peças especiais.</w:t>
+        <w:t>A solução desenvolvida se apoia em padrões consolidados da instrumentação industrial. O uso do loop de corrente de 4 a 20 mA no transdutor garante imunidade a ruído eletromagnético mesmo em cabos longos dentro do poço, característica essencial em ambientes de campo sujeitos a interferências. A leitura desse sinal é feita por um conversor analógico digital externo de 16 bits, associado a um resistor de shunt de precisão de 150 ohms, que converte a faixa de 4 a 20 mA em uma faixa de tensão de 0,6 a 3,0 volts, plenamente compatível com a entrada do conversor sem risco de saturação. Essa combinação garante uma resolução muito superior à do conversor analógico digital nativo do microcontrolador, que possui apenas 12 bits e comportamento não linear nas extremidades da escala, insuficiente para uma medição de precisão em campo.</w:t>
       </w:r>
     </w:p>
     <w:p>
@@ -2400,7 +1821,7 @@
           <w:rFonts w:ascii="Arial" w:hAnsi="Arial" w:cs="Arial"/>
           <w:sz w:val="24"/>
         </w:rPr>
-        <w:t>A precisão do sensor utilizado na maquete física foi avaliada por um protocolo experimental elaborado pela própria equipe: cinco alturas de água conhecidas, medidas com régua, cada uma com dez leituras repetidas do sensor, calculando erro médio, desvio padrão e erro máximo por altura, e declarando a incerteza final como aproximadamente duas vezes o maior desvio padrão observado, regra prática de cerca de 95% de cobertura.</w:t>
+        <w:t>A robustez do sistema para operação em campo é reforçada por dispositivos de proteção contra surtos na entrada de energia e no loop de sinal, relevantes em estruturas expostas a descargas atmosféricas, e por um invólucro com grau de proteção IP66, que assegura vedação adequada contra poeira e jatos de água. O firmware implementa o mecanismo de store &amp; forward, retendo localmente as leituras com carimbo de tempo quando a rede de comunicação está indisponível e reenviando os dados assim que a conexão é restabelecida, o que evita perda de informação em áreas de sombra de sinal celular.</w:t>
       </w:r>
     </w:p>
     <w:p>
@@ -2409,63 +1830,12 @@
         <w:ind w:firstLine="709"/>
         <w:jc w:val="both"/>
       </w:pPr>
-      <w:r>
-        <w:rPr>
-          <w:rFonts w:ascii="Arial" w:hAnsi="Arial" w:cs="Arial"/>
-          <w:b/>
-          <w:color w:val="C00000"/>
-          <w:sz w:val="24"/>
-        </w:rPr>
-        <w:t>[PREENCHER: resultados reais do ensaio de validação, erro médio em cm, desvio padrão em cm, erro máximo em cm, e a incerteza declarada final em ±Z cm (2σ), na faixa de coluna d'água testada]</w:t>
-      </w:r>
       <w:r>
         <w:rPr>
           <w:rFonts w:ascii="Arial" w:hAnsi="Arial" w:cs="Arial"/>
           <w:sz w:val="24"/>
         </w:rPr>
-        <w:t>.</w:t>
-      </w:r>
-    </w:p>
-    <w:p>
-      <w:pPr>
-        <w:spacing w:lineRule="auto" w:line="360" w:after="120" w:before="0"/>
-        <w:ind w:firstLine="709"/>
-        <w:jc w:val="both"/>
-      </w:pPr>
-      <w:r>
-        <w:rPr>
-          <w:rFonts w:ascii="Arial" w:hAnsi="Arial" w:cs="Arial"/>
-          <w:sz w:val="24"/>
-        </w:rPr>
-        <w:t>Quanto aos limites de operação em nuvem, o backend roda inteiramente dentro do free tier da Cloudflare para o volume do protótipo: o limite mais apertado é o de Workers KV, de 1.000 escritas por dia, já endereçado ao gravar o estado do motor de alertas apenas nas transições de faixa; o D1 comporta, na frequência de uma leitura a cada 10 segundos por ponto, até aproximadamente 11 pontos de monitoramento simultâneos dentro da cota de 100 mil escritas por dia, e, reduzindo a frequência para uma leitura por minuto, essa mesma cota comporta cerca de 69 pontos. Um crescimento além disso tem caminho definido: o plano Cloudflare Workers Paid, a partir de US$ 5 por mês (cerca de R$ 25 a R$ 30 por mês), custo irrisório frente a qualquer fração da economia estimada na viabilidade econômica.</w:t>
-      </w:r>
-    </w:p>
-    <w:p>
-      <w:pPr>
-        <w:spacing w:lineRule="auto" w:line="360" w:after="120" w:before="0"/>
-        <w:ind w:firstLine="709"/>
-        <w:jc w:val="both"/>
-      </w:pPr>
-      <w:r>
-        <w:rPr>
-          <w:rFonts w:ascii="Arial" w:hAnsi="Arial" w:cs="Arial"/>
-          <w:sz w:val="24"/>
-        </w:rPr>
-        <w:t>A alimentação elétrica também foi dimensionada com números, não apenas descrita qualitativamente. O consumo atual da maquete, sempre ligada (WiFi ativo, OLED e LEDs acesos), foi estimado em aproximadamente 30 Wh por dia. Uma instalação piloto alimentada por painel solar com bateria, mantendo o firmware exatamente como está hoje, custaria entre R$ 385 e R$ 660 (painel de 20 W, bateria de 12 V e 18 Ah, controlador de carga e conversor de tensão), com autonomia de cerca de três dias nublados seguidos. A mudança de maior impacto, porém, é o modo de deep sleep já descrito no desenvolvimento: acordar a cada cinco minutos em vez de manter o rádio sempre ativo reduz o consumo em cerca de 30 vezes, de 30 Wh por dia para menos de 1 Wh por dia, o que é exatamente a prática já adotada pelo mercado de instrumentação sem fio (nós de corda vibrante comerciais declaram até dez anos de autonomia de bateria por dormirem quase o tempo todo).</w:t>
-      </w:r>
-    </w:p>
-    <w:p>
-      <w:pPr>
-        <w:spacing w:lineRule="auto" w:line="360" w:after="120" w:before="0"/>
-        <w:ind w:firstLine="709"/>
-        <w:jc w:val="both"/>
-      </w:pPr>
-      <w:r>
-        <w:rPr>
-          <w:rFonts w:ascii="Arial" w:hAnsi="Arial" w:cs="Arial"/>
-          <w:sz w:val="24"/>
-        </w:rPr>
-        <w:t>O protótipo assume limitações que devem ser explicitadas: o sensor utilizado é um stand-in (BMP180 na simulação, sensor ultrassônico na maquete física), não um piezômetro de corda vibrante certificado; e o sistema não implementa a redundância de energia (bateria ou painel solar) exigida pela Resolução ANM 95/2022 para barragens de DPA alto, já que a maquete depende de alimentação de rede ou USB. O caminho para uma instalação de produção real passa pelo contrato de adapter já implementado no firmware: trocar o sensor por um transdutor de pressão ou piezômetro de corda vibrante certificado exigiria escrever um novo adapter, sem alterar o restante da arquitetura de backend, dashboard e motor de alertas.</w:t>
+        <w:t>No lado do backend, a escolha de uma plataforma de computação em nuvem serverless elimina o risco de hibernação do serviço, garantindo que o motor de alertas, executado por gatilho de tempo a cada minuto, permaneça ativo de forma contínua, sem depender de qualquer ping externo para retomar a execução. Essa característica é particularmente relevante para um sistema de alerta preventivo, cuja falha silenciosa é justamente o pior cenário possível. A arquitetura completa, do firmware ao dashboard, foi validada de ponta a ponta em ambiente de simulação, com o backend efetivamente publicado em nuvem, confirmando a viabilidade técnica da solução.</w:t>
       </w:r>
     </w:p>
     <w:p>
@@ -2494,271 +1864,7 @@
           <w:rFonts w:ascii="Arial" w:hAnsi="Arial" w:cs="Arial"/>
           <w:sz w:val="24"/>
         </w:rPr>
-        <w:t>A análise econômica parte de duas referências concretas: o custo real dos componentes que compramos para o protótipo e o gasto de R$ 600 mil por ano com medição manual terceirizada declarado pela Samarco no edital do desafio SAGA. Reconstruímos esse gasto para verificar sua coerência e o número fecha: um contrato de leitura manual de R$ 50 mil mensais cobre equipe de campo, veículo, combustível, EPIs, encargos, supervisão de engenheiro e relatórios para atender cerca de cem piezômetros lidos duas vezes por semana, o que resulta em R$ 58 por leitura individual, valor compatível com o mercado de serviços técnicos terceirizados. Todos os cálculos desta seção usam esse cenário de cem pontos.</w:t>
-      </w:r>
-    </w:p>
-    <w:p>
-      <w:pPr>
-        <w:spacing w:lineRule="auto" w:line="360" w:after="120" w:before="0"/>
-        <w:ind w:firstLine="709"/>
-        <w:jc w:val="both"/>
-      </w:pPr>
-      <w:r>
-        <w:rPr>
-          <w:rFonts w:ascii="Arial" w:hAnsi="Arial" w:cs="Arial"/>
-          <w:sz w:val="24"/>
-        </w:rPr>
-        <w:t>Quanto custa o nosso produto: o protótipo de bancada custa R$ 220 por ponto em componentes (ESP32, sensor ultrassônico, display, sinalização e acessórios). A versão de campo, que substitui o sensor ultrassônico por um transdutor de pressão submersível e adiciona caixa hermética IP65, cabo blindado e fixação, custa R$ 900 por ponto em materiais e, somada a instalação e calibração, chega a R$ 1.400 por ponto instalado. O backend em nuvem custa R$ 30 por mês para a operação inteira, não por ponto, e as notificações por Telegram são gratuitas.</w:t>
-      </w:r>
-    </w:p>
-    <w:p>
-      <w:pPr>
-        <w:spacing w:lineRule="auto" w:line="360" w:after="120" w:before="0"/>
-        <w:ind w:firstLine="709"/>
-        <w:jc w:val="both"/>
-      </w:pPr>
-      <w:r>
-        <w:rPr>
-          <w:rFonts w:ascii="Arial" w:hAnsi="Arial" w:cs="Arial"/>
-          <w:sz w:val="24"/>
-        </w:rPr>
-        <w:t>Quanto a empresa gasta hoje: R$ 600 mil por ano, todos os anos, apenas para saber o nível dos seus piezômetros.</w:t>
-      </w:r>
-    </w:p>
-    <w:p>
-      <w:pPr>
-        <w:spacing w:lineRule="auto" w:line="360" w:after="120" w:before="0"/>
-        <w:ind w:firstLine="709"/>
-        <w:jc w:val="both"/>
-      </w:pPr>
-      <w:r>
-        <w:rPr>
-          <w:rFonts w:ascii="Arial" w:hAnsi="Arial" w:cs="Arial"/>
-          <w:sz w:val="24"/>
-        </w:rPr>
-        <w:t>Quanto ela passa a gastar com o sistema: R$ 140 mil de implantação, uma única vez (cem pontos a R$ 1.400), e R$ 57 mil por ano de operação, valor que inclui nuvem, manutenção com reposição de sensores e uma inspeção física mensal dos instrumentos, que a norma continua exigindo e que mantivemos no cálculo por honestidade: o sistema elimina as visitas de leitura, não as visitas de manutenção.</w:t>
-      </w:r>
-    </w:p>
-    <w:p>
-      <w:pPr>
-        <w:spacing w:lineRule="auto" w:line="360" w:after="120" w:before="0"/>
-        <w:ind w:firstLine="709"/>
-        <w:jc w:val="both"/>
-      </w:pPr>
-      <w:r>
-        <w:rPr>
-          <w:rFonts w:ascii="Arial" w:hAnsi="Arial" w:cs="Arial"/>
-          <w:sz w:val="24"/>
-        </w:rPr>
-        <w:t>O resultado é direto. A economia recorrente é de R$ 543 mil por ano, uma redução de 91% no custo. O payback da implantação é de 3,1 meses. Já no primeiro ano, descontando implantação e operação, a empresa economiza R$ 403 mil líquidos, um retorno sobre o investimento (ROI) de 288% em doze meses. Em cinco anos, a economia acumulada passa de R$ 2,5 milhões para um investimento de R$ 140 mil, um ROI superior a 1.800%. Não há cenário, mesmo dobrando todos os nossos custos, em que a conta deixe de fechar, porque a distância entre o custo do sistema e o custo da leitura manual é de duas ordens de grandeza.</w:t>
-      </w:r>
-    </w:p>
-    <w:p>
-      <w:pPr>
-        <w:spacing w:lineRule="auto" w:line="360" w:after="120" w:before="0"/>
-        <w:ind w:firstLine="709"/>
-        <w:jc w:val="both"/>
-      </w:pPr>
-      <w:r>
-        <w:rPr>
-          <w:rFonts w:ascii="Arial" w:hAnsi="Arial" w:cs="Arial"/>
-          <w:sz w:val="24"/>
-        </w:rPr>
-        <w:t>Como produto comercial, definimos o preço de R$ 2.500 por ponto instalado mais uma assinatura de plataforma de R$ 50 mensais por ponto. Esse preço foi fixado cruzando três referências: cobre o nosso custo de R$ 1.400 com margem de 44% no hardware, representa cerca de 15% do que custa a telemetria industrial equivalente (de R$ 5 mil a R$ 20 mil por ponto, sempre sob consulta) e fica muito abaixo do valor que o cliente economiza. Na ponta do cliente, cada ponto lido manualmente custa cerca de R$ 6 mil por ano; com o nosso sistema, ele paga R$ 3.100 no primeiro ano (kit mais doze mensalidades) e R$ 600 por ano daí em diante. O investimento dele se paga em pouco mais de seis meses e, a partir do segundo ano, ele gasta um décimo do que gastava.</w:t>
-      </w:r>
-    </w:p>
-    <w:p>
-      <w:pPr>
-        <w:spacing w:lineRule="auto" w:line="360" w:after="120" w:before="0"/>
-        <w:ind w:firstLine="709"/>
-        <w:jc w:val="both"/>
-      </w:pPr>
-      <w:r>
-        <w:rPr>
-          <w:rFonts w:ascii="Arial" w:hAnsi="Arial" w:cs="Arial"/>
-          <w:sz w:val="24"/>
-        </w:rPr>
-        <w:t>Sobre o mercado além da Samarco: o Brasil tem 28.043 barragens cadastradas no SNISB e apenas 6.210 enquadradas na PNSB, de modo que mais de 21 mil estruturas seguem com leitura manual ou sem leitura, às quais se somam cerca de 700 aterros sanitários com 5 a 15 piezômetros de chorume cada, já obrigados a monitorar por condicionante de licença ambiental. Capturar 1% desse universo, cerca de 900 pontos, significa R$ 2,25 milhões em vendas de kits e R$ 540 mil por ano de receita recorrente de assinaturas. É um mercado real, alcançável com o preço definido acima, e no qual o concorrente industrial não tem interesse em descer: a estrutura de custos dele não compete a R$ 2.500 por ponto.</w:t>
-      </w:r>
-    </w:p>
-    <w:p>
-      <w:pPr>
-        <w:spacing w:lineRule="auto" w:line="360" w:after="120" w:before="0"/>
-        <w:ind w:firstLine="709"/>
-        <w:jc w:val="both"/>
-      </w:pPr>
-      <w:r>
-        <w:rPr>
-          <w:rFonts w:ascii="Arial" w:hAnsi="Arial" w:cs="Arial"/>
-          <w:sz w:val="24"/>
-        </w:rPr>
-        <w:t>Uma empresa do porte da Samarco, sujeita à Resolução ANM 95/2022 para barragens de DPA alto, compraria telemetria industrial certificada, e não é a ela que pretendemos vender: o desafio SAGA valida o conceito de ponta a ponta, e o mercado do produto é a camada de estruturas que hoje não monitora nada porque a única alternativa existente custa dez vezes mais.</w:t>
-      </w:r>
-    </w:p>
-    <w:p>
-      <w:pPr>
-        <w:spacing w:lineRule="auto" w:line="360" w:after="120" w:before="120"/>
-        <w:ind w:firstLine="0"/>
-        <w:jc w:val="left"/>
-      </w:pPr>
-      <w:r>
-        <w:rPr>
-          <w:rFonts w:ascii="Arial" w:hAnsi="Arial" w:cs="Arial"/>
-          <w:b/>
-          <w:sz w:val="24"/>
-        </w:rPr>
-        <w:t>1.3.7 Resultados e conclusão</w:t>
-      </w:r>
-    </w:p>
-    <w:p>
-      <w:pPr>
-        <w:spacing w:lineRule="auto" w:line="360" w:after="120" w:before="0"/>
-        <w:ind w:firstLine="709"/>
-        <w:jc w:val="both"/>
-      </w:pPr>
-      <w:r>
-        <w:rPr>
-          <w:rFonts w:ascii="Arial" w:hAnsi="Arial" w:cs="Arial"/>
-          <w:sz w:val="24"/>
-        </w:rPr>
-        <w:t>O sistema foi demonstrado funcionando de ponta a ponta em dois cenários: simulação no Wokwi (ESP32 mais BMP180) e maquete física real (ESP32 mais JSN-SR04T medindo água de verdade dentro de um tubo). Em ambos os casos foram observados medição contínua a cada 10 segundos, transmissão em tempo real para o backend, persistência de histórico consultável no dashboard, classificação correta em NORMAL, ATENÇÃO e CRÍTICO nos limiares configurados (12 m e 15 m), alertas entregues por Telegram (e, quando configurado, SMS via Twilio) nas transições de faixa em até aproximadamente um minuto (ciclo do cron), e resiliência a queda de rede, com o buffer de store and forward retendo leituras localmente e reenviando-as sem perda assim que a conectividade retorna, comportamento demonstrado desligando e religando a rede durante a operação.</w:t>
-      </w:r>
-    </w:p>
-    <w:p>
-      <w:pPr>
-        <w:spacing w:lineRule="auto" w:line="360" w:after="120" w:before="0"/>
-        <w:ind w:firstLine="709"/>
-        <w:jc w:val="both"/>
-      </w:pPr>
-      <w:r>
-        <w:rPr>
-          <w:rFonts w:ascii="Arial" w:hAnsi="Arial" w:cs="Arial"/>
-          <w:b/>
-          <w:color w:val="C00000"/>
-          <w:sz w:val="24"/>
-        </w:rPr>
-        <w:t>[PREENCHER: resultados quantitativos do ensaio de validação do sensor, inserir aqui a mesma incerteza declarada (erro médio, desvio padrão, erro máximo, incerteza ±Z cm/2σ) já solicitada na seção de Viabilidade Técnica, como evidência quantitativa do funcionamento do protótipo]</w:t>
-      </w:r>
-      <w:r>
-        <w:rPr>
-          <w:rFonts w:ascii="Arial" w:hAnsi="Arial" w:cs="Arial"/>
-          <w:sz w:val="24"/>
-        </w:rPr>
-        <w:t>.</w:t>
-      </w:r>
-    </w:p>
-    <w:p>
-      <w:pPr>
-        <w:spacing w:lineRule="auto" w:line="360" w:after="120" w:before="0"/>
-        <w:ind w:firstLine="709"/>
-        <w:jc w:val="both"/>
-      </w:pPr>
-      <w:r>
-        <w:rPr>
-          <w:rFonts w:ascii="Arial" w:hAnsi="Arial" w:cs="Arial"/>
-          <w:sz w:val="24"/>
-        </w:rPr>
-        <w:t>Ao longo do projeto, algumas melhorias de robustez foram identificadas e corrigidas, e valem ser registradas como evidência de método de engenharia, isto é, de um processo de identificar, corrigir e documentar, em vez de simplesmente declarar que o sistema "funciona". Entre elas estão a introdução de um modo degradado no firmware, em que uma falha isolada de display ou de leitura de sensor não derruba o envio dos demais dados; a deduplicação de leituras no armazenamento, para que reenvios do buffer de store and forward nunca dupliquem uma linha no histórico; e a correção de um falso estado de "sem sinal" que ocorria na simulação Wokwi, um bug identificado durante os testes e corrigido antes de comprometer a credibilidade das demonstrações. Cada uma dessas correções está documentada e é citada aqui não como um problema a esconder, mas como prova de que o projeto foi conduzido com revisão e correção contínuas, e não apenas com um resultado final apresentado sem histórico do caminho até ele.</w:t>
-      </w:r>
-    </w:p>
-    <w:p>
-      <w:pPr>
-        <w:spacing w:lineRule="auto" w:line="360" w:after="120" w:before="0"/>
-        <w:ind w:firstLine="709"/>
-        <w:jc w:val="both"/>
-      </w:pPr>
-      <w:r>
-        <w:rPr>
-          <w:rFonts w:ascii="Arial" w:hAnsi="Arial" w:cs="Arial"/>
-          <w:sz w:val="24"/>
-        </w:rPr>
-        <w:t>Além do sistema em funcionamento, o trabalho entrega um conjunto de engenharia que existe independentemente do protótipo: a especificação completa da versão de produção, com sensor certificado, energia redundante e comunicação de campo; a pesquisa de mercado com fontes datadas, que analisou oito fabricantes e confirmou a lacuna de preço que o produto ocupa; a análise econômica com custo, preço, payback e retorno sobre investimento calculados; o protocolo de validação experimental do sensor; e a cadeia de confiança do dado, implementada em código, da autenticação por dispositivo à retenção automática do histórico. O protótipo é a representação física que demonstra que tudo isso funciona em conjunto; o valor do trabalho está no conjunto.</w:t>
-      </w:r>
-    </w:p>
-    <w:p>
-      <w:pPr>
-        <w:spacing w:lineRule="auto" w:line="360" w:after="120" w:before="0"/>
-        <w:ind w:firstLine="709"/>
-        <w:jc w:val="both"/>
-      </w:pPr>
-      <w:r>
-        <w:rPr>
-          <w:rFonts w:ascii="Arial" w:hAnsi="Arial" w:cs="Arial"/>
-          <w:sz w:val="24"/>
-        </w:rPr>
-        <w:t>As limitações honestas do protótipo continuam sendo as mesmas destacadas ao longo do documento: o sensor utilizado é um stand-in de coluna d'água, mais próximo de um INA do que de um piezômetro de corda vibrante; não há redundância de energia como exige a Resolução ANM 95/2022 para barragens de DPA alto; e a validação de precisão realizada qualifica o sensor ultrassônico como medidor de coluna d'água em bancada, não substituindo uma validação de piezômetro real, que exigiria instrumento de referência certificado, ensaio em câmara de pressão controlada e comparação de campo contra um piezômetro Casagrande instalado. O sistema é, declaradamente, um protótipo de conceito.</w:t>
-      </w:r>
-    </w:p>
-    <w:p>
-      <w:pPr>
-        <w:spacing w:lineRule="auto" w:line="360" w:after="120" w:before="0"/>
-        <w:ind w:firstLine="709"/>
-        <w:jc w:val="both"/>
-      </w:pPr>
-      <w:r>
-        <w:rPr>
-          <w:rFonts w:ascii="Arial" w:hAnsi="Arial" w:cs="Arial"/>
-          <w:sz w:val="24"/>
-        </w:rPr>
-        <w:t xml:space="preserve">Entre os trabalhos futuros estão a substituição do sensor por um piezômetro de corda vibrante real, viabilizada pelo contrato de adapter já implementado; a adição de redundância de energia (painel solar e bateria) para atender ao requisito da ANM 95/2022, cujo dimensionamento já foi mapeado neste documento; a migração do firmware de campo para o modo de deep sleep já disponível como opção de compilação; a adoção de uma chave de autenticação por dispositivo, hoje uma única </w:t>
-      </w:r>
-      <w:r>
-        <w:rPr>
-          <w:rFonts w:ascii="Courier New" w:hAnsi="Courier New" w:cs="Courier New"/>
-          <w:sz w:val="20"/>
-        </w:rPr>
-        <w:t>DEVICE_KEY</w:t>
-      </w:r>
-      <w:r>
-        <w:rPr>
-          <w:rFonts w:ascii="Arial" w:hAnsi="Arial" w:cs="Arial"/>
-          <w:sz w:val="24"/>
-        </w:rPr>
-        <w:t xml:space="preserve"> compartilhada; e a conectividade via LoRaWAN para instalações de campo sem cobertura WiFi.</w:t>
-      </w:r>
-    </w:p>
-    <w:p>
-      <w:pPr>
-        <w:spacing w:lineRule="auto" w:line="360" w:after="120" w:before="240"/>
-        <w:ind w:firstLine="0"/>
-        <w:jc w:val="left"/>
-      </w:pPr>
-      <w:r>
-        <w:rPr>
-          <w:rFonts w:ascii="Arial" w:hAnsi="Arial" w:cs="Arial"/>
-          <w:b/>
-          <w:sz w:val="24"/>
-        </w:rPr>
-        <w:t>1.4 ANEXOS</w:t>
-      </w:r>
-    </w:p>
-    <w:p>
-      <w:pPr>
-        <w:spacing w:lineRule="auto" w:line="360" w:after="120" w:before="120"/>
-        <w:ind w:firstLine="0"/>
-        <w:jc w:val="left"/>
-      </w:pPr>
-      <w:r>
-        <w:rPr>
-          <w:rFonts w:ascii="Arial" w:hAnsi="Arial" w:cs="Arial"/>
-          <w:b/>
-          <w:sz w:val="24"/>
-        </w:rPr>
-        <w:t>1.4.1 BMG Canvas</w:t>
-      </w:r>
-    </w:p>
-    <w:p>
-      <w:pPr>
-        <w:spacing w:lineRule="auto" w:line="360" w:after="120" w:before="0"/>
-        <w:ind w:firstLine="709"/>
-        <w:jc w:val="both"/>
-      </w:pPr>
-      <w:r>
-        <w:rPr>
-          <w:rFonts w:ascii="Arial" w:hAnsi="Arial" w:cs="Arial"/>
-          <w:sz w:val="24"/>
-        </w:rPr>
-        <w:t>Esqueleto dos nove blocos do Business Model Canvas, com base na pesquisa de mercado e no estudo de viabilidade econômica conduzidos pela equipe, para transpor ao quadro visual.</w:t>
+        <w:t>A viabilidade econômica do AquaSense foi avaliada a partir da comparação entre o custo da rotina tradicional de leitura manual terceirizada e o custo estimado de implantação e operação da solução proposta, tomando como referência a demanda oficial que motivou o projeto.</w:t>
       </w:r>
     </w:p>
     <w:tbl>
@@ -2769,13 +1875,15 @@
         <w:tblLook w:firstColumn="1" w:firstRow="1" w:lastColumn="0" w:lastRow="0" w:noHBand="0" w:noVBand="1" w:val="04A0"/>
       </w:tblPr>
       <w:tblGrid>
-        <w:gridCol w:w="4535"/>
-        <w:gridCol w:w="4535"/>
+        <w:gridCol w:w="2268"/>
+        <w:gridCol w:w="2268"/>
+        <w:gridCol w:w="2268"/>
+        <w:gridCol w:w="2268"/>
       </w:tblGrid>
       <w:tr>
         <w:tc>
           <w:tcPr>
-            <w:tcW w:type="dxa" w:w="4535"/>
+            <w:tcW w:type="dxa" w:w="2268"/>
           </w:tcPr>
           <w:p>
             <w:pPr>
@@ -2789,13 +1897,13 @@
                 <w:b/>
                 <w:sz w:val="20"/>
               </w:rPr>
-              <w:t>Bloco</w:t>
+              <w:t>Métrica</w:t>
             </w:r>
           </w:p>
         </w:tc>
         <w:tc>
           <w:tcPr>
-            <w:tcW w:type="dxa" w:w="4535"/>
+            <w:tcW w:type="dxa" w:w="2268"/>
           </w:tcPr>
           <w:p>
             <w:pPr>
@@ -2809,7 +1917,47 @@
                 <w:b/>
                 <w:sz w:val="20"/>
               </w:rPr>
-              <w:t>Conteúdo sugerido</w:t>
+              <w:t>Situação tradicional (manual)</w:t>
+            </w:r>
+          </w:p>
+        </w:tc>
+        <w:tc>
+          <w:tcPr>
+            <w:tcW w:type="dxa" w:w="2268"/>
+          </w:tcPr>
+          <w:p>
+            <w:pPr>
+              <w:spacing w:after="80"/>
+              <w:jc w:val="both"/>
+            </w:pPr>
+            <w:r/>
+            <w:r>
+              <w:rPr>
+                <w:rFonts w:ascii="Arial" w:hAnsi="Arial" w:cs="Arial"/>
+                <w:b/>
+                <w:sz w:val="20"/>
+              </w:rPr>
+              <w:t>Solução AquaSense</w:t>
+            </w:r>
+          </w:p>
+        </w:tc>
+        <w:tc>
+          <w:tcPr>
+            <w:tcW w:type="dxa" w:w="2268"/>
+          </w:tcPr>
+          <w:p>
+            <w:pPr>
+              <w:spacing w:after="80"/>
+              <w:jc w:val="both"/>
+            </w:pPr>
+            <w:r/>
+            <w:r>
+              <w:rPr>
+                <w:rFonts w:ascii="Arial" w:hAnsi="Arial" w:cs="Arial"/>
+                <w:b/>
+                <w:sz w:val="20"/>
+              </w:rPr>
+              <w:t>Impacto</w:t>
             </w:r>
           </w:p>
         </w:tc>
@@ -2817,7 +1965,7 @@
       <w:tr>
         <w:tc>
           <w:tcPr>
-            <w:tcW w:type="dxa" w:w="4535"/>
+            <w:tcW w:type="dxa" w:w="2268"/>
           </w:tcPr>
           <w:p>
             <w:pPr>
@@ -2830,13 +1978,13 @@
                 <w:rFonts w:ascii="Arial" w:hAnsi="Arial" w:cs="Arial"/>
                 <w:sz w:val="20"/>
               </w:rPr>
-              <w:t>Proposta de valor</w:t>
+              <w:t>Custo operacional anual</w:t>
             </w:r>
           </w:p>
         </w:tc>
         <w:tc>
           <w:tcPr>
-            <w:tcW w:type="dxa" w:w="4535"/>
+            <w:tcW w:type="dxa" w:w="2268"/>
           </w:tcPr>
           <w:p>
             <w:pPr>
@@ -2849,15 +1997,13 @@
                 <w:rFonts w:ascii="Arial" w:hAnsi="Arial" w:cs="Arial"/>
                 <w:sz w:val="20"/>
               </w:rPr>
-              <w:t>Monitoramento automatizado e alerta preventivo de nível d'água e poropressão a uma fração do custo da telemetria industrial (R$ 5.000 a R$ 20.000 por ponto), para estruturas hoje lidas manualmente, com preço de mercado próprio entre R$ 1.000 e R$ 3.500 por ponto instalado.</w:t>
+              <w:t>Custo elevado com contratação de equipes de medição, deslocamento de veículos e consumo de combustível</w:t>
             </w:r>
           </w:p>
         </w:tc>
-      </w:tr>
-      <w:tr>
         <w:tc>
           <w:tcPr>
-            <w:tcW w:type="dxa" w:w="4535"/>
+            <w:tcW w:type="dxa" w:w="2268"/>
           </w:tcPr>
           <w:p>
             <w:pPr>
@@ -2870,13 +2016,13 @@
                 <w:rFonts w:ascii="Arial" w:hAnsi="Arial" w:cs="Arial"/>
                 <w:sz w:val="20"/>
               </w:rPr>
-              <w:t>Segmentos de clientes</w:t>
+              <w:t>Custo concentrado em manutenções preventivas esporádicas planejadas</w:t>
             </w:r>
           </w:p>
         </w:tc>
         <w:tc>
           <w:tcPr>
-            <w:tcW w:type="dxa" w:w="4535"/>
+            <w:tcW w:type="dxa" w:w="2268"/>
           </w:tcPr>
           <w:p>
             <w:pPr>
@@ -2889,7 +2035,7 @@
                 <w:rFonts w:ascii="Arial" w:hAnsi="Arial" w:cs="Arial"/>
                 <w:sz w:val="20"/>
               </w:rPr>
-              <w:t>Em ordem de prioridade sugerida na base de conhecimento: primeiro, pequenas barragens de água e açudes (28.043 barragens cadastradas no SNISB, só 6.210 na PNSB); segundo, aterros sanitários (cerca de 700 no Brasil, cada um com 5 a 15 piezômetros de chorume, monitoramento já exigido como condicionante de licença ambiental); terceiro, encostas urbanas (defesa civil e prefeituras, 2.095 municípios em áreas de risco); e, como mercados adjacentes, obras civis de rebaixamento temporário de lençol freático, água subterrânea e agricultura, pilhas de estéril e taludes de cava.</w:t>
+              <w:t>Economia estimada de R$ 600.000,00 por ano em escala operacional</w:t>
             </w:r>
           </w:p>
         </w:tc>
@@ -2897,7 +2043,7 @@
       <w:tr>
         <w:tc>
           <w:tcPr>
-            <w:tcW w:type="dxa" w:w="4535"/>
+            <w:tcW w:type="dxa" w:w="2268"/>
           </w:tcPr>
           <w:p>
             <w:pPr>
@@ -2910,13 +2056,13 @@
                 <w:rFonts w:ascii="Arial" w:hAnsi="Arial" w:cs="Arial"/>
                 <w:sz w:val="20"/>
               </w:rPr>
-              <w:t>Canais</w:t>
+              <w:t>Frequência de dados</w:t>
             </w:r>
           </w:p>
         </w:tc>
         <w:tc>
           <w:tcPr>
-            <w:tcW w:type="dxa" w:w="4535"/>
+            <w:tcW w:type="dxa" w:w="2268"/>
           </w:tcPr>
           <w:p>
             <w:pPr>
@@ -2929,15 +2075,13 @@
                 <w:rFonts w:ascii="Arial" w:hAnsi="Arial" w:cs="Arial"/>
                 <w:sz w:val="20"/>
               </w:rPr>
-              <w:t>Venda direta a operadores de barragens e municípios, parcerias com empresas de instrumentação geotécnica que hoje só atendem DPA alto, e editais públicos, como os desafios de inovação do tipo SAGA.</w:t>
+              <w:t>Baixa frequência, com leitura semanal ou mensal por piezômetro</w:t>
             </w:r>
           </w:p>
         </w:tc>
-      </w:tr>
-      <w:tr>
         <w:tc>
           <w:tcPr>
-            <w:tcW w:type="dxa" w:w="4535"/>
+            <w:tcW w:type="dxa" w:w="2268"/>
           </w:tcPr>
           <w:p>
             <w:pPr>
@@ -2950,13 +2094,13 @@
                 <w:rFonts w:ascii="Arial" w:hAnsi="Arial" w:cs="Arial"/>
                 <w:sz w:val="20"/>
               </w:rPr>
-              <w:t>Relacionamento com clientes</w:t>
+              <w:t>Alta resolução de monitoramento, com leituras contínuas ao longo do dia</w:t>
             </w:r>
           </w:p>
         </w:tc>
         <w:tc>
           <w:tcPr>
-            <w:tcW w:type="dxa" w:w="4535"/>
+            <w:tcW w:type="dxa" w:w="2268"/>
           </w:tcPr>
           <w:p>
             <w:pPr>
@@ -2969,7 +2113,7 @@
                 <w:rFonts w:ascii="Arial" w:hAnsi="Arial" w:cs="Arial"/>
                 <w:sz w:val="20"/>
               </w:rPr>
-              <w:t>Suporte à instalação e calibração, dashboard como ponto de contato contínuo, e alertas automáticos como demonstração recorrente de valor.</w:t>
+              <w:t>Detecção ágil de transientes de pressão hidráulica e infiltração rápida</w:t>
             </w:r>
           </w:p>
         </w:tc>
@@ -2977,7 +2121,7 @@
       <w:tr>
         <w:tc>
           <w:tcPr>
-            <w:tcW w:type="dxa" w:w="4535"/>
+            <w:tcW w:type="dxa" w:w="2268"/>
           </w:tcPr>
           <w:p>
             <w:pPr>
@@ -2990,13 +2134,13 @@
                 <w:rFonts w:ascii="Arial" w:hAnsi="Arial" w:cs="Arial"/>
                 <w:sz w:val="20"/>
               </w:rPr>
-              <w:t>Fontes de receita</w:t>
+              <w:t>Segurança do trabalho</w:t>
             </w:r>
           </w:p>
         </w:tc>
         <w:tc>
           <w:tcPr>
-            <w:tcW w:type="dxa" w:w="4535"/>
+            <w:tcW w:type="dxa" w:w="2268"/>
           </w:tcPr>
           <w:p>
             <w:pPr>
@@ -3009,15 +2153,13 @@
                 <w:rFonts w:ascii="Arial" w:hAnsi="Arial" w:cs="Arial"/>
                 <w:sz w:val="20"/>
               </w:rPr>
-              <w:t>Venda ou comodato de hardware por ponto instalado (custo entre R$ 586 e R$ 1.179 em cenário de campo real, com margem), assinatura mensal de plataforma entre R$ 30 e R$ 80 por ponto, e serviço de instalação e calibração.</w:t>
+              <w:t>Exposição constante de equipes a áreas geotécnicas instáveis</w:t>
             </w:r>
           </w:p>
         </w:tc>
-      </w:tr>
-      <w:tr>
         <w:tc>
           <w:tcPr>
-            <w:tcW w:type="dxa" w:w="4535"/>
+            <w:tcW w:type="dxa" w:w="2268"/>
           </w:tcPr>
           <w:p>
             <w:pPr>
@@ -3030,13 +2172,13 @@
                 <w:rFonts w:ascii="Arial" w:hAnsi="Arial" w:cs="Arial"/>
                 <w:sz w:val="20"/>
               </w:rPr>
-              <w:t>Recursos-chave</w:t>
+              <w:t>Exposição mínima, restrita a visitas programadas de manutenção preventiva</w:t>
             </w:r>
           </w:p>
         </w:tc>
         <w:tc>
           <w:tcPr>
-            <w:tcW w:type="dxa" w:w="4535"/>
+            <w:tcW w:type="dxa" w:w="2268"/>
           </w:tcPr>
           <w:p>
             <w:pPr>
@@ -3049,7 +2191,7 @@
                 <w:rFonts w:ascii="Arial" w:hAnsi="Arial" w:cs="Arial"/>
                 <w:sz w:val="20"/>
               </w:rPr>
-              <w:t>Firmware com contrato de adapter de sensor, backend Cloudflare (Worker, D1 e KV), e conhecimento de instrumentação geotécnica e da regulação (ANM 95/2022, Lei 14.066/2020).</w:t>
+              <w:t>Redução direta do risco operacional das equipes de campo</w:t>
             </w:r>
           </w:p>
         </w:tc>
@@ -3057,7 +2199,7 @@
       <w:tr>
         <w:tc>
           <w:tcPr>
-            <w:tcW w:type="dxa" w:w="4535"/>
+            <w:tcW w:type="dxa" w:w="2268"/>
           </w:tcPr>
           <w:p>
             <w:pPr>
@@ -3070,13 +2212,13 @@
                 <w:rFonts w:ascii="Arial" w:hAnsi="Arial" w:cs="Arial"/>
                 <w:sz w:val="20"/>
               </w:rPr>
-              <w:t>Atividades-chave</w:t>
+              <w:t>Custo por ponto de monitoramento</w:t>
             </w:r>
           </w:p>
         </w:tc>
         <w:tc>
           <w:tcPr>
-            <w:tcW w:type="dxa" w:w="4535"/>
+            <w:tcW w:type="dxa" w:w="2268"/>
           </w:tcPr>
           <w:p>
             <w:pPr>
@@ -3089,15 +2231,13 @@
                 <w:rFonts w:ascii="Arial" w:hAnsi="Arial" w:cs="Arial"/>
                 <w:sz w:val="20"/>
               </w:rPr>
-              <w:t>Desenvolvimento e manutenção do firmware, backend e dashboard, validação de sensores, e suporte a instalação em campo.</w:t>
+              <w:t>Custo recorrente sem geração de ativo permanente</w:t>
             </w:r>
           </w:p>
         </w:tc>
-      </w:tr>
-      <w:tr>
         <w:tc>
           <w:tcPr>
-            <w:tcW w:type="dxa" w:w="4535"/>
+            <w:tcW w:type="dxa" w:w="2268"/>
           </w:tcPr>
           <w:p>
             <w:pPr>
@@ -3110,13 +2250,13 @@
                 <w:rFonts w:ascii="Arial" w:hAnsi="Arial" w:cs="Arial"/>
                 <w:sz w:val="20"/>
               </w:rPr>
-              <w:t>Parcerias-chave</w:t>
+              <w:t>Investimento estimado de aproximadamente R$ 2.965,00 por ponto de monitoramento</w:t>
             </w:r>
           </w:p>
         </w:tc>
         <w:tc>
           <w:tcPr>
-            <w:tcW w:type="dxa" w:w="4535"/>
+            <w:tcW w:type="dxa" w:w="2268"/>
           </w:tcPr>
           <w:p>
             <w:pPr>
@@ -3129,7 +2269,7 @@
                 <w:rFonts w:ascii="Arial" w:hAnsi="Arial" w:cs="Arial"/>
                 <w:sz w:val="20"/>
               </w:rPr>
-              <w:t>Fabricantes e fornecedores de sensores (transdutores de pressão, corda vibrante), integradores de instrumentação geotécnica, municípios e órgãos de defesa civil, e operadores de aterros sanitários.</w:t>
+              <w:t>Investimento estimado de R$ 260.000,00 para uma primeira série de 50 pontos</w:t>
             </w:r>
           </w:p>
         </w:tc>
@@ -3137,7 +2277,7 @@
       <w:tr>
         <w:tc>
           <w:tcPr>
-            <w:tcW w:type="dxa" w:w="4535"/>
+            <w:tcW w:type="dxa" w:w="2268"/>
           </w:tcPr>
           <w:p>
             <w:pPr>
@@ -3150,13 +2290,13 @@
                 <w:rFonts w:ascii="Arial" w:hAnsi="Arial" w:cs="Arial"/>
                 <w:sz w:val="20"/>
               </w:rPr>
-              <w:t>Estrutura de custos</w:t>
+              <w:t>Tempo de retorno</w:t>
             </w:r>
           </w:p>
         </w:tc>
         <w:tc>
           <w:tcPr>
-            <w:tcW w:type="dxa" w:w="4535"/>
+            <w:tcW w:type="dxa" w:w="2268"/>
           </w:tcPr>
           <w:p>
             <w:pPr>
@@ -3169,7 +2309,45 @@
                 <w:rFonts w:ascii="Arial" w:hAnsi="Arial" w:cs="Arial"/>
                 <w:sz w:val="20"/>
               </w:rPr>
-              <w:t>Hardware por ponto (custo único), operação em nuvem (free tier até certa escala, depois plano pago a partir de US$ 5 por mês), e eventual manutenção ou substituição de sensores em campo.</w:t>
+              <w:t>Gasto constante sem possibilidade de retorno de capital</w:t>
+            </w:r>
+          </w:p>
+        </w:tc>
+        <w:tc>
+          <w:tcPr>
+            <w:tcW w:type="dxa" w:w="2268"/>
+          </w:tcPr>
+          <w:p>
+            <w:pPr>
+              <w:spacing w:after="80"/>
+              <w:jc w:val="both"/>
+            </w:pPr>
+            <w:r/>
+            <w:r>
+              <w:rPr>
+                <w:rFonts w:ascii="Arial" w:hAnsi="Arial" w:cs="Arial"/>
+                <w:sz w:val="20"/>
+              </w:rPr>
+              <w:t>Investimento com retorno mensurável frente à economia operacional obtida</w:t>
+            </w:r>
+          </w:p>
+        </w:tc>
+        <w:tc>
+          <w:tcPr>
+            <w:tcW w:type="dxa" w:w="2268"/>
+          </w:tcPr>
+          <w:p>
+            <w:pPr>
+              <w:spacing w:after="80"/>
+              <w:jc w:val="both"/>
+            </w:pPr>
+            <w:r/>
+            <w:r>
+              <w:rPr>
+                <w:rFonts w:ascii="Arial" w:hAnsi="Arial" w:cs="Arial"/>
+                <w:sz w:val="20"/>
+              </w:rPr>
+              <w:t>Payback estimado em cerca de 6 meses</w:t>
             </w:r>
           </w:p>
         </w:tc>
@@ -3182,6 +2360,48 @@
     </w:p>
     <w:p>
       <w:pPr>
+        <w:spacing w:lineRule="auto" w:line="360" w:after="120" w:before="0"/>
+        <w:ind w:firstLine="709"/>
+        <w:jc w:val="both"/>
+      </w:pPr>
+      <w:r>
+        <w:rPr>
+          <w:rFonts w:ascii="Arial" w:hAnsi="Arial" w:cs="Arial"/>
+          <w:sz w:val="24"/>
+        </w:rPr>
+        <w:t>O valor de R$ 2.965 corresponde ao hardware de cada unidade; o investimento total de R$ 260.000,00 para a primeira série de 50 pontos inclui, além do hardware (R$ 148.250,00), a instalação e o comissionamento em campo (R$ 40.000,00), sobressalentes (R$ 14.825,00), a bancada de homologação (R$ 25.000,00) e a contingência de projeto (R$ 31.925,00), resultando em R$ 5.200,00 por ponto instalado.</w:t>
+      </w:r>
+    </w:p>
+    <w:p>
+      <w:pPr>
+        <w:spacing w:lineRule="auto" w:line="360" w:after="120" w:before="0"/>
+        <w:ind w:firstLine="709"/>
+        <w:jc w:val="both"/>
+      </w:pPr>
+      <w:r>
+        <w:rPr>
+          <w:rFonts w:ascii="Arial" w:hAnsi="Arial" w:cs="Arial"/>
+          <w:sz w:val="24"/>
+        </w:rPr>
+        <w:t>O custo operacional anual estimado do sistema é de R$ 39.155,00, cobrindo a conectividade celular dos 50 pontos, a nuvem, a manutenção e as inspeções mensais de campo, o que representa uma redução de 93,5% sobre os R$ 600 mil/ano da situação tradicional, com payback estimado em 5,6 meses, ROI de 116% já no primeiro ano de operação e de 978% acumulado ao longo de cinco anos. O item de conectividade celular tem rotas concretas de redução de custo, como planos IoT de menor preço por chip e o uso de um gateway LoRaWAN compartilhado entre os pontos mais próximos.</w:t>
+      </w:r>
+    </w:p>
+    <w:p>
+      <w:pPr>
+        <w:spacing w:lineRule="auto" w:line="360" w:after="120" w:before="0"/>
+        <w:ind w:firstLine="709"/>
+        <w:jc w:val="both"/>
+      </w:pPr>
+      <w:r>
+        <w:rPr>
+          <w:rFonts w:ascii="Arial" w:hAnsi="Arial" w:cs="Arial"/>
+          <w:sz w:val="24"/>
+        </w:rPr>
+        <w:t>Mesmo em uma comparação conservadora, o investimento estimado por ponto de monitoramento permanece uma ordem de grandeza abaixo dos pacotes comerciais completos de instrumentação e telemetria voltados a barragens de Dano Potencial Associado alto, cujos preços são tipicamente informados apenas sob consulta. Essa diferença sustenta a proposta de valor do AquaSense como alternativa economicamente viável para a camada de estruturas geotécnicas que hoje não têm acesso a nenhuma automação.</w:t>
+      </w:r>
+    </w:p>
+    <w:p>
+      <w:pPr>
         <w:spacing w:lineRule="auto" w:line="360" w:after="120" w:before="120"/>
         <w:ind w:firstLine="0"/>
         <w:jc w:val="left"/>
@@ -3192,7 +2412,7 @@
           <w:b/>
           <w:sz w:val="24"/>
         </w:rPr>
-        <w:t>1.4.2 Situação de aprendizagem</w:t>
+        <w:t>1.3.7 Resultados e conclusão</w:t>
       </w:r>
     </w:p>
     <w:p>
@@ -3201,6 +2421,975 @@
         <w:ind w:firstLine="709"/>
         <w:jc w:val="both"/>
       </w:pPr>
+      <w:r>
+        <w:rPr>
+          <w:rFonts w:ascii="Arial" w:hAnsi="Arial" w:cs="Arial"/>
+          <w:sz w:val="24"/>
+        </w:rPr>
+        <w:t>O AquaSense atingiu, até o momento, a validação completa da cadeia de software de ponta a ponta: o firmware do microcontrolador, o backend em nuvem responsável pela ingestão e pelo armazenamento das leituras, o dashboard web com exibição de série histórica e o motor de alertas em dupla via, por Telegram e por SMS, estão operacionais em ambiente de produção na nuvem. Os testes realizados confirmaram que as transições entre os níveis normal, atenção e crítico disparam corretamente as notificações, e que o mecanismo de store &amp; forward preserva as leituras mesmo diante de interrupções momentâneas de conectividade.</w:t>
+      </w:r>
+    </w:p>
+    <w:p>
+      <w:pPr>
+        <w:spacing w:lineRule="auto" w:line="360" w:after="120" w:before="0"/>
+        <w:ind w:firstLine="709"/>
+        <w:jc w:val="both"/>
+      </w:pPr>
+      <w:r>
+        <w:rPr>
+          <w:rFonts w:ascii="Arial" w:hAnsi="Arial" w:cs="Arial"/>
+          <w:sz w:val="24"/>
+        </w:rPr>
+        <w:t>A montagem e a homologação física da Unidade de Controle e Telemetria na bancada vertical de PVC constituem etapa em andamento, na qual a equipe segue validando a integração entre o transdutor de pressão, o circuito de condicionamento de sinal e o gabinete industrial, com o objetivo de comprovar em bancada os mesmos resultados já obtidos no ambiente de simulação e nuvem.</w:t>
+      </w:r>
+    </w:p>
+    <w:p>
+      <w:pPr>
+        <w:spacing w:lineRule="auto" w:line="360" w:after="120" w:before="0"/>
+        <w:ind w:firstLine="709"/>
+        <w:jc w:val="both"/>
+      </w:pPr>
+      <w:r>
+        <w:rPr>
+          <w:rFonts w:ascii="Arial" w:hAnsi="Arial" w:cs="Arial"/>
+          <w:sz w:val="24"/>
+        </w:rPr>
+        <w:t>O desenvolvimento do projeto permitiu que os quatro integrantes, todos do curso Técnico em Automação Industrial, integrassem competências complementares de firmware, instrumentação, energia e documentação técnica sob um desafio real de mercado, cumprindo os objetivos propostos na etapa de software concluída e mantendo a etapa de homologação física como continuidade natural do trabalho.</w:t>
+      </w:r>
+    </w:p>
+    <w:p>
+      <w:pPr>
+        <w:spacing w:lineRule="auto" w:line="360" w:after="120" w:before="240"/>
+        <w:ind w:firstLine="0"/>
+        <w:jc w:val="left"/>
+      </w:pPr>
+      <w:r>
+        <w:rPr>
+          <w:rFonts w:ascii="Arial" w:hAnsi="Arial" w:cs="Arial"/>
+          <w:b/>
+          <w:sz w:val="24"/>
+        </w:rPr>
+        <w:t>1.4 ANEXOS</w:t>
+      </w:r>
+    </w:p>
+    <w:p>
+      <w:pPr>
+        <w:spacing w:lineRule="auto" w:line="360" w:after="120" w:before="120"/>
+        <w:ind w:firstLine="0"/>
+        <w:jc w:val="left"/>
+      </w:pPr>
+      <w:r>
+        <w:rPr>
+          <w:rFonts w:ascii="Arial" w:hAnsi="Arial" w:cs="Arial"/>
+          <w:b/>
+          <w:sz w:val="24"/>
+        </w:rPr>
+        <w:t>1.4.1 Orçamento estimado (bom)</w:t>
+      </w:r>
+    </w:p>
+    <w:p>
+      <w:pPr>
+        <w:spacing w:lineRule="auto" w:line="360" w:after="120" w:before="0"/>
+        <w:ind w:firstLine="709"/>
+        <w:jc w:val="both"/>
+      </w:pPr>
+      <w:r>
+        <w:rPr>
+          <w:rFonts w:ascii="Arial" w:hAnsi="Arial" w:cs="Arial"/>
+          <w:sz w:val="24"/>
+        </w:rPr>
+        <w:t>Anexo I: Orçamento Estimado da Unidade de Controle e Telemetria (BOM, Bill of Materials)</w:t>
+      </w:r>
+    </w:p>
+    <w:tbl>
+      <w:tblPr>
+        <w:tblStyle w:val="TableGrid"/>
+        <w:tblW w:type="auto" w:w="0"/>
+        <w:jc w:val="center"/>
+        <w:tblLook w:firstColumn="1" w:firstRow="1" w:lastColumn="0" w:lastRow="0" w:noHBand="0" w:noVBand="1" w:val="04A0"/>
+      </w:tblPr>
+      <w:tblGrid>
+        <w:gridCol w:w="2268"/>
+        <w:gridCol w:w="2268"/>
+        <w:gridCol w:w="2268"/>
+        <w:gridCol w:w="2268"/>
+      </w:tblGrid>
+      <w:tr>
+        <w:tc>
+          <w:tcPr>
+            <w:tcW w:type="dxa" w:w="2268"/>
+          </w:tcPr>
+          <w:p>
+            <w:pPr>
+              <w:spacing w:after="80"/>
+              <w:jc w:val="both"/>
+            </w:pPr>
+            <w:r/>
+            <w:r>
+              <w:rPr>
+                <w:rFonts w:ascii="Arial" w:hAnsi="Arial" w:cs="Arial"/>
+                <w:b/>
+                <w:sz w:val="20"/>
+              </w:rPr>
+              <w:t>Componente</w:t>
+            </w:r>
+          </w:p>
+        </w:tc>
+        <w:tc>
+          <w:tcPr>
+            <w:tcW w:type="dxa" w:w="2268"/>
+          </w:tcPr>
+          <w:p>
+            <w:pPr>
+              <w:spacing w:after="80"/>
+              <w:jc w:val="both"/>
+            </w:pPr>
+            <w:r/>
+            <w:r>
+              <w:rPr>
+                <w:rFonts w:ascii="Arial" w:hAnsi="Arial" w:cs="Arial"/>
+                <w:b/>
+                <w:sz w:val="20"/>
+              </w:rPr>
+              <w:t>Especificação técnica</w:t>
+            </w:r>
+          </w:p>
+        </w:tc>
+        <w:tc>
+          <w:tcPr>
+            <w:tcW w:type="dxa" w:w="2268"/>
+          </w:tcPr>
+          <w:p>
+            <w:pPr>
+              <w:spacing w:after="80"/>
+              <w:jc w:val="both"/>
+            </w:pPr>
+            <w:r/>
+            <w:r>
+              <w:rPr>
+                <w:rFonts w:ascii="Arial" w:hAnsi="Arial" w:cs="Arial"/>
+                <w:b/>
+                <w:sz w:val="20"/>
+              </w:rPr>
+              <w:t>Qtde</w:t>
+            </w:r>
+          </w:p>
+        </w:tc>
+        <w:tc>
+          <w:tcPr>
+            <w:tcW w:type="dxa" w:w="2268"/>
+          </w:tcPr>
+          <w:p>
+            <w:pPr>
+              <w:spacing w:after="80"/>
+              <w:jc w:val="both"/>
+            </w:pPr>
+            <w:r/>
+            <w:r>
+              <w:rPr>
+                <w:rFonts w:ascii="Arial" w:hAnsi="Arial" w:cs="Arial"/>
+                <w:b/>
+                <w:sz w:val="20"/>
+              </w:rPr>
+              <w:t>Função</w:t>
+            </w:r>
+          </w:p>
+        </w:tc>
+      </w:tr>
+      <w:tr>
+        <w:tc>
+          <w:tcPr>
+            <w:tcW w:type="dxa" w:w="2268"/>
+          </w:tcPr>
+          <w:p>
+            <w:pPr>
+              <w:spacing w:after="80"/>
+              <w:jc w:val="both"/>
+            </w:pPr>
+            <w:r/>
+            <w:r>
+              <w:rPr>
+                <w:rFonts w:ascii="Arial" w:hAnsi="Arial" w:cs="Arial"/>
+                <w:sz w:val="20"/>
+              </w:rPr>
+              <w:t>Transdutor de pressão</w:t>
+            </w:r>
+          </w:p>
+        </w:tc>
+        <w:tc>
+          <w:tcPr>
+            <w:tcW w:type="dxa" w:w="2268"/>
+          </w:tcPr>
+          <w:p>
+            <w:pPr>
+              <w:spacing w:after="80"/>
+              <w:jc w:val="both"/>
+            </w:pPr>
+            <w:r/>
+            <w:r>
+              <w:rPr>
+                <w:rFonts w:ascii="Arial" w:hAnsi="Arial" w:cs="Arial"/>
+                <w:sz w:val="20"/>
+              </w:rPr>
+              <w:t>Piezorresistivo submersível, saída de corrente de 4 a 20 mA, cabo blindado</w:t>
+            </w:r>
+          </w:p>
+        </w:tc>
+        <w:tc>
+          <w:tcPr>
+            <w:tcW w:type="dxa" w:w="2268"/>
+          </w:tcPr>
+          <w:p>
+            <w:pPr>
+              <w:spacing w:after="80"/>
+              <w:jc w:val="both"/>
+            </w:pPr>
+            <w:r/>
+            <w:r>
+              <w:rPr>
+                <w:rFonts w:ascii="Arial" w:hAnsi="Arial" w:cs="Arial"/>
+                <w:sz w:val="20"/>
+              </w:rPr>
+              <w:t>01 un.</w:t>
+            </w:r>
+          </w:p>
+        </w:tc>
+        <w:tc>
+          <w:tcPr>
+            <w:tcW w:type="dxa" w:w="2268"/>
+          </w:tcPr>
+          <w:p>
+            <w:pPr>
+              <w:spacing w:after="80"/>
+              <w:jc w:val="both"/>
+            </w:pPr>
+            <w:r/>
+            <w:r>
+              <w:rPr>
+                <w:rFonts w:ascii="Arial" w:hAnsi="Arial" w:cs="Arial"/>
+                <w:sz w:val="20"/>
+              </w:rPr>
+              <w:t>Converter a pressão hidrostática do poço em sinal elétrico analógico padronizado</w:t>
+            </w:r>
+          </w:p>
+        </w:tc>
+      </w:tr>
+      <w:tr>
+        <w:tc>
+          <w:tcPr>
+            <w:tcW w:type="dxa" w:w="2268"/>
+          </w:tcPr>
+          <w:p>
+            <w:pPr>
+              <w:spacing w:after="80"/>
+              <w:jc w:val="both"/>
+            </w:pPr>
+            <w:r/>
+            <w:r>
+              <w:rPr>
+                <w:rFonts w:ascii="Arial" w:hAnsi="Arial" w:cs="Arial"/>
+                <w:sz w:val="20"/>
+              </w:rPr>
+              <w:t>Controlador ESP32</w:t>
+            </w:r>
+          </w:p>
+        </w:tc>
+        <w:tc>
+          <w:tcPr>
+            <w:tcW w:type="dxa" w:w="2268"/>
+          </w:tcPr>
+          <w:p>
+            <w:pPr>
+              <w:spacing w:after="80"/>
+              <w:jc w:val="both"/>
+            </w:pPr>
+            <w:r/>
+            <w:r>
+              <w:rPr>
+                <w:rFonts w:ascii="Arial" w:hAnsi="Arial" w:cs="Arial"/>
+                <w:sz w:val="20"/>
+              </w:rPr>
+              <w:t>Microcontrolador com barramentos I2C, SPI e Serial UART expostos</w:t>
+            </w:r>
+          </w:p>
+        </w:tc>
+        <w:tc>
+          <w:tcPr>
+            <w:tcW w:type="dxa" w:w="2268"/>
+          </w:tcPr>
+          <w:p>
+            <w:pPr>
+              <w:spacing w:after="80"/>
+              <w:jc w:val="both"/>
+            </w:pPr>
+            <w:r/>
+            <w:r>
+              <w:rPr>
+                <w:rFonts w:ascii="Arial" w:hAnsi="Arial" w:cs="Arial"/>
+                <w:sz w:val="20"/>
+              </w:rPr>
+              <w:t>01 un.</w:t>
+            </w:r>
+          </w:p>
+        </w:tc>
+        <w:tc>
+          <w:tcPr>
+            <w:tcW w:type="dxa" w:w="2268"/>
+          </w:tcPr>
+          <w:p>
+            <w:pPr>
+              <w:spacing w:after="80"/>
+              <w:jc w:val="both"/>
+            </w:pPr>
+            <w:r/>
+            <w:r>
+              <w:rPr>
+                <w:rFonts w:ascii="Arial" w:hAnsi="Arial" w:cs="Arial"/>
+                <w:sz w:val="20"/>
+              </w:rPr>
+              <w:t>Núcleo de processamento, agendamento de leituras e controle de baixo consumo</w:t>
+            </w:r>
+          </w:p>
+        </w:tc>
+      </w:tr>
+      <w:tr>
+        <w:tc>
+          <w:tcPr>
+            <w:tcW w:type="dxa" w:w="2268"/>
+          </w:tcPr>
+          <w:p>
+            <w:pPr>
+              <w:spacing w:after="80"/>
+              <w:jc w:val="both"/>
+            </w:pPr>
+            <w:r/>
+            <w:r>
+              <w:rPr>
+                <w:rFonts w:ascii="Arial" w:hAnsi="Arial" w:cs="Arial"/>
+                <w:sz w:val="20"/>
+              </w:rPr>
+              <w:t>Conversor ADC externo</w:t>
+            </w:r>
+          </w:p>
+        </w:tc>
+        <w:tc>
+          <w:tcPr>
+            <w:tcW w:type="dxa" w:w="2268"/>
+          </w:tcPr>
+          <w:p>
+            <w:pPr>
+              <w:spacing w:after="80"/>
+              <w:jc w:val="both"/>
+            </w:pPr>
+            <w:r/>
+            <w:r>
+              <w:rPr>
+                <w:rFonts w:ascii="Arial" w:hAnsi="Arial" w:cs="Arial"/>
+                <w:sz w:val="20"/>
+              </w:rPr>
+              <w:t>ADS1115 de 16 bits, comunicação I2C, acoplado a resistor de shunt de precisão de 150 Ω (0,1%)</w:t>
+            </w:r>
+          </w:p>
+        </w:tc>
+        <w:tc>
+          <w:tcPr>
+            <w:tcW w:type="dxa" w:w="2268"/>
+          </w:tcPr>
+          <w:p>
+            <w:pPr>
+              <w:spacing w:after="80"/>
+              <w:jc w:val="both"/>
+            </w:pPr>
+            <w:r/>
+            <w:r>
+              <w:rPr>
+                <w:rFonts w:ascii="Arial" w:hAnsi="Arial" w:cs="Arial"/>
+                <w:sz w:val="20"/>
+              </w:rPr>
+              <w:t>01 un.</w:t>
+            </w:r>
+          </w:p>
+        </w:tc>
+        <w:tc>
+          <w:tcPr>
+            <w:tcW w:type="dxa" w:w="2268"/>
+          </w:tcPr>
+          <w:p>
+            <w:pPr>
+              <w:spacing w:after="80"/>
+              <w:jc w:val="both"/>
+            </w:pPr>
+            <w:r/>
+            <w:r>
+              <w:rPr>
+                <w:rFonts w:ascii="Arial" w:hAnsi="Arial" w:cs="Arial"/>
+                <w:sz w:val="20"/>
+              </w:rPr>
+              <w:t>Converter o sinal de corrente em tensão de alta resolução, entre 0,6 V e 3,0 V</w:t>
+            </w:r>
+          </w:p>
+        </w:tc>
+      </w:tr>
+      <w:tr>
+        <w:tc>
+          <w:tcPr>
+            <w:tcW w:type="dxa" w:w="2268"/>
+          </w:tcPr>
+          <w:p>
+            <w:pPr>
+              <w:spacing w:after="80"/>
+              <w:jc w:val="both"/>
+            </w:pPr>
+            <w:r/>
+            <w:r>
+              <w:rPr>
+                <w:rFonts w:ascii="Arial" w:hAnsi="Arial" w:cs="Arial"/>
+                <w:sz w:val="20"/>
+              </w:rPr>
+              <w:t>Módulo de conectividade</w:t>
+            </w:r>
+          </w:p>
+        </w:tc>
+        <w:tc>
+          <w:tcPr>
+            <w:tcW w:type="dxa" w:w="2268"/>
+          </w:tcPr>
+          <w:p>
+            <w:pPr>
+              <w:spacing w:after="80"/>
+              <w:jc w:val="both"/>
+            </w:pPr>
+            <w:r/>
+            <w:r>
+              <w:rPr>
+                <w:rFonts w:ascii="Arial" w:hAnsi="Arial" w:cs="Arial"/>
+                <w:sz w:val="20"/>
+              </w:rPr>
+              <w:t>Modem celular 4G SIM7600, com antena externa e função de SMS local</w:t>
+            </w:r>
+          </w:p>
+        </w:tc>
+        <w:tc>
+          <w:tcPr>
+            <w:tcW w:type="dxa" w:w="2268"/>
+          </w:tcPr>
+          <w:p>
+            <w:pPr>
+              <w:spacing w:after="80"/>
+              <w:jc w:val="both"/>
+            </w:pPr>
+            <w:r/>
+            <w:r>
+              <w:rPr>
+                <w:rFonts w:ascii="Arial" w:hAnsi="Arial" w:cs="Arial"/>
+                <w:sz w:val="20"/>
+              </w:rPr>
+              <w:t>01 un.</w:t>
+            </w:r>
+          </w:p>
+        </w:tc>
+        <w:tc>
+          <w:tcPr>
+            <w:tcW w:type="dxa" w:w="2268"/>
+          </w:tcPr>
+          <w:p>
+            <w:pPr>
+              <w:spacing w:after="80"/>
+              <w:jc w:val="both"/>
+            </w:pPr>
+            <w:r/>
+            <w:r>
+              <w:rPr>
+                <w:rFonts w:ascii="Arial" w:hAnsi="Arial" w:cs="Arial"/>
+                <w:sz w:val="20"/>
+              </w:rPr>
+              <w:t>Transmitir os dados para a nuvem e prover redundância de alerta via SMS</w:t>
+            </w:r>
+          </w:p>
+        </w:tc>
+      </w:tr>
+      <w:tr>
+        <w:tc>
+          <w:tcPr>
+            <w:tcW w:type="dxa" w:w="2268"/>
+          </w:tcPr>
+          <w:p>
+            <w:pPr>
+              <w:spacing w:after="80"/>
+              <w:jc w:val="both"/>
+            </w:pPr>
+            <w:r/>
+            <w:r>
+              <w:rPr>
+                <w:rFonts w:ascii="Arial" w:hAnsi="Arial" w:cs="Arial"/>
+                <w:sz w:val="20"/>
+              </w:rPr>
+              <w:t>Módulo RTC</w:t>
+            </w:r>
+          </w:p>
+        </w:tc>
+        <w:tc>
+          <w:tcPr>
+            <w:tcW w:type="dxa" w:w="2268"/>
+          </w:tcPr>
+          <w:p>
+            <w:pPr>
+              <w:spacing w:after="80"/>
+              <w:jc w:val="both"/>
+            </w:pPr>
+            <w:r/>
+            <w:r>
+              <w:rPr>
+                <w:rFonts w:ascii="Arial" w:hAnsi="Arial" w:cs="Arial"/>
+                <w:sz w:val="20"/>
+              </w:rPr>
+              <w:t>DS3231, comunicação I2C</w:t>
+            </w:r>
+          </w:p>
+        </w:tc>
+        <w:tc>
+          <w:tcPr>
+            <w:tcW w:type="dxa" w:w="2268"/>
+          </w:tcPr>
+          <w:p>
+            <w:pPr>
+              <w:spacing w:after="80"/>
+              <w:jc w:val="both"/>
+            </w:pPr>
+            <w:r/>
+            <w:r>
+              <w:rPr>
+                <w:rFonts w:ascii="Arial" w:hAnsi="Arial" w:cs="Arial"/>
+                <w:sz w:val="20"/>
+              </w:rPr>
+              <w:t>01 un.</w:t>
+            </w:r>
+          </w:p>
+        </w:tc>
+        <w:tc>
+          <w:tcPr>
+            <w:tcW w:type="dxa" w:w="2268"/>
+          </w:tcPr>
+          <w:p>
+            <w:pPr>
+              <w:spacing w:after="80"/>
+              <w:jc w:val="both"/>
+            </w:pPr>
+            <w:r/>
+            <w:r>
+              <w:rPr>
+                <w:rFonts w:ascii="Arial" w:hAnsi="Arial" w:cs="Arial"/>
+                <w:sz w:val="20"/>
+              </w:rPr>
+              <w:t>Controlar o despertar programado do microcontrolador no modo deep sleep</w:t>
+            </w:r>
+          </w:p>
+        </w:tc>
+      </w:tr>
+      <w:tr>
+        <w:tc>
+          <w:tcPr>
+            <w:tcW w:type="dxa" w:w="2268"/>
+          </w:tcPr>
+          <w:p>
+            <w:pPr>
+              <w:spacing w:after="80"/>
+              <w:jc w:val="both"/>
+            </w:pPr>
+            <w:r/>
+            <w:r>
+              <w:rPr>
+                <w:rFonts w:ascii="Arial" w:hAnsi="Arial" w:cs="Arial"/>
+                <w:sz w:val="20"/>
+              </w:rPr>
+              <w:t>Cartão de memória MicroSD</w:t>
+            </w:r>
+          </w:p>
+        </w:tc>
+        <w:tc>
+          <w:tcPr>
+            <w:tcW w:type="dxa" w:w="2268"/>
+          </w:tcPr>
+          <w:p>
+            <w:pPr>
+              <w:spacing w:after="80"/>
+              <w:jc w:val="both"/>
+            </w:pPr>
+            <w:r/>
+            <w:r>
+              <w:rPr>
+                <w:rFonts w:ascii="Arial" w:hAnsi="Arial" w:cs="Arial"/>
+                <w:sz w:val="20"/>
+              </w:rPr>
+              <w:t>Módulo leitor SPI com cartão MicroSD</w:t>
+            </w:r>
+          </w:p>
+        </w:tc>
+        <w:tc>
+          <w:tcPr>
+            <w:tcW w:type="dxa" w:w="2268"/>
+          </w:tcPr>
+          <w:p>
+            <w:pPr>
+              <w:spacing w:after="80"/>
+              <w:jc w:val="both"/>
+            </w:pPr>
+            <w:r/>
+            <w:r>
+              <w:rPr>
+                <w:rFonts w:ascii="Arial" w:hAnsi="Arial" w:cs="Arial"/>
+                <w:sz w:val="20"/>
+              </w:rPr>
+              <w:t>01 un.</w:t>
+            </w:r>
+          </w:p>
+        </w:tc>
+        <w:tc>
+          <w:tcPr>
+            <w:tcW w:type="dxa" w:w="2268"/>
+          </w:tcPr>
+          <w:p>
+            <w:pPr>
+              <w:spacing w:after="80"/>
+              <w:jc w:val="both"/>
+            </w:pPr>
+            <w:r/>
+            <w:r>
+              <w:rPr>
+                <w:rFonts w:ascii="Arial" w:hAnsi="Arial" w:cs="Arial"/>
+                <w:sz w:val="20"/>
+              </w:rPr>
+              <w:t>Registrar localmente as leituras com carimbo de tempo, como caixa preta do sistema</w:t>
+            </w:r>
+          </w:p>
+        </w:tc>
+      </w:tr>
+      <w:tr>
+        <w:tc>
+          <w:tcPr>
+            <w:tcW w:type="dxa" w:w="2268"/>
+          </w:tcPr>
+          <w:p>
+            <w:pPr>
+              <w:spacing w:after="80"/>
+              <w:jc w:val="both"/>
+            </w:pPr>
+            <w:r/>
+            <w:r>
+              <w:rPr>
+                <w:rFonts w:ascii="Arial" w:hAnsi="Arial" w:cs="Arial"/>
+                <w:sz w:val="20"/>
+              </w:rPr>
+              <w:t>Sistema fotovoltaico</w:t>
+            </w:r>
+          </w:p>
+        </w:tc>
+        <w:tc>
+          <w:tcPr>
+            <w:tcW w:type="dxa" w:w="2268"/>
+          </w:tcPr>
+          <w:p>
+            <w:pPr>
+              <w:spacing w:after="80"/>
+              <w:jc w:val="both"/>
+            </w:pPr>
+            <w:r/>
+            <w:r>
+              <w:rPr>
+                <w:rFonts w:ascii="Arial" w:hAnsi="Arial" w:cs="Arial"/>
+                <w:sz w:val="20"/>
+              </w:rPr>
+              <w:t>Painel solar de 20 W, controlador de carga PWM e bateria estacionária selada de 12 V 18 Ah</w:t>
+            </w:r>
+          </w:p>
+        </w:tc>
+        <w:tc>
+          <w:tcPr>
+            <w:tcW w:type="dxa" w:w="2268"/>
+          </w:tcPr>
+          <w:p>
+            <w:pPr>
+              <w:spacing w:after="80"/>
+              <w:jc w:val="both"/>
+            </w:pPr>
+            <w:r/>
+            <w:r>
+              <w:rPr>
+                <w:rFonts w:ascii="Arial" w:hAnsi="Arial" w:cs="Arial"/>
+                <w:sz w:val="20"/>
+              </w:rPr>
+              <w:t>01 kit</w:t>
+            </w:r>
+          </w:p>
+        </w:tc>
+        <w:tc>
+          <w:tcPr>
+            <w:tcW w:type="dxa" w:w="2268"/>
+          </w:tcPr>
+          <w:p>
+            <w:pPr>
+              <w:spacing w:after="80"/>
+              <w:jc w:val="both"/>
+            </w:pPr>
+            <w:r/>
+            <w:r>
+              <w:rPr>
+                <w:rFonts w:ascii="Arial" w:hAnsi="Arial" w:cs="Arial"/>
+                <w:sz w:val="20"/>
+              </w:rPr>
+              <w:t>Suprir eletricidade de forma autônoma em locais sem infraestrutura elétrica externa</w:t>
+            </w:r>
+          </w:p>
+        </w:tc>
+      </w:tr>
+      <w:tr>
+        <w:tc>
+          <w:tcPr>
+            <w:tcW w:type="dxa" w:w="2268"/>
+          </w:tcPr>
+          <w:p>
+            <w:pPr>
+              <w:spacing w:after="80"/>
+              <w:jc w:val="both"/>
+            </w:pPr>
+            <w:r/>
+            <w:r>
+              <w:rPr>
+                <w:rFonts w:ascii="Arial" w:hAnsi="Arial" w:cs="Arial"/>
+                <w:sz w:val="20"/>
+              </w:rPr>
+              <w:t>Gabinete de campo</w:t>
+            </w:r>
+          </w:p>
+        </w:tc>
+        <w:tc>
+          <w:tcPr>
+            <w:tcW w:type="dxa" w:w="2268"/>
+          </w:tcPr>
+          <w:p>
+            <w:pPr>
+              <w:spacing w:after="80"/>
+              <w:jc w:val="both"/>
+            </w:pPr>
+            <w:r/>
+            <w:r>
+              <w:rPr>
+                <w:rFonts w:ascii="Arial" w:hAnsi="Arial" w:cs="Arial"/>
+                <w:sz w:val="20"/>
+              </w:rPr>
+              <w:t>Grau de proteção IP66, com prensa cabos e proteção contra surtos</w:t>
+            </w:r>
+          </w:p>
+        </w:tc>
+        <w:tc>
+          <w:tcPr>
+            <w:tcW w:type="dxa" w:w="2268"/>
+          </w:tcPr>
+          <w:p>
+            <w:pPr>
+              <w:spacing w:after="80"/>
+              <w:jc w:val="both"/>
+            </w:pPr>
+            <w:r/>
+            <w:r>
+              <w:rPr>
+                <w:rFonts w:ascii="Arial" w:hAnsi="Arial" w:cs="Arial"/>
+                <w:sz w:val="20"/>
+              </w:rPr>
+              <w:t>01 un.</w:t>
+            </w:r>
+          </w:p>
+        </w:tc>
+        <w:tc>
+          <w:tcPr>
+            <w:tcW w:type="dxa" w:w="2268"/>
+          </w:tcPr>
+          <w:p>
+            <w:pPr>
+              <w:spacing w:after="80"/>
+              <w:jc w:val="both"/>
+            </w:pPr>
+            <w:r/>
+            <w:r>
+              <w:rPr>
+                <w:rFonts w:ascii="Arial" w:hAnsi="Arial" w:cs="Arial"/>
+                <w:sz w:val="20"/>
+              </w:rPr>
+              <w:t>Proteger a eletrônica das condições ambientais de instalação em campo</w:t>
+            </w:r>
+          </w:p>
+        </w:tc>
+      </w:tr>
+      <w:tr>
+        <w:tc>
+          <w:tcPr>
+            <w:tcW w:type="dxa" w:w="2268"/>
+          </w:tcPr>
+          <w:p>
+            <w:pPr>
+              <w:spacing w:after="80"/>
+              <w:jc w:val="both"/>
+            </w:pPr>
+            <w:r/>
+            <w:r>
+              <w:rPr>
+                <w:rFonts w:ascii="Arial" w:hAnsi="Arial" w:cs="Arial"/>
+                <w:sz w:val="20"/>
+              </w:rPr>
+              <w:t>Bancada de ensaios</w:t>
+            </w:r>
+          </w:p>
+        </w:tc>
+        <w:tc>
+          <w:tcPr>
+            <w:tcW w:type="dxa" w:w="2268"/>
+          </w:tcPr>
+          <w:p>
+            <w:pPr>
+              <w:spacing w:after="80"/>
+              <w:jc w:val="both"/>
+            </w:pPr>
+            <w:r/>
+            <w:r>
+              <w:rPr>
+                <w:rFonts w:ascii="Arial" w:hAnsi="Arial" w:cs="Arial"/>
+                <w:sz w:val="20"/>
+              </w:rPr>
+              <w:t>Tubulação vertical de PVC de 2 metros, conexões e válvula de drenagem</w:t>
+            </w:r>
+          </w:p>
+        </w:tc>
+        <w:tc>
+          <w:tcPr>
+            <w:tcW w:type="dxa" w:w="2268"/>
+          </w:tcPr>
+          <w:p>
+            <w:pPr>
+              <w:spacing w:after="80"/>
+              <w:jc w:val="both"/>
+            </w:pPr>
+            <w:r/>
+            <w:r>
+              <w:rPr>
+                <w:rFonts w:ascii="Arial" w:hAnsi="Arial" w:cs="Arial"/>
+                <w:sz w:val="20"/>
+              </w:rPr>
+              <w:t>01 kit</w:t>
+            </w:r>
+          </w:p>
+        </w:tc>
+        <w:tc>
+          <w:tcPr>
+            <w:tcW w:type="dxa" w:w="2268"/>
+          </w:tcPr>
+          <w:p>
+            <w:pPr>
+              <w:spacing w:after="80"/>
+              <w:jc w:val="both"/>
+            </w:pPr>
+            <w:r/>
+            <w:r>
+              <w:rPr>
+                <w:rFonts w:ascii="Arial" w:hAnsi="Arial" w:cs="Arial"/>
+                <w:sz w:val="20"/>
+              </w:rPr>
+              <w:t>Simular fisicamente as variações do nível de água para homologação do sistema</w:t>
+            </w:r>
+          </w:p>
+        </w:tc>
+      </w:tr>
+      <w:tr>
+        <w:tc>
+          <w:tcPr>
+            <w:tcW w:type="dxa" w:w="2268"/>
+          </w:tcPr>
+          <w:p>
+            <w:pPr>
+              <w:spacing w:after="80"/>
+              <w:jc w:val="both"/>
+            </w:pPr>
+            <w:r/>
+            <w:r>
+              <w:rPr>
+                <w:rFonts w:ascii="Arial" w:hAnsi="Arial" w:cs="Arial"/>
+                <w:b/>
+                <w:sz w:val="20"/>
+              </w:rPr>
+              <w:t>Custo total de componentes de referência: R$ 2.965,00 por unidade</w:t>
+            </w:r>
+          </w:p>
+        </w:tc>
+        <w:tc>
+          <w:tcPr>
+            <w:tcW w:type="dxa" w:w="2268"/>
+          </w:tcPr>
+          <w:p>
+            <w:pPr>
+              <w:spacing w:after="80"/>
+              <w:jc w:val="both"/>
+            </w:pPr>
+            <w:r/>
+          </w:p>
+        </w:tc>
+        <w:tc>
+          <w:tcPr>
+            <w:tcW w:type="dxa" w:w="2268"/>
+          </w:tcPr>
+          <w:p>
+            <w:pPr>
+              <w:spacing w:after="80"/>
+              <w:jc w:val="both"/>
+            </w:pPr>
+            <w:r/>
+          </w:p>
+        </w:tc>
+        <w:tc>
+          <w:tcPr>
+            <w:tcW w:type="dxa" w:w="2268"/>
+          </w:tcPr>
+          <w:p>
+            <w:pPr>
+              <w:spacing w:after="80"/>
+              <w:jc w:val="both"/>
+            </w:pPr>
+            <w:r/>
+          </w:p>
+        </w:tc>
+      </w:tr>
+    </w:tbl>
+    <w:p>
+      <w:pPr>
+        <w:spacing w:after="120"/>
+      </w:pPr>
+    </w:p>
+    <w:p>
+      <w:pPr>
+        <w:spacing w:lineRule="auto" w:line="360" w:after="120" w:before="120"/>
+        <w:ind w:firstLine="0"/>
+        <w:jc w:val="left"/>
+      </w:pPr>
+      <w:r>
+        <w:rPr>
+          <w:rFonts w:ascii="Arial" w:hAnsi="Arial" w:cs="Arial"/>
+          <w:b/>
+          <w:sz w:val="24"/>
+        </w:rPr>
+        <w:t>1.4.2 Bmg canvas</w:t>
+      </w:r>
+    </w:p>
+    <w:p>
+      <w:pPr>
+        <w:spacing w:lineRule="auto" w:line="360" w:after="120" w:before="0"/>
+        <w:ind w:firstLine="709"/>
+        <w:jc w:val="both"/>
+      </w:pPr>
+      <w:r>
+        <w:rPr>
+          <w:rFonts w:ascii="Arial" w:hAnsi="Arial" w:cs="Arial"/>
+          <w:sz w:val="24"/>
+        </w:rPr>
+        <w:t xml:space="preserve">Anexo II: BMG Canvas do projeto. </w:t>
+      </w:r>
       <w:r>
         <w:rPr>
           <w:rFonts w:ascii="Arial" w:hAnsi="Arial" w:cs="Arial"/>
@@ -3208,7 +3397,22 @@
           <w:color w:val="C00000"/>
           <w:sz w:val="24"/>
         </w:rPr>
-        <w:t>[PREENCHER conforme orientação do instrutor]</w:t>
+        <w:t>[PREENCHER: inserir imagem do BMG Canvas]</w:t>
+      </w:r>
+    </w:p>
+    <w:p>
+      <w:pPr>
+        <w:spacing w:lineRule="auto" w:line="360" w:after="120" w:before="120"/>
+        <w:ind w:firstLine="0"/>
+        <w:jc w:val="left"/>
+      </w:pPr>
+      <w:r>
+        <w:rPr>
+          <w:rFonts w:ascii="Arial" w:hAnsi="Arial" w:cs="Arial"/>
+          <w:b/>
+          <w:sz w:val="24"/>
+        </w:rPr>
+        <w:t>1.4.3 Situação de aprendizagem</w:t>
       </w:r>
     </w:p>
     <w:p>
@@ -3222,15 +3426,8 @@
           <w:rFonts w:ascii="Arial" w:hAnsi="Arial" w:cs="Arial"/>
           <w:sz w:val="24"/>
         </w:rPr>
-        <w:t>Costumam compor esta seção as competências mobilizadas ao longo do projeto (desenvolvimento de firmware embarcado em C++/Arduino, automação de processos, que vai do ciclo completo de medição, transmissão, decisão e alerta sem intervenção humana até a publicação automática do sistema a cada atualização do código, integração com APIs em nuvem via Cloudflare Workers, D1 e KV, desenvolvimento web front-end em HTML, CSS e JavaScript sem bundler, noções de instrumentação geotécnica e segurança de barragens, e trabalho em equipe com versionamento de código em git), o cronograma do projeto e o papel individual de cada aluno, coerente com a tabela da equipe na seção 1.1.</w:t>
+        <w:t xml:space="preserve">Anexo III: </w:t>
       </w:r>
-    </w:p>
-    <w:p>
-      <w:pPr>
-        <w:spacing w:lineRule="auto" w:line="360" w:after="120" w:before="0"/>
-        <w:ind w:firstLine="709"/>
-        <w:jc w:val="both"/>
-      </w:pPr>
       <w:r>
         <w:rPr>
           <w:rFonts w:ascii="Arial" w:hAnsi="Arial" w:cs="Arial"/>
@@ -3238,37 +3435,7 @@
           <w:color w:val="C00000"/>
           <w:sz w:val="24"/>
         </w:rPr>
-        <w:t>[PREENCHER: marcos do projeto, como pesquisa inicial, prototipagem no Wokwi, montagem da maquete física, desenvolvimento do backend e do dashboard, validação do sensor, redação do TCC e ensaios para a banca]</w:t>
-      </w:r>
-      <w:r>
-        <w:rPr>
-          <w:rFonts w:ascii="Arial" w:hAnsi="Arial" w:cs="Arial"/>
-          <w:sz w:val="24"/>
-        </w:rPr>
-        <w:t>.</w:t>
-      </w:r>
-    </w:p>
-    <w:p>
-      <w:pPr>
-        <w:spacing w:lineRule="auto" w:line="360" w:after="120" w:before="0"/>
-        <w:ind w:firstLine="709"/>
-        <w:jc w:val="both"/>
-      </w:pPr>
-      <w:r>
-        <w:rPr>
-          <w:rFonts w:ascii="Arial" w:hAnsi="Arial" w:cs="Arial"/>
-          <w:b/>
-          <w:color w:val="C00000"/>
-          <w:sz w:val="24"/>
-        </w:rPr>
-        <w:t>[PREENCHER: papel de cada aluno, detalhado por nome, coerente com a tabela da seção 1.1, por exemplo firmware, backend, dashboard, documentação ou pesquisa]</w:t>
-      </w:r>
-      <w:r>
-        <w:rPr>
-          <w:rFonts w:ascii="Arial" w:hAnsi="Arial" w:cs="Arial"/>
-          <w:sz w:val="24"/>
-        </w:rPr>
-        <w:t>.</w:t>
+        <w:t>[PREENCHER: Situação de Aprendizagem aplicada ao curso técnico]</w:t>
       </w:r>
     </w:p>
     <w:sectPr>

</xml_diff>

<commit_message>
TCC conforme o manual de preenchimento: codigo da unidade no titulo
Unica nao-conformidade encontrada no cruzamento com o manual
INTEGRA-MG: o titulo deve trazer o codigo da unidade entre
hashtags (#codigo# Titulo). Restaurado como [PREENCHER] destacado
no titulo e na capa. Objetivos (geral/especificos no infinitivo),
equipe, resultados com aprendizados e anexos ja conformes.

Co-Authored-By: Claude Fable 5 <noreply@anthropic.com>
Claude-Session: https://claude.ai/code/session_01RKkR7Ama1X95U16pZjmgTV
</commit_message>
<xml_diff>
--- a/docs/tcc/TCC_ENTREGA.docx
+++ b/docs/tcc/TCC_ENTREGA.docx
@@ -193,7 +193,7 @@
           <w:i w:val="0"/>
           <w:sz w:val="28"/>
         </w:rPr>
-        <w:t>AQUASENSE: SISTEMA DE TELEMETRIA E MONITORAMENTO GEOTÉCNICO REMOTO E CONTÍNUO PARA PIEZÔMETROS VIA IOT</w:t>
+        <w:t>#[PREENCHER: código da unidade]# AQUASENSE: SISTEMA DE TELEMETRIA E MONITORAMENTO GEOTÉCNICO REMOTO E CONTÍNUO PARA PIEZÔMETROS VIA IOT</w:t>
       </w:r>
     </w:p>
     <w:p>
@@ -414,7 +414,7 @@
           <w:i w:val="0"/>
           <w:sz w:val="28"/>
         </w:rPr>
-        <w:t>AQUASENSE: SISTEMA DE TELEMETRIA E MONITORAMENTO GEOTÉCNICO REMOTO E CONTÍNUO PARA PIEZÔMETROS VIA IOT</w:t>
+        <w:t>#[PREENCHER: código da unidade]# AQUASENSE: SISTEMA DE TELEMETRIA E MONITORAMENTO GEOTÉCNICO REMOTO E CONTÍNUO PARA PIEZÔMETROS VIA IOT</w:t>
       </w:r>
     </w:p>
     <w:p>
@@ -928,7 +928,7 @@
           <w:b/>
           <w:sz w:val="24"/>
         </w:rPr>
-        <w:t>AQUASENSE: SISTEMA DE TELEMETRIA E MONITORAMENTO GEOTÉCNICO REMOTO E CONTÍNUO PARA PIEZÔMETROS VIA IOT</w:t>
+        <w:t>#[PREENCHER: CÓDIGO DA UNIDADE]# AQUASENSE: SISTEMA DE TELEMETRIA E MONITORAMENTO GEOTÉCNICO REMOTO E CONTÍNUO PARA PIEZÔMETROS VIA IOT</w:t>
       </w:r>
     </w:p>
     <w:p>

</xml_diff>

<commit_message>
Reescreve a viabilidade economica do TCC em linguagem acessivel
Secao 1.3.6 reestruturada apos pesquisa de metodologia (SEBRAE/
EVTE): cada custo com a historia de como foi levantado (pesquisa
de precos em lojas nacionais com exemplos, hora tecnica, piso de
R$1.804 vs referencia R$2.965 explicada), reconstrucao dos
R$600 mil contada passo a passo (R$50 mil/mes -> R$58/leitura),
payback e ROI traduzidos em palavras (cada R$1 vira R$2,16 no
ano 1 e quase R$11 em 5 anos), pesquisa de mercado narrada e
jargao eliminado. Numeros oficiais preservados. Docx regenerado.

Co-Authored-By: Claude Fable 5 <noreply@anthropic.com>
Claude-Session: https://claude.ai/code/session_01RKkR7Ama1X95U16pZjmgTV
</commit_message>
<xml_diff>
--- a/docs/tcc/TCC_ENTREGA.docx
+++ b/docs/tcc/TCC_ENTREGA.docx
@@ -1864,7 +1864,638 @@
           <w:rFonts w:ascii="Arial" w:hAnsi="Arial" w:cs="Arial"/>
           <w:sz w:val="24"/>
         </w:rPr>
-        <w:t>A viabilidade econômica do AquaSense foi avaliada a partir da comparação entre o custo da rotina tradicional de leitura manual terceirizada e o custo estimado de implantação e operação da solução proposta, tomando como referência a demanda oficial que motivou o projeto.</w:t>
+        <w:t>Para saber se o AquaSense compensa financeiramente, comparamos o que a empresa gasta hoje com o método manual e o que passaria a gastar com o sistema automatizado, incluindo tanto a compra do equipamento quanto sua manutenção ao longo dos anos. O resultado dessa comparação é apresentado a seguir, junto com a explicação de como cada número foi obtido.</w:t>
+      </w:r>
+    </w:p>
+    <w:p>
+      <w:pPr>
+        <w:spacing w:lineRule="auto" w:line="360" w:after="120" w:before="0"/>
+        <w:ind w:firstLine="709"/>
+        <w:jc w:val="both"/>
+      </w:pPr>
+      <w:r>
+        <w:rPr>
+          <w:rFonts w:ascii="Arial" w:hAnsi="Arial" w:cs="Arial"/>
+          <w:b/>
+          <w:sz w:val="24"/>
+        </w:rPr>
+        <w:t>Como levantamos os custos</w:t>
+      </w:r>
+    </w:p>
+    <w:p>
+      <w:pPr>
+        <w:spacing w:lineRule="auto" w:line="360" w:after="120" w:before="0"/>
+        <w:ind w:firstLine="709"/>
+        <w:jc w:val="both"/>
+      </w:pPr>
+      <w:r>
+        <w:rPr>
+          <w:rFonts w:ascii="Arial" w:hAnsi="Arial" w:cs="Arial"/>
+          <w:sz w:val="24"/>
+        </w:rPr>
+        <w:t>Nenhum dos quatro integrantes da equipe tem formação em finanças, então tratamos este levantamento como uma pesquisa de campo: em vez de estimar os preços de memória, buscamos cada componente do sistema em lojas nacionais de eletrônica e em marketplaces, registrando o valor, a loja e a data da consulta (julho de 2026). O transdutor de pressão submersível, peça central do sistema, foi encontrado por R$ 239 na versão genérica de uso industrial; o módulo de comunicação celular 4G, por R$ 580 a R$ 760 dependendo do vendedor; o conjunto de energia solar, com painel, controlador de carga e bateria, por cerca de R$ 389; e o valor de hora de um técnico de campo para instalação, pesquisado em tabelas do setor elétrico, ficou entre R$ 150 e R$ 250. Essa pesquisa de varejo, feita componente por componente, somou R$ 1.804 por unidade, valor que serve de piso de referência: ele cobre a compra avulsa de cada peça, mas não inclui fabricação de placa própria, cabo industrial, conectores de painel nem frete e variação cambial de itens importados, custos que só aparecem quando o sistema é fabricado em série e não montado peça a peça no balcão da loja.</w:t>
+      </w:r>
+    </w:p>
+    <w:p>
+      <w:pPr>
+        <w:spacing w:lineRule="auto" w:line="360" w:after="120" w:before="0"/>
+        <w:ind w:firstLine="709"/>
+        <w:jc w:val="both"/>
+      </w:pPr>
+      <w:r>
+        <w:rPr>
+          <w:rFonts w:ascii="Arial" w:hAnsi="Arial" w:cs="Arial"/>
+          <w:b/>
+          <w:sz w:val="24"/>
+        </w:rPr>
+        <w:t>Quanto custa o AquaSense</w:t>
+      </w:r>
+    </w:p>
+    <w:p>
+      <w:pPr>
+        <w:spacing w:lineRule="auto" w:line="360" w:after="120" w:before="0"/>
+        <w:ind w:firstLine="709"/>
+        <w:jc w:val="both"/>
+      </w:pPr>
+      <w:r>
+        <w:rPr>
+          <w:rFonts w:ascii="Arial" w:hAnsi="Arial" w:cs="Arial"/>
+          <w:sz w:val="24"/>
+        </w:rPr>
+        <w:t>Por isso, o valor de referência usado no projeto para cada unidade é R$ 2.965, um número que acomoda, além dos componentes pesquisados, os itens de montagem industrial, o frete e a variação de câmbio que a pesquisa de varejo não alcança, mas que aparecem de fato quando cinquenta unidades são fabricadas e instaladas de uma vez. Multiplicando por cinquenta pontos de monitoramento, o hardware sozinho custa R$ 148.250. A esse valor somamos a instalação em campo, calculada com a hora técnica pesquisada (a mesma faixa de R$ 150 a R$ 250) considerando cerca de quatro a cinco horas de trabalho por ponto, entre deslocamento, fixação, calibração e teste; um estoque de peças sobressalentes equivalente a 10% do hardware, para reposição rápida sem esperar novo pedido de compra; uma bancada de homologação para testar e calibrar os equipamentos antes de irem a campo; e uma reserva de contingência para imprevistos de fabricação, câmbio e frete. A tabela abaixo mostra como esses valores se somam.</w:t>
+      </w:r>
+    </w:p>
+    <w:tbl>
+      <w:tblPr>
+        <w:tblStyle w:val="TableGrid"/>
+        <w:tblW w:type="auto" w:w="0"/>
+        <w:jc w:val="center"/>
+        <w:tblLook w:firstColumn="1" w:firstRow="1" w:lastColumn="0" w:lastRow="0" w:noHBand="0" w:noVBand="1" w:val="04A0"/>
+      </w:tblPr>
+      <w:tblGrid>
+        <w:gridCol w:w="3024"/>
+        <w:gridCol w:w="3024"/>
+        <w:gridCol w:w="3024"/>
+      </w:tblGrid>
+      <w:tr>
+        <w:tc>
+          <w:tcPr>
+            <w:tcW w:type="dxa" w:w="3024"/>
+          </w:tcPr>
+          <w:p>
+            <w:pPr>
+              <w:spacing w:after="80"/>
+              <w:jc w:val="both"/>
+            </w:pPr>
+            <w:r/>
+            <w:r>
+              <w:rPr>
+                <w:rFonts w:ascii="Arial" w:hAnsi="Arial" w:cs="Arial"/>
+                <w:b/>
+                <w:sz w:val="20"/>
+              </w:rPr>
+              <w:t>Item do investimento</w:t>
+            </w:r>
+          </w:p>
+        </w:tc>
+        <w:tc>
+          <w:tcPr>
+            <w:tcW w:type="dxa" w:w="3024"/>
+          </w:tcPr>
+          <w:p>
+            <w:pPr>
+              <w:spacing w:after="80"/>
+              <w:jc w:val="both"/>
+            </w:pPr>
+            <w:r/>
+            <w:r>
+              <w:rPr>
+                <w:rFonts w:ascii="Arial" w:hAnsi="Arial" w:cs="Arial"/>
+                <w:b/>
+                <w:sz w:val="20"/>
+              </w:rPr>
+              <w:t>Como foi calculado</w:t>
+            </w:r>
+          </w:p>
+        </w:tc>
+        <w:tc>
+          <w:tcPr>
+            <w:tcW w:type="dxa" w:w="3024"/>
+          </w:tcPr>
+          <w:p>
+            <w:pPr>
+              <w:spacing w:after="80"/>
+              <w:jc w:val="both"/>
+            </w:pPr>
+            <w:r/>
+            <w:r>
+              <w:rPr>
+                <w:rFonts w:ascii="Arial" w:hAnsi="Arial" w:cs="Arial"/>
+                <w:b/>
+                <w:sz w:val="20"/>
+              </w:rPr>
+              <w:t>Valor (R$)</w:t>
+            </w:r>
+          </w:p>
+        </w:tc>
+      </w:tr>
+      <w:tr>
+        <w:tc>
+          <w:tcPr>
+            <w:tcW w:type="dxa" w:w="3024"/>
+          </w:tcPr>
+          <w:p>
+            <w:pPr>
+              <w:spacing w:after="80"/>
+              <w:jc w:val="both"/>
+            </w:pPr>
+            <w:r/>
+            <w:r>
+              <w:rPr>
+                <w:rFonts w:ascii="Arial" w:hAnsi="Arial" w:cs="Arial"/>
+                <w:sz w:val="20"/>
+              </w:rPr>
+              <w:t>Hardware (50 unidades)</w:t>
+            </w:r>
+          </w:p>
+        </w:tc>
+        <w:tc>
+          <w:tcPr>
+            <w:tcW w:type="dxa" w:w="3024"/>
+          </w:tcPr>
+          <w:p>
+            <w:pPr>
+              <w:spacing w:after="80"/>
+              <w:jc w:val="both"/>
+            </w:pPr>
+            <w:r/>
+            <w:r>
+              <w:rPr>
+                <w:rFonts w:ascii="Arial" w:hAnsi="Arial" w:cs="Arial"/>
+                <w:sz w:val="20"/>
+              </w:rPr>
+              <w:t>50 × R$ 2.965 por unidade</w:t>
+            </w:r>
+          </w:p>
+        </w:tc>
+        <w:tc>
+          <w:tcPr>
+            <w:tcW w:type="dxa" w:w="3024"/>
+          </w:tcPr>
+          <w:p>
+            <w:pPr>
+              <w:spacing w:after="80"/>
+              <w:jc w:val="both"/>
+            </w:pPr>
+            <w:r/>
+            <w:r>
+              <w:rPr>
+                <w:rFonts w:ascii="Arial" w:hAnsi="Arial" w:cs="Arial"/>
+                <w:sz w:val="20"/>
+              </w:rPr>
+              <w:t>148.250</w:t>
+            </w:r>
+          </w:p>
+        </w:tc>
+      </w:tr>
+      <w:tr>
+        <w:tc>
+          <w:tcPr>
+            <w:tcW w:type="dxa" w:w="3024"/>
+          </w:tcPr>
+          <w:p>
+            <w:pPr>
+              <w:spacing w:after="80"/>
+              <w:jc w:val="both"/>
+            </w:pPr>
+            <w:r/>
+            <w:r>
+              <w:rPr>
+                <w:rFonts w:ascii="Arial" w:hAnsi="Arial" w:cs="Arial"/>
+                <w:sz w:val="20"/>
+              </w:rPr>
+              <w:t>Instalação e comissionamento em campo</w:t>
+            </w:r>
+          </w:p>
+        </w:tc>
+        <w:tc>
+          <w:tcPr>
+            <w:tcW w:type="dxa" w:w="3024"/>
+          </w:tcPr>
+          <w:p>
+            <w:pPr>
+              <w:spacing w:after="80"/>
+              <w:jc w:val="both"/>
+            </w:pPr>
+            <w:r/>
+            <w:r>
+              <w:rPr>
+                <w:rFonts w:ascii="Arial" w:hAnsi="Arial" w:cs="Arial"/>
+                <w:sz w:val="20"/>
+              </w:rPr>
+              <w:t>50 pontos × cerca de R$ 800, com base na hora técnica pesquisada</w:t>
+            </w:r>
+          </w:p>
+        </w:tc>
+        <w:tc>
+          <w:tcPr>
+            <w:tcW w:type="dxa" w:w="3024"/>
+          </w:tcPr>
+          <w:p>
+            <w:pPr>
+              <w:spacing w:after="80"/>
+              <w:jc w:val="both"/>
+            </w:pPr>
+            <w:r/>
+            <w:r>
+              <w:rPr>
+                <w:rFonts w:ascii="Arial" w:hAnsi="Arial" w:cs="Arial"/>
+                <w:sz w:val="20"/>
+              </w:rPr>
+              <w:t>40.000</w:t>
+            </w:r>
+          </w:p>
+        </w:tc>
+      </w:tr>
+      <w:tr>
+        <w:tc>
+          <w:tcPr>
+            <w:tcW w:type="dxa" w:w="3024"/>
+          </w:tcPr>
+          <w:p>
+            <w:pPr>
+              <w:spacing w:after="80"/>
+              <w:jc w:val="both"/>
+            </w:pPr>
+            <w:r/>
+            <w:r>
+              <w:rPr>
+                <w:rFonts w:ascii="Arial" w:hAnsi="Arial" w:cs="Arial"/>
+                <w:sz w:val="20"/>
+              </w:rPr>
+              <w:t>Peças sobressalentes</w:t>
+            </w:r>
+          </w:p>
+        </w:tc>
+        <w:tc>
+          <w:tcPr>
+            <w:tcW w:type="dxa" w:w="3024"/>
+          </w:tcPr>
+          <w:p>
+            <w:pPr>
+              <w:spacing w:after="80"/>
+              <w:jc w:val="both"/>
+            </w:pPr>
+            <w:r/>
+            <w:r>
+              <w:rPr>
+                <w:rFonts w:ascii="Arial" w:hAnsi="Arial" w:cs="Arial"/>
+                <w:sz w:val="20"/>
+              </w:rPr>
+              <w:t>10% do valor do hardware</w:t>
+            </w:r>
+          </w:p>
+        </w:tc>
+        <w:tc>
+          <w:tcPr>
+            <w:tcW w:type="dxa" w:w="3024"/>
+          </w:tcPr>
+          <w:p>
+            <w:pPr>
+              <w:spacing w:after="80"/>
+              <w:jc w:val="both"/>
+            </w:pPr>
+            <w:r/>
+            <w:r>
+              <w:rPr>
+                <w:rFonts w:ascii="Arial" w:hAnsi="Arial" w:cs="Arial"/>
+                <w:sz w:val="20"/>
+              </w:rPr>
+              <w:t>14.825</w:t>
+            </w:r>
+          </w:p>
+        </w:tc>
+      </w:tr>
+      <w:tr>
+        <w:tc>
+          <w:tcPr>
+            <w:tcW w:type="dxa" w:w="3024"/>
+          </w:tcPr>
+          <w:p>
+            <w:pPr>
+              <w:spacing w:after="80"/>
+              <w:jc w:val="both"/>
+            </w:pPr>
+            <w:r/>
+            <w:r>
+              <w:rPr>
+                <w:rFonts w:ascii="Arial" w:hAnsi="Arial" w:cs="Arial"/>
+                <w:sz w:val="20"/>
+              </w:rPr>
+              <w:t>Bancada de homologação</w:t>
+            </w:r>
+          </w:p>
+        </w:tc>
+        <w:tc>
+          <w:tcPr>
+            <w:tcW w:type="dxa" w:w="3024"/>
+          </w:tcPr>
+          <w:p>
+            <w:pPr>
+              <w:spacing w:after="80"/>
+              <w:jc w:val="both"/>
+            </w:pPr>
+            <w:r/>
+            <w:r>
+              <w:rPr>
+                <w:rFonts w:ascii="Arial" w:hAnsi="Arial" w:cs="Arial"/>
+                <w:sz w:val="20"/>
+              </w:rPr>
+              <w:t>Equipamento de teste e calibração, uso único no projeto</w:t>
+            </w:r>
+          </w:p>
+        </w:tc>
+        <w:tc>
+          <w:tcPr>
+            <w:tcW w:type="dxa" w:w="3024"/>
+          </w:tcPr>
+          <w:p>
+            <w:pPr>
+              <w:spacing w:after="80"/>
+              <w:jc w:val="both"/>
+            </w:pPr>
+            <w:r/>
+            <w:r>
+              <w:rPr>
+                <w:rFonts w:ascii="Arial" w:hAnsi="Arial" w:cs="Arial"/>
+                <w:sz w:val="20"/>
+              </w:rPr>
+              <w:t>25.000</w:t>
+            </w:r>
+          </w:p>
+        </w:tc>
+      </w:tr>
+      <w:tr>
+        <w:tc>
+          <w:tcPr>
+            <w:tcW w:type="dxa" w:w="3024"/>
+          </w:tcPr>
+          <w:p>
+            <w:pPr>
+              <w:spacing w:after="80"/>
+              <w:jc w:val="both"/>
+            </w:pPr>
+            <w:r/>
+            <w:r>
+              <w:rPr>
+                <w:rFonts w:ascii="Arial" w:hAnsi="Arial" w:cs="Arial"/>
+                <w:sz w:val="20"/>
+              </w:rPr>
+              <w:t>Reserva de contingência</w:t>
+            </w:r>
+          </w:p>
+        </w:tc>
+        <w:tc>
+          <w:tcPr>
+            <w:tcW w:type="dxa" w:w="3024"/>
+          </w:tcPr>
+          <w:p>
+            <w:pPr>
+              <w:spacing w:after="80"/>
+              <w:jc w:val="both"/>
+            </w:pPr>
+            <w:r/>
+            <w:r>
+              <w:rPr>
+                <w:rFonts w:ascii="Arial" w:hAnsi="Arial" w:cs="Arial"/>
+                <w:sz w:val="20"/>
+              </w:rPr>
+              <w:t>Imprevistos de fabricação, câmbio e frete</w:t>
+            </w:r>
+          </w:p>
+        </w:tc>
+        <w:tc>
+          <w:tcPr>
+            <w:tcW w:type="dxa" w:w="3024"/>
+          </w:tcPr>
+          <w:p>
+            <w:pPr>
+              <w:spacing w:after="80"/>
+              <w:jc w:val="both"/>
+            </w:pPr>
+            <w:r/>
+            <w:r>
+              <w:rPr>
+                <w:rFonts w:ascii="Arial" w:hAnsi="Arial" w:cs="Arial"/>
+                <w:sz w:val="20"/>
+              </w:rPr>
+              <w:t>31.925</w:t>
+            </w:r>
+          </w:p>
+        </w:tc>
+      </w:tr>
+      <w:tr>
+        <w:tc>
+          <w:tcPr>
+            <w:tcW w:type="dxa" w:w="3024"/>
+          </w:tcPr>
+          <w:p>
+            <w:pPr>
+              <w:spacing w:after="80"/>
+              <w:jc w:val="both"/>
+            </w:pPr>
+            <w:r/>
+            <w:r>
+              <w:rPr>
+                <w:rFonts w:ascii="Arial" w:hAnsi="Arial" w:cs="Arial"/>
+                <w:b/>
+                <w:sz w:val="20"/>
+              </w:rPr>
+              <w:t>Investimento total para 50 pontos</w:t>
+            </w:r>
+          </w:p>
+        </w:tc>
+        <w:tc>
+          <w:tcPr>
+            <w:tcW w:type="dxa" w:w="3024"/>
+          </w:tcPr>
+          <w:p>
+            <w:pPr>
+              <w:spacing w:after="80"/>
+              <w:jc w:val="both"/>
+            </w:pPr>
+            <w:r/>
+          </w:p>
+        </w:tc>
+        <w:tc>
+          <w:tcPr>
+            <w:tcW w:type="dxa" w:w="3024"/>
+          </w:tcPr>
+          <w:p>
+            <w:pPr>
+              <w:spacing w:after="80"/>
+              <w:jc w:val="both"/>
+            </w:pPr>
+            <w:r/>
+            <w:r>
+              <w:rPr>
+                <w:rFonts w:ascii="Arial" w:hAnsi="Arial" w:cs="Arial"/>
+                <w:b/>
+                <w:sz w:val="20"/>
+              </w:rPr>
+              <w:t>260.000</w:t>
+            </w:r>
+          </w:p>
+        </w:tc>
+      </w:tr>
+    </w:tbl>
+    <w:p>
+      <w:pPr>
+        <w:spacing w:after="120"/>
+      </w:pPr>
+    </w:p>
+    <w:p>
+      <w:pPr>
+        <w:spacing w:lineRule="auto" w:line="360" w:after="120" w:before="0"/>
+        <w:ind w:firstLine="709"/>
+        <w:jc w:val="both"/>
+      </w:pPr>
+      <w:r>
+        <w:rPr>
+          <w:rFonts w:ascii="Arial" w:hAnsi="Arial" w:cs="Arial"/>
+          <w:sz w:val="24"/>
+        </w:rPr>
+        <w:t>O investimento total de R$ 260.000 equivale a R$ 5.200 por ponto de monitoramento já instalado e funcionando, dos quais R$ 2.965 são o próprio equipamento e o restante cobre tudo o que é preciso para colocá-lo em operação segura no campo.</w:t>
+      </w:r>
+    </w:p>
+    <w:p>
+      <w:pPr>
+        <w:spacing w:lineRule="auto" w:line="360" w:after="120" w:before="0"/>
+        <w:ind w:firstLine="709"/>
+        <w:jc w:val="both"/>
+      </w:pPr>
+      <w:r>
+        <w:rPr>
+          <w:rFonts w:ascii="Arial" w:hAnsi="Arial" w:cs="Arial"/>
+          <w:b/>
+          <w:sz w:val="24"/>
+        </w:rPr>
+        <w:t>Quanto a empresa gasta hoje</w:t>
+      </w:r>
+    </w:p>
+    <w:p>
+      <w:pPr>
+        <w:spacing w:lineRule="auto" w:line="360" w:after="120" w:before="0"/>
+        <w:ind w:firstLine="709"/>
+        <w:jc w:val="both"/>
+      </w:pPr>
+      <w:r>
+        <w:rPr>
+          <w:rFonts w:ascii="Arial" w:hAnsi="Arial" w:cs="Arial"/>
+          <w:sz w:val="24"/>
+        </w:rPr>
+        <w:t>O edital que originou este projeto declara uma economia potencial de R$ 600 mil por ano com a substituição da leitura manual terceirizada. Não tivemos acesso à planilha interna da empresa que gerou esse número, então testamos se ele é coerente com a prática do mercado. Um contrato de leitura manual terceirizada custa, em faixas usuais do setor, algo em torno de R$ 50 mil por mês, valor que paga uma equipe de campo com técnicos, veículo, combustível, equipamentos de segurança, encargos trabalhistas e a elaboração de relatórios. Essa equipe consegue ler cerca de cem piezômetros duas vezes por semana. Dividindo o custo mensal pelo número de leituras realizadas no período, cada leitura individual sai por cerca de R$ 58, um valor plausível para um serviço técnico terceirizado de campo. Ou seja, o número de R$ 600 mil por ano declarado no edital é coerente com o que o mercado de fato cobra por esse tipo de serviço, e não uma cifra arbitrária.</w:t>
+      </w:r>
+    </w:p>
+    <w:p>
+      <w:pPr>
+        <w:spacing w:lineRule="auto" w:line="360" w:after="120" w:before="0"/>
+        <w:ind w:firstLine="709"/>
+        <w:jc w:val="both"/>
+      </w:pPr>
+      <w:r>
+        <w:rPr>
+          <w:rFonts w:ascii="Arial" w:hAnsi="Arial" w:cs="Arial"/>
+          <w:b/>
+          <w:sz w:val="24"/>
+        </w:rPr>
+        <w:t>Quanto passará a gastar</w:t>
+      </w:r>
+    </w:p>
+    <w:p>
+      <w:pPr>
+        <w:spacing w:lineRule="auto" w:line="360" w:after="120" w:before="0"/>
+        <w:ind w:firstLine="709"/>
+        <w:jc w:val="both"/>
+      </w:pPr>
+      <w:r>
+        <w:rPr>
+          <w:rFonts w:ascii="Arial" w:hAnsi="Arial" w:cs="Arial"/>
+          <w:sz w:val="24"/>
+        </w:rPr>
+        <w:t>Depois de instalado, o AquaSense ainda gera custo de manutenção, e ignorá-lo distorceria a comparação. Somamos a conectividade celular dos cinquenta pontos, o serviço de nuvem que recebe e processa os dados, a manutenção preventiva de peças e as inspeções físicas mensais de campo. O total é R$ 39.155 por ano, ou cerca de R$ 783 por ponto por ano. O maior item dessa conta é o chip 4G de cada ponto, calculado no cenário mais caro, com cada unidade operando de forma totalmente independente; existem duas rotas concretas para reduzir esse valor, uma pela contratação de um plano de dados sob medida para o baixo volume que o sistema realmente transmite, outra pela instalação de um único ponto de comunicação compartilhado entre os sensores próximos entre si, o que é o caso típico de uma barragem. Mesmo sem aplicar nenhuma dessas duas reduções, o custo de manutenção anual representa uma fração pequena diante da economia obtida, como mostra o cálculo a seguir.</w:t>
+      </w:r>
+    </w:p>
+    <w:p>
+      <w:pPr>
+        <w:spacing w:lineRule="auto" w:line="360" w:after="120" w:before="0"/>
+        <w:ind w:firstLine="709"/>
+        <w:jc w:val="both"/>
+      </w:pPr>
+      <w:r>
+        <w:rPr>
+          <w:rFonts w:ascii="Arial" w:hAnsi="Arial" w:cs="Arial"/>
+          <w:b/>
+          <w:sz w:val="24"/>
+        </w:rPr>
+        <w:t>O que a empresa ganha</w:t>
+      </w:r>
+    </w:p>
+    <w:p>
+      <w:pPr>
+        <w:spacing w:lineRule="auto" w:line="360" w:after="120" w:before="0"/>
+        <w:ind w:firstLine="709"/>
+        <w:jc w:val="both"/>
+      </w:pPr>
+      <w:r>
+        <w:rPr>
+          <w:rFonts w:ascii="Arial" w:hAnsi="Arial" w:cs="Arial"/>
+          <w:sz w:val="24"/>
+        </w:rPr>
+        <w:t>Comparando a economia bruta de R$ 600.000 por ano com o custo de manutenção de R$ 39.155, sobra uma economia líquida de R$ 560.845 por ano a partir do segundo ano de operação, uma redução de 93,5% do que a empresa gastava antes. No primeiro ano, é preciso descontar também o investimento inicial de R$ 260.000, o que ainda deixa uma economia líquida de R$ 300.845 já nos primeiros doze meses.</w:t>
+      </w:r>
+    </w:p>
+    <w:p>
+      <w:pPr>
+        <w:spacing w:lineRule="auto" w:line="360" w:after="120" w:before="0"/>
+        <w:ind w:firstLine="709"/>
+        <w:jc w:val="both"/>
+      </w:pPr>
+      <w:r>
+        <w:rPr>
+          <w:rFonts w:ascii="Arial" w:hAnsi="Arial" w:cs="Arial"/>
+          <w:sz w:val="24"/>
+        </w:rPr>
+        <w:t>Esse resultado permite calcular dois indicadores que costumam aparecer em qualquer análise desse tipo, e que explicamos aqui em palavras simples. O primeiro é o payback, o tempo que a economia gerada leva para pagar de volta o investimento feito. Dividindo o investimento de R$ 260.000 pela economia líquida mensal de aproximadamente R$ 46.737, chegamos a um payback de 5,6 meses: em pouco mais de meio ano de operação, o sistema já se pagou sozinho. O segundo indicador é o ROI, ou retorno sobre o investimento, que mostra quanto volta para o bolso da empresa para cada real investido. No primeiro ano, o ROI é de 116%, o que quer dizer que cada R$ 1,00 investido retorna R$ 2,16: o real investido de volta mais R$ 1,16 de ganho líquido, mesmo já contando o custo de manutenção do primeiro ano. Olhando cinco anos de operação, período em que o investimento inicial é pago uma única vez e só o custo de manutenção se repete, o retorno acumulado chega a 978%, ou seja, cada R$ 1,00 investido vira quase R$ 11,00.</w:t>
+      </w:r>
+    </w:p>
+    <w:p>
+      <w:pPr>
+        <w:spacing w:lineRule="auto" w:line="360" w:after="120" w:before="0"/>
+        <w:ind w:firstLine="709"/>
+        <w:jc w:val="both"/>
+      </w:pPr>
+      <w:r>
+        <w:rPr>
+          <w:rFonts w:ascii="Arial" w:hAnsi="Arial" w:cs="Arial"/>
+          <w:b/>
+          <w:sz w:val="24"/>
+        </w:rPr>
+        <w:t>O AquaSense diante do mercado</w:t>
+      </w:r>
+    </w:p>
+    <w:p>
+      <w:pPr>
+        <w:spacing w:lineRule="auto" w:line="360" w:after="120" w:before="0"/>
+        <w:ind w:firstLine="709"/>
+        <w:jc w:val="both"/>
+      </w:pPr>
+      <w:r>
+        <w:rPr>
+          <w:rFonts w:ascii="Arial" w:hAnsi="Arial" w:cs="Arial"/>
+          <w:sz w:val="24"/>
+        </w:rPr>
+        <w:t>Para situar esses números fora da nossa própria conta, buscamos os preços públicos dos oito principais fabricantes internacionais de telemetria geotécnica e constatamos que nenhum deles publica tabela de preço: todos exigem contato comercial direto para cotação. A única referência concreta que encontramos em toda a pesquisa foi um artigo técnico de congresso de 2007, que registrava um custo entre US$ 1.636 e US$ 2.370 por instrumento automatizado. Mesmo quase vinte anos depois e sem qualquer correção monetária, o custo de R$ 5.200 por ponto instalado do AquaSense já compete com aquela faixa histórica, o que confirma que o mercado tradicional de telemetria geotécnica opera hoje numa faixa de preço bem mais alta, reservada a barragens de Dano Potencial Associado alto. É justamente essa lacuna de preço que sustenta a proposta do AquaSense como alternativa viável para a camada de barragens, açudes e taludes que hoje não têm acesso a nenhuma automação.</w:t>
       </w:r>
     </w:p>
     <w:tbl>
@@ -1997,7 +2628,7 @@
                 <w:rFonts w:ascii="Arial" w:hAnsi="Arial" w:cs="Arial"/>
                 <w:sz w:val="20"/>
               </w:rPr>
-              <w:t>Custo elevado com contratação de equipes de medição, deslocamento de veículos e consumo de combustível</w:t>
+              <w:t>Equipes de medição, deslocamento de veículos e combustível</w:t>
             </w:r>
           </w:p>
         </w:tc>
@@ -2016,7 +2647,7 @@
                 <w:rFonts w:ascii="Arial" w:hAnsi="Arial" w:cs="Arial"/>
                 <w:sz w:val="20"/>
               </w:rPr>
-              <w:t>Custo concentrado em manutenções preventivas esporádicas planejadas</w:t>
+              <w:t>Manutenção, nuvem e inspeções planejadas</w:t>
             </w:r>
           </w:p>
         </w:tc>
@@ -2035,7 +2666,7 @@
                 <w:rFonts w:ascii="Arial" w:hAnsi="Arial" w:cs="Arial"/>
                 <w:sz w:val="20"/>
               </w:rPr>
-              <w:t>Economia estimada de R$ 600.000,00 por ano em escala operacional</w:t>
+              <w:t>Economia de R$ 560.845 por ano a partir do segundo ano</w:t>
             </w:r>
           </w:p>
         </w:tc>
@@ -2075,7 +2706,7 @@
                 <w:rFonts w:ascii="Arial" w:hAnsi="Arial" w:cs="Arial"/>
                 <w:sz w:val="20"/>
               </w:rPr>
-              <w:t>Baixa frequência, com leitura semanal ou mensal por piezômetro</w:t>
+              <w:t>Leitura semanal ou quinzenal por piezômetro</w:t>
             </w:r>
           </w:p>
         </w:tc>
@@ -2094,7 +2725,7 @@
                 <w:rFonts w:ascii="Arial" w:hAnsi="Arial" w:cs="Arial"/>
                 <w:sz w:val="20"/>
               </w:rPr>
-              <w:t>Alta resolução de monitoramento, com leituras contínuas ao longo do dia</w:t>
+              <w:t>Leituras contínuas ao longo do dia</w:t>
             </w:r>
           </w:p>
         </w:tc>
@@ -2113,7 +2744,7 @@
                 <w:rFonts w:ascii="Arial" w:hAnsi="Arial" w:cs="Arial"/>
                 <w:sz w:val="20"/>
               </w:rPr>
-              <w:t>Detecção ágil de transientes de pressão hidráulica e infiltração rápida</w:t>
+              <w:t>Detecção ágil de transientes de pressão e infiltração</w:t>
             </w:r>
           </w:p>
         </w:tc>
@@ -2172,7 +2803,7 @@
                 <w:rFonts w:ascii="Arial" w:hAnsi="Arial" w:cs="Arial"/>
                 <w:sz w:val="20"/>
               </w:rPr>
-              <w:t>Exposição mínima, restrita a visitas programadas de manutenção preventiva</w:t>
+              <w:t>Exposição mínima, restrita a visitas programadas</w:t>
             </w:r>
           </w:p>
         </w:tc>
@@ -2191,7 +2822,7 @@
                 <w:rFonts w:ascii="Arial" w:hAnsi="Arial" w:cs="Arial"/>
                 <w:sz w:val="20"/>
               </w:rPr>
-              <w:t>Redução direta do risco operacional das equipes de campo</w:t>
+              <w:t>Redução direta do risco às equipes de campo</w:t>
             </w:r>
           </w:p>
         </w:tc>
@@ -2212,7 +2843,7 @@
                 <w:rFonts w:ascii="Arial" w:hAnsi="Arial" w:cs="Arial"/>
                 <w:sz w:val="20"/>
               </w:rPr>
-              <w:t>Custo por ponto de monitoramento</w:t>
+              <w:t>Investimento</w:t>
             </w:r>
           </w:p>
         </w:tc>
@@ -2231,7 +2862,7 @@
                 <w:rFonts w:ascii="Arial" w:hAnsi="Arial" w:cs="Arial"/>
                 <w:sz w:val="20"/>
               </w:rPr>
-              <w:t>Custo recorrente sem geração de ativo permanente</w:t>
+              <w:t>Gasto recorrente sem gerar ativo permanente</w:t>
             </w:r>
           </w:p>
         </w:tc>
@@ -2250,7 +2881,7 @@
                 <w:rFonts w:ascii="Arial" w:hAnsi="Arial" w:cs="Arial"/>
                 <w:sz w:val="20"/>
               </w:rPr>
-              <w:t>Investimento estimado de aproximadamente R$ 2.965,00 por ponto de monitoramento</w:t>
+              <w:t>R$ 260.000 para 50 pontos instalados</w:t>
             </w:r>
           </w:p>
         </w:tc>
@@ -2269,7 +2900,7 @@
                 <w:rFonts w:ascii="Arial" w:hAnsi="Arial" w:cs="Arial"/>
                 <w:sz w:val="20"/>
               </w:rPr>
-              <w:t>Investimento estimado de R$ 260.000,00 para uma primeira série de 50 pontos</w:t>
+              <w:t>R$ 5.200 por ponto, pago uma única vez</w:t>
             </w:r>
           </w:p>
         </w:tc>
@@ -2290,7 +2921,7 @@
                 <w:rFonts w:ascii="Arial" w:hAnsi="Arial" w:cs="Arial"/>
                 <w:sz w:val="20"/>
               </w:rPr>
-              <w:t>Tempo de retorno</w:t>
+              <w:t>Retorno</w:t>
             </w:r>
           </w:p>
         </w:tc>
@@ -2309,7 +2940,7 @@
                 <w:rFonts w:ascii="Arial" w:hAnsi="Arial" w:cs="Arial"/>
                 <w:sz w:val="20"/>
               </w:rPr>
-              <w:t>Gasto constante sem possibilidade de retorno de capital</w:t>
+              <w:t>Gasto constante sem retorno de capital</w:t>
             </w:r>
           </w:p>
         </w:tc>
@@ -2328,7 +2959,7 @@
                 <w:rFonts w:ascii="Arial" w:hAnsi="Arial" w:cs="Arial"/>
                 <w:sz w:val="20"/>
               </w:rPr>
-              <w:t>Investimento com retorno mensurável frente à economia operacional obtida</w:t>
+              <w:t>Payback de 5,6 meses; ROI de 116% no ano 1 e 978% em 5 anos</w:t>
             </w:r>
           </w:p>
         </w:tc>
@@ -2347,7 +2978,7 @@
                 <w:rFonts w:ascii="Arial" w:hAnsi="Arial" w:cs="Arial"/>
                 <w:sz w:val="20"/>
               </w:rPr>
-              <w:t>Payback estimado em cerca de 6 meses</w:t>
+              <w:t>Cada R$ 1,00 investido retorna quase R$ 11,00 em 5 anos</w:t>
             </w:r>
           </w:p>
         </w:tc>
@@ -2357,48 +2988,6 @@
       <w:pPr>
         <w:spacing w:after="120"/>
       </w:pPr>
-    </w:p>
-    <w:p>
-      <w:pPr>
-        <w:spacing w:lineRule="auto" w:line="360" w:after="120" w:before="0"/>
-        <w:ind w:firstLine="709"/>
-        <w:jc w:val="both"/>
-      </w:pPr>
-      <w:r>
-        <w:rPr>
-          <w:rFonts w:ascii="Arial" w:hAnsi="Arial" w:cs="Arial"/>
-          <w:sz w:val="24"/>
-        </w:rPr>
-        <w:t>O valor de R$ 2.965 corresponde ao hardware de cada unidade; o investimento total de R$ 260.000,00 para a primeira série de 50 pontos inclui, além do hardware (R$ 148.250,00), a instalação e o comissionamento em campo (R$ 40.000,00), sobressalentes (R$ 14.825,00), a bancada de homologação (R$ 25.000,00) e a contingência de projeto (R$ 31.925,00), resultando em R$ 5.200,00 por ponto instalado.</w:t>
-      </w:r>
-    </w:p>
-    <w:p>
-      <w:pPr>
-        <w:spacing w:lineRule="auto" w:line="360" w:after="120" w:before="0"/>
-        <w:ind w:firstLine="709"/>
-        <w:jc w:val="both"/>
-      </w:pPr>
-      <w:r>
-        <w:rPr>
-          <w:rFonts w:ascii="Arial" w:hAnsi="Arial" w:cs="Arial"/>
-          <w:sz w:val="24"/>
-        </w:rPr>
-        <w:t>O custo operacional anual estimado do sistema é de R$ 39.155,00, cobrindo a conectividade celular dos 50 pontos, a nuvem, a manutenção e as inspeções mensais de campo, o que representa uma redução de 93,5% sobre os R$ 600 mil/ano da situação tradicional, com payback estimado em 5,6 meses, ROI de 116% já no primeiro ano de operação e de 978% acumulado ao longo de cinco anos. O item de conectividade celular tem rotas concretas de redução de custo, como planos IoT de menor preço por chip e o uso de um gateway LoRaWAN compartilhado entre os pontos mais próximos.</w:t>
-      </w:r>
-    </w:p>
-    <w:p>
-      <w:pPr>
-        <w:spacing w:lineRule="auto" w:line="360" w:after="120" w:before="0"/>
-        <w:ind w:firstLine="709"/>
-        <w:jc w:val="both"/>
-      </w:pPr>
-      <w:r>
-        <w:rPr>
-          <w:rFonts w:ascii="Arial" w:hAnsi="Arial" w:cs="Arial"/>
-          <w:sz w:val="24"/>
-        </w:rPr>
-        <w:t>Mesmo em uma comparação conservadora, o investimento estimado por ponto de monitoramento permanece uma ordem de grandeza abaixo dos pacotes comerciais completos de instrumentação e telemetria voltados a barragens de Dano Potencial Associado alto, cujos preços são tipicamente informados apenas sob consulta. Essa diferença sustenta a proposta de valor do AquaSense como alternativa economicamente viável para a camada de estruturas geotécnicas que hoje não têm acesso a nenhuma automação.</w:t>
-      </w:r>
     </w:p>
     <w:p>
       <w:pPr>

</xml_diff>

<commit_message>
Adiciona secao REFERENCIAS ao TCC (47 fontes em formato ABNT)
Compila todas as fontes que sustentam o documento: legislacao
(PNSB, Lei 14.066, Resolucao ANM 95/2022), dados oficiais ANA/
SNISB, normas tecnicas (ISA-18.2, NAMUR NE43), os oito fabricantes
da pesquisa de mercado, o artigo IBRACON 2007, as lojas da
pesquisa de precos com data de acesso e o edital SAGA. Ordem
alfabetica, NBR 6023; referencias renderizadas no docx sem recuo
e com espacamento simples (padrao ABNT). Sumario atualizado.

Co-Authored-By: Claude Fable 5 <noreply@anthropic.com>
Claude-Session: https://claude.ai/code/session_01RKkR7Ama1X95U16pZjmgTV
</commit_message>
<xml_diff>
--- a/docs/tcc/TCC_ENTREGA.docx
+++ b/docs/tcc/TCC_ENTREGA.docx
@@ -884,6 +884,20 @@
           <w:sz w:val="24"/>
         </w:rPr>
         <w:t>1.4.3 Situação de Aprendizagem</w:t>
+      </w:r>
+    </w:p>
+    <w:p>
+      <w:pPr>
+        <w:spacing w:lineRule="auto" w:line="360" w:after="80"/>
+        <w:ind w:firstLine="0"/>
+        <w:jc w:val="left"/>
+      </w:pPr>
+      <w:r>
+        <w:rPr>
+          <w:rFonts w:ascii="Arial" w:hAnsi="Arial" w:cs="Arial"/>
+          <w:sz w:val="24"/>
+        </w:rPr>
+        <w:t>REFERÊNCIAS</w:t>
       </w:r>
     </w:p>
     <w:p>
@@ -4027,6 +4041,679 @@
         <w:t>[PREENCHER: Situação de Aprendizagem aplicada ao curso técnico]</w:t>
       </w:r>
     </w:p>
+    <w:p>
+      <w:pPr>
+        <w:spacing w:lineRule="auto" w:line="360" w:after="120" w:before="240"/>
+        <w:ind w:firstLine="0"/>
+        <w:jc w:val="left"/>
+      </w:pPr>
+      <w:r>
+        <w:rPr>
+          <w:rFonts w:ascii="Arial" w:hAnsi="Arial" w:cs="Arial"/>
+          <w:b/>
+          <w:sz w:val="24"/>
+        </w:rPr>
+        <w:t>REFERÊNCIAS</w:t>
+      </w:r>
+    </w:p>
+    <w:p>
+      <w:pPr>
+        <w:spacing w:line="240" w:lineRule="auto" w:after="240" w:before="0"/>
+        <w:ind w:firstLine="0" w:left="0"/>
+        <w:jc w:val="left"/>
+      </w:pPr>
+      <w:r>
+        <w:rPr>
+          <w:rFonts w:ascii="Arial" w:hAnsi="Arial" w:cs="Arial"/>
+          <w:sz w:val="24"/>
+        </w:rPr>
+        <w:t>ACKCIO. Wireless Monitoring Solutions For Mining. [S. l.], [20--]. Disponível em: &lt;https://www.ackcio.com/industries/mining/&gt;. Acesso em: 13 jul. 2026.</w:t>
+      </w:r>
+    </w:p>
+    <w:p>
+      <w:pPr>
+        <w:spacing w:line="240" w:lineRule="auto" w:after="240" w:before="0"/>
+        <w:ind w:firstLine="0" w:left="0"/>
+        <w:jc w:val="left"/>
+      </w:pPr>
+      <w:r>
+        <w:rPr>
+          <w:rFonts w:ascii="Arial" w:hAnsi="Arial" w:cs="Arial"/>
+          <w:sz w:val="24"/>
+        </w:rPr>
+        <w:t>AGÊNCIA NACIONAL DE ÁGUAS E SANEAMENTO BÁSICO (ANA). Manual de Segurança de Pequenas Barragens. Brasília, DF: ANA, [20--]. Disponível em: &lt;https://www.snirh.gov.br/portal/snisb/Entenda_Mais/publicacoes/ArquivosPNSB_Docs_Estruturantes/produto-10-manual-de-seguranca-de-pequenas-barragens.pdf&gt;. Acesso em: 14 jul. 2026.</w:t>
+      </w:r>
+    </w:p>
+    <w:p>
+      <w:pPr>
+        <w:spacing w:line="240" w:lineRule="auto" w:after="240" w:before="0"/>
+        <w:ind w:firstLine="0" w:left="0"/>
+        <w:jc w:val="left"/>
+      </w:pPr>
+      <w:r>
+        <w:rPr>
+          <w:rFonts w:ascii="Arial" w:hAnsi="Arial" w:cs="Arial"/>
+          <w:sz w:val="24"/>
+        </w:rPr>
+        <w:t>AGÊNCIA NACIONAL DE ÁGUAS E SANEAMENTO BÁSICO (ANA). RSB 2024/2025 indica 241 barragens prioritárias que necessitam de maior atenção em termos de segurança em 23 estados e no Distrito Federal. Brasília, DF, 2025. Disponível em: &lt;https://www.gov.br/ana/pt-br/assuntos/noticias-e-eventos/noticias/rsb-2024-2025-indica-241-barragens-prioritarias-que-necessitam-de-maior-atencao-em-termos-de-seguranca-em-23-estados-e-no-distrito-federal&gt;. Acesso em: 14 jul. 2026.</w:t>
+      </w:r>
+    </w:p>
+    <w:p>
+      <w:pPr>
+        <w:spacing w:line="240" w:lineRule="auto" w:after="240" w:before="0"/>
+        <w:ind w:firstLine="0" w:left="0"/>
+        <w:jc w:val="left"/>
+      </w:pPr>
+      <w:r>
+        <w:rPr>
+          <w:rFonts w:ascii="Arial" w:hAnsi="Arial" w:cs="Arial"/>
+          <w:sz w:val="24"/>
+        </w:rPr>
+        <w:t>AGÊNCIA NACIONAL DE MINERAÇÃO (ANM). Resolução ANM nº 95, de 7 de fevereiro de 2022. Consolida os atos normativos de segurança de barragens de mineração. Brasília, DF: ANM, 2022. Disponível em: &lt;https://www.gov.br/anm/pt-br/assuntos/barragens/legislacao/resolucao-no-95-2022.pdf&gt;. Acesso em: 14 jul. 2026.</w:t>
+      </w:r>
+    </w:p>
+    <w:p>
+      <w:pPr>
+        <w:spacing w:line="240" w:lineRule="auto" w:after="240" w:before="0"/>
+        <w:ind w:firstLine="0" w:left="0"/>
+        <w:jc w:val="left"/>
+      </w:pPr>
+      <w:r>
+        <w:rPr>
+          <w:rFonts w:ascii="Arial" w:hAnsi="Arial" w:cs="Arial"/>
+          <w:sz w:val="24"/>
+        </w:rPr>
+        <w:t>AMAZON.COM.BR. Sim7600G-H 4G HAT: comunicação e posicionamento para Raspberry Pi. [S. l.], 2026. Disponível em: &lt;https://www.amazon.com.br/Sim7600G-H-4G-Pi-Comunica%C3%A7%C3%A3o-Posicionamento/dp/B08ZY2FV22&gt;. Acesso em: 14 jul. 2026.</w:t>
+      </w:r>
+    </w:p>
+    <w:p>
+      <w:pPr>
+        <w:spacing w:line="240" w:lineRule="auto" w:after="240" w:before="0"/>
+        <w:ind w:firstLine="0" w:left="0"/>
+        <w:jc w:val="left"/>
+      </w:pPr>
+      <w:r>
+        <w:rPr>
+          <w:rFonts w:ascii="Arial" w:hAnsi="Arial" w:cs="Arial"/>
+          <w:sz w:val="24"/>
+        </w:rPr>
+        <w:t>AMERICANAS. Micro SD Card 16GB Class 10. [S. l.], 2026. Disponível em: &lt;https://www.americanas.com.br/busca/micro-sd-card-16gb-class-10&gt;. Acesso em: 14 jul. 2026.</w:t>
+      </w:r>
+    </w:p>
+    <w:p>
+      <w:pPr>
+        <w:spacing w:line="240" w:lineRule="auto" w:after="240" w:before="0"/>
+        <w:ind w:firstLine="0" w:left="0"/>
+        <w:jc w:val="left"/>
+      </w:pPr>
+      <w:r>
+        <w:rPr>
+          <w:rFonts w:ascii="Arial" w:hAnsi="Arial" w:cs="Arial"/>
+          <w:sz w:val="24"/>
+        </w:rPr>
+        <w:t>ARQIA. Plano Pré-Pago M2M. [S. l.], 2026. Disponível em: &lt;https://marketplaceiot.arqia.com.br/loja/arqiamob/produto/M2M60-10MB/plano-pre-pago-m2m&gt;. Acesso em: 14 jul. 2026.</w:t>
+      </w:r>
+    </w:p>
+    <w:p>
+      <w:pPr>
+        <w:spacing w:line="240" w:lineRule="auto" w:after="240" w:before="0"/>
+        <w:ind w:firstLine="0" w:left="0"/>
+        <w:jc w:val="left"/>
+      </w:pPr>
+      <w:r>
+        <w:rPr>
+          <w:rFonts w:ascii="Arial" w:hAnsi="Arial" w:cs="Arial"/>
+          <w:sz w:val="24"/>
+        </w:rPr>
+        <w:t>BAÚ DA ELETRÔNICA. Conversor Analógico/Digital I2C 16 bits ADS1115. [S. l.], 2026. Disponível em: &lt;https://www.baudaeletronica.com.br/produto/conversor-analogicodigital-i2c-16-bits-ads1115.html&gt;. Acesso em: 14 jul. 2026.</w:t>
+      </w:r>
+    </w:p>
+    <w:p>
+      <w:pPr>
+        <w:spacing w:line="240" w:lineRule="auto" w:after="240" w:before="0"/>
+        <w:ind w:firstLine="0" w:left="0"/>
+        <w:jc w:val="left"/>
+      </w:pPr>
+      <w:r>
+        <w:rPr>
+          <w:rFonts w:ascii="Arial" w:hAnsi="Arial" w:cs="Arial"/>
+          <w:sz w:val="24"/>
+        </w:rPr>
+        <w:t>BRASIL. Lei nº 12.334, de 20 de setembro de 2010. Estabelece a Política Nacional de Segurança de Barragens destinadas à acumulação de água para quaisquer usos, à disposição final ou temporária de rejeitos e à acumulação de resíduos industriais. Diário Oficial da União, Brasília, DF, 2010.</w:t>
+      </w:r>
+    </w:p>
+    <w:p>
+      <w:pPr>
+        <w:spacing w:line="240" w:lineRule="auto" w:after="240" w:before="0"/>
+        <w:ind w:firstLine="0" w:left="0"/>
+        <w:jc w:val="left"/>
+      </w:pPr>
+      <w:r>
+        <w:rPr>
+          <w:rFonts w:ascii="Arial" w:hAnsi="Arial" w:cs="Arial"/>
+          <w:sz w:val="24"/>
+        </w:rPr>
+        <w:t>BRASIL. Lei nº 14.066, de 30 de setembro de 2020. Altera a Lei nº 9.984, de 17 de julho de 2000, a Lei nº 12.334, de 20 de setembro de 2010, [...] para dispor sobre a Política Nacional de Segurança de Barragens. Diário Oficial da União, Brasília, DF, 2020. Disponível em: &lt;http://www.planalto.gov.br/ccivil_03/_ato2019-2022/2020/lei/l14066.htm&gt;. Acesso em: 14 jul. 2026.</w:t>
+      </w:r>
+    </w:p>
+    <w:p>
+      <w:pPr>
+        <w:spacing w:line="240" w:lineRule="auto" w:after="240" w:before="0"/>
+        <w:ind w:firstLine="0" w:left="0"/>
+        <w:jc w:val="left"/>
+      </w:pPr>
+      <w:r>
+        <w:rPr>
+          <w:rFonts w:ascii="Arial" w:hAnsi="Arial" w:cs="Arial"/>
+          <w:sz w:val="24"/>
+        </w:rPr>
+        <w:t>BRASPOWER. Bateria Selada 12V 18Ah Moura VRLA/AGM. [S. l.], 2026. Disponível em: &lt;https://www.braspower.com.br/bateria-selada-12v-18ah-moura-vrla-agm&gt;. Acesso em: 14 jul. 2026.</w:t>
+      </w:r>
+    </w:p>
+    <w:p>
+      <w:pPr>
+        <w:spacing w:line="240" w:lineRule="auto" w:after="240" w:before="0"/>
+        <w:ind w:firstLine="0" w:left="0"/>
+        <w:jc w:val="left"/>
+      </w:pPr>
+      <w:r>
+        <w:rPr>
+          <w:rFonts w:ascii="Arial" w:hAnsi="Arial" w:cs="Arial"/>
+          <w:sz w:val="24"/>
+        </w:rPr>
+        <w:t>CANARY SYSTEMS. MLSAA: Measurand ShapeArray Automation. [S. l.], [20--]. Disponível em: &lt;https://canarysystems.com/products/hardware/mlsaa/&gt;. Acesso em: 13 jul. 2026.</w:t>
+      </w:r>
+    </w:p>
+    <w:p>
+      <w:pPr>
+        <w:spacing w:line="240" w:lineRule="auto" w:after="240" w:before="0"/>
+        <w:ind w:firstLine="0" w:left="0"/>
+        <w:jc w:val="left"/>
+      </w:pPr>
+      <w:r>
+        <w:rPr>
+          <w:rFonts w:ascii="Arial" w:hAnsi="Arial" w:cs="Arial"/>
+          <w:sz w:val="24"/>
+        </w:rPr>
+        <w:t>CLARO EMPRESAS. Planos M2M. [S. l.], 2026. Disponível em: &lt;https://www.claro.com.br/empresas/m2m&gt;. Acesso em: 14 jul. 2026.</w:t>
+      </w:r>
+    </w:p>
+    <w:p>
+      <w:pPr>
+        <w:spacing w:line="240" w:lineRule="auto" w:after="240" w:before="0"/>
+        <w:ind w:firstLine="0" w:left="0"/>
+        <w:jc w:val="left"/>
+      </w:pPr>
+      <w:r>
+        <w:rPr>
+          <w:rFonts w:ascii="Arial" w:hAnsi="Arial" w:cs="Arial"/>
+          <w:sz w:val="24"/>
+        </w:rPr>
+        <w:t>CURTO CIRCUITO. Conversor Analógico/Digital I2C 16 bits ADS1115. [S. l.], 2026. Disponível em: &lt;https://curtocircuito.com.br/conversor-analogico-digital-i2c-16-bits-ads1115.html&gt;. Acesso em: 14 jul. 2026.</w:t>
+      </w:r>
+    </w:p>
+    <w:p>
+      <w:pPr>
+        <w:spacing w:line="240" w:lineRule="auto" w:after="240" w:before="0"/>
+        <w:ind w:firstLine="0" w:left="0"/>
+        <w:jc w:val="left"/>
+      </w:pPr>
+      <w:r>
+        <w:rPr>
+          <w:rFonts w:ascii="Arial" w:hAnsi="Arial" w:cs="Arial"/>
+          <w:sz w:val="24"/>
+        </w:rPr>
+        <w:t>DESCOMPLICA SOLUÇÕES (via Mercado Livre). Transdutor de Pressão 0-10 Bar 4-20mA. [S. l.], 2026. Disponível em: &lt;https://www.descomplicasolucoes.com.br/MLB-2865733954-transdutor-de-presso-0-10-bar-4-20ma-tenso-1224vdc-g14-_JM&gt;. Acesso em: 14 jul. 2026.</w:t>
+      </w:r>
+    </w:p>
+    <w:p>
+      <w:pPr>
+        <w:spacing w:line="240" w:lineRule="auto" w:after="240" w:before="0"/>
+        <w:ind w:firstLine="0" w:left="0"/>
+        <w:jc w:val="left"/>
+      </w:pPr>
+      <w:r>
+        <w:rPr>
+          <w:rFonts w:ascii="Arial" w:hAnsi="Arial" w:cs="Arial"/>
+          <w:sz w:val="24"/>
+        </w:rPr>
+        <w:t>DIMENSIONAL. Caixa de Passagem Policarbonato Cinza 7035 IP66, Tampa Transparente, 180x182x165mm. [S. l.], 2026. Disponível em: &lt;https://www.dimensional.com.br/caixa-passagem-policarbonato-cinza-7035-ip66-tampa-transparente-180x182x165mm-s-ritall/p&gt;. Acesso em: 14 jul. 2026.</w:t>
+      </w:r>
+    </w:p>
+    <w:p>
+      <w:pPr>
+        <w:spacing w:line="240" w:lineRule="auto" w:after="240" w:before="0"/>
+        <w:ind w:firstLine="0" w:left="0"/>
+        <w:jc w:val="left"/>
+      </w:pPr>
+      <w:r>
+        <w:rPr>
+          <w:rFonts w:ascii="Arial" w:hAnsi="Arial" w:cs="Arial"/>
+          <w:sz w:val="24"/>
+        </w:rPr>
+        <w:t>DYNAMIS TECHNE (host). Alternativas para a automação dos medidores triortogonais. In: CONGRESSO BRASILEIRO DO CONCRETO, 49., 2007, [S. l.]. Anais eletrônicos [...]. São Paulo: IBRACON, 2007. Disponível em: &lt;https://dynamistechne.com/wp-content/uploads/2018/07/2007-ibracon-alternativas-para-a-automacao-dos-medidores-triortogonais.pdf&gt;. Acesso em: 13 jul. 2026.</w:t>
+      </w:r>
+    </w:p>
+    <w:p>
+      <w:pPr>
+        <w:spacing w:line="240" w:lineRule="auto" w:after="240" w:before="0"/>
+        <w:ind w:firstLine="0" w:left="0"/>
+        <w:jc w:val="left"/>
+      </w:pPr>
+      <w:r>
+        <w:rPr>
+          <w:rFonts w:ascii="Arial" w:hAnsi="Arial" w:cs="Arial"/>
+          <w:sz w:val="24"/>
+        </w:rPr>
+        <w:t>ELETRODEX. Resistor de Medição Shunt. [S. l.], 2026. Disponível em: &lt;https://www.eletrodex.net/passivos/resistores/especiais/resistor-de-medicao-shunt&gt;. Acesso em: 14 jul. 2026.</w:t>
+      </w:r>
+    </w:p>
+    <w:p>
+      <w:pPr>
+        <w:spacing w:line="240" w:lineRule="auto" w:after="240" w:before="0"/>
+        <w:ind w:firstLine="0" w:left="0"/>
+        <w:jc w:val="left"/>
+      </w:pPr>
+      <w:r>
+        <w:rPr>
+          <w:rFonts w:ascii="Arial" w:hAnsi="Arial" w:cs="Arial"/>
+          <w:sz w:val="24"/>
+        </w:rPr>
+        <w:t>ELETROGATE. Módulo Micro SD Card. [S. l.], 2026. Disponível em: &lt;https://www.eletrogate.com/modulo-micro-sd-card&gt;. Acesso em: 14 jul. 2026.</w:t>
+      </w:r>
+    </w:p>
+    <w:p>
+      <w:pPr>
+        <w:spacing w:line="240" w:lineRule="auto" w:after="240" w:before="0"/>
+        <w:ind w:firstLine="0" w:left="0"/>
+        <w:jc w:val="left"/>
+      </w:pPr>
+      <w:r>
+        <w:rPr>
+          <w:rFonts w:ascii="Arial" w:hAnsi="Arial" w:cs="Arial"/>
+          <w:sz w:val="24"/>
+        </w:rPr>
+        <w:t>ENCARDIO-RITE. Geotechnical Data Logger System. [S. l.], [20--]. Disponível em: &lt;https://www.encardio.com/geotechnical-products/data-loggers&gt;. Acesso em: 13 jul. 2026.</w:t>
+      </w:r>
+    </w:p>
+    <w:p>
+      <w:pPr>
+        <w:spacing w:line="240" w:lineRule="auto" w:after="240" w:before="0"/>
+        <w:ind w:firstLine="0" w:left="0"/>
+        <w:jc w:val="left"/>
+      </w:pPr>
+      <w:r>
+        <w:rPr>
+          <w:rFonts w:ascii="Arial" w:hAnsi="Arial" w:cs="Arial"/>
+          <w:sz w:val="24"/>
+        </w:rPr>
+        <w:t>ENGEHALL. Tabela de Preço Eletricista 2026. [S. l.], 2026. Disponível em: &lt;https://engehall.com.br/tabela-preco-eletricista-2025/&gt;. Acesso em: 14 jul. 2026.</w:t>
+      </w:r>
+    </w:p>
+    <w:p>
+      <w:pPr>
+        <w:spacing w:line="240" w:lineRule="auto" w:after="240" w:before="0"/>
+        <w:ind w:firstLine="0" w:left="0"/>
+        <w:jc w:val="left"/>
+      </w:pPr>
+      <w:r>
+        <w:rPr>
+          <w:rFonts w:ascii="Arial" w:hAnsi="Arial" w:cs="Arial"/>
+          <w:sz w:val="24"/>
+        </w:rPr>
+        <w:t>GEOKON. Standard Piezometers: Model 4500 Series. Lebanon, NH, [20--]. Disponível em: &lt;https://www.geokon.com/4500-Series&gt;. Acesso em: 13 jul. 2026.</w:t>
+      </w:r>
+    </w:p>
+    <w:p>
+      <w:pPr>
+        <w:spacing w:line="240" w:lineRule="auto" w:after="240" w:before="0"/>
+        <w:ind w:firstLine="0" w:left="0"/>
+        <w:jc w:val="left"/>
+      </w:pPr>
+      <w:r>
+        <w:rPr>
+          <w:rFonts w:ascii="Arial" w:hAnsi="Arial" w:cs="Arial"/>
+          <w:sz w:val="24"/>
+        </w:rPr>
+        <w:t>GITHUB. Topics: piezometer. [S. l.], 2026. Disponível em: &lt;https://github.com/topics/piezometer&gt;. Acesso em: 13 jul. 2026.</w:t>
+      </w:r>
+    </w:p>
+    <w:p>
+      <w:pPr>
+        <w:spacing w:line="240" w:lineRule="auto" w:after="240" w:before="0"/>
+        <w:ind w:firstLine="0" w:left="0"/>
+        <w:jc w:val="left"/>
+      </w:pPr>
+      <w:r>
+        <w:rPr>
+          <w:rFonts w:ascii="Arial" w:hAnsi="Arial" w:cs="Arial"/>
+          <w:sz w:val="24"/>
+        </w:rPr>
+        <w:t>HUMMEL. Caixas Industriais IP66/IP67. [S. l.], 2026. Disponível em: &lt;https://hummel.com.br/caixas/&gt;. Acesso em: 14 jul. 2026.</w:t>
+      </w:r>
+    </w:p>
+    <w:p>
+      <w:pPr>
+        <w:spacing w:line="240" w:lineRule="auto" w:after="240" w:before="0"/>
+        <w:ind w:firstLine="0" w:left="0"/>
+        <w:jc w:val="left"/>
+      </w:pPr>
+      <w:r>
+        <w:rPr>
+          <w:rFonts w:ascii="Arial" w:hAnsi="Arial" w:cs="Arial"/>
+          <w:sz w:val="24"/>
+        </w:rPr>
+        <w:t>INTERNATIONAL SOCIETY OF AUTOMATION (ISA). ISA-18.2: Management of Alarm Systems for the Process Industries. Research Triangle Park, NC: ISA, 2016. Disponível em: &lt;https://www.isa.org/getmedia/55b4210e-6cb2-4de4-89f8-2b5b6b46d954/PAS-Understanding-ISA-18-2.pdf&gt;. Acesso em: 14 jul. 2026.</w:t>
+      </w:r>
+    </w:p>
+    <w:p>
+      <w:pPr>
+        <w:spacing w:line="240" w:lineRule="auto" w:after="240" w:before="0"/>
+        <w:ind w:firstLine="0" w:left="0"/>
+        <w:jc w:val="left"/>
+      </w:pPr>
+      <w:r>
+        <w:rPr>
+          <w:rFonts w:ascii="Arial" w:hAnsi="Arial" w:cs="Arial"/>
+          <w:sz w:val="24"/>
+        </w:rPr>
+        <w:t>LOJA ELÉTRICA. Protetor DPS (Clamper 20kA e 45kA). [S. l.], 2026. Disponível em: &lt;https://www.lojaeletrica.com.br/protecao-eletrica/protetor-dps.html&gt;. Acesso em: 14 jul. 2026.</w:t>
+      </w:r>
+    </w:p>
+    <w:p>
+      <w:pPr>
+        <w:spacing w:line="240" w:lineRule="auto" w:after="240" w:before="0"/>
+        <w:ind w:firstLine="0" w:left="0"/>
+        <w:jc w:val="left"/>
+      </w:pPr>
+      <w:r>
+        <w:rPr>
+          <w:rFonts w:ascii="Arial" w:hAnsi="Arial" w:cs="Arial"/>
+          <w:sz w:val="24"/>
+        </w:rPr>
+        <w:t>MEG SEGURANÇA ELETRÔNICA (via Mercado Livre). Bateria Selada 12V 18Ah VRLA/AGM No-break Estacionária. [S. l.], 2026. Disponível em: &lt;https://www.megsegurancaeletronica.com.br/MLB-3523126775-bateria-selada-12v-18ah-vrla-agm-no-break-estacionaria-_JM&gt;. Acesso em: 14 jul. 2026.</w:t>
+      </w:r>
+    </w:p>
+    <w:p>
+      <w:pPr>
+        <w:spacing w:line="240" w:lineRule="auto" w:after="240" w:before="0"/>
+        <w:ind w:firstLine="0" w:left="0"/>
+        <w:jc w:val="left"/>
+      </w:pPr>
+      <w:r>
+        <w:rPr>
+          <w:rFonts w:ascii="Arial" w:hAnsi="Arial" w:cs="Arial"/>
+          <w:sz w:val="24"/>
+        </w:rPr>
+        <w:t>MERCADO LIVRE. Módulo Waveshare SIM7600G-H 4G HAT para Raspberry Pi e PC. [S. l.], 2026. Disponível em: &lt;https://www.mercadolivre.com.br/modulo-sim7600g-h-4g-hat-para-raspberry-pi-e-pc-suporta-lte/p/MLB2041822322&gt;. Acesso em: 14 jul. 2026.</w:t>
+      </w:r>
+    </w:p>
+    <w:p>
+      <w:pPr>
+        <w:spacing w:line="240" w:lineRule="auto" w:after="240" w:before="0"/>
+        <w:ind w:firstLine="0" w:left="0"/>
+        <w:jc w:val="left"/>
+      </w:pPr>
+      <w:r>
+        <w:rPr>
+          <w:rFonts w:ascii="Arial" w:hAnsi="Arial" w:cs="Arial"/>
+          <w:sz w:val="24"/>
+        </w:rPr>
+        <w:t>MERCADO LIVRE. Placa ESP32 DevKit V1. [S. l.], 2026. Disponível em: &lt;https://lista.mercadolivre.com.br/esp32-devkit-v1&gt;. Acesso em: 14 jul. 2026.</w:t>
+      </w:r>
+    </w:p>
+    <w:p>
+      <w:pPr>
+        <w:spacing w:line="240" w:lineRule="auto" w:after="240" w:before="0"/>
+        <w:ind w:firstLine="0" w:left="0"/>
+        <w:jc w:val="left"/>
+      </w:pPr>
+      <w:r>
+        <w:rPr>
+          <w:rFonts w:ascii="Arial" w:hAnsi="Arial" w:cs="Arial"/>
+          <w:sz w:val="24"/>
+        </w:rPr>
+        <w:t>MERCADO LIVRE. Resistor Shunt. [S. l.], 2026. Disponível em: &lt;https://lista.mercadolivre.com.br/resistor-shunt&gt;. Acesso em: 14 jul. 2026.</w:t>
+      </w:r>
+    </w:p>
+    <w:p>
+      <w:pPr>
+        <w:spacing w:line="240" w:lineRule="auto" w:after="240" w:before="0"/>
+        <w:ind w:firstLine="0" w:left="0"/>
+        <w:jc w:val="left"/>
+      </w:pPr>
+      <w:r>
+        <w:rPr>
+          <w:rFonts w:ascii="Arial" w:hAnsi="Arial" w:cs="Arial"/>
+          <w:sz w:val="24"/>
+        </w:rPr>
+        <w:t>MERCADO LIVRE. RTC DS3231. [S. l.], 2026. Disponível em: &lt;https://lista.mercadolivre.com.br/rtc-ds3231&gt;. Acesso em: 14 jul. 2026.</w:t>
+      </w:r>
+    </w:p>
+    <w:p>
+      <w:pPr>
+        <w:spacing w:line="240" w:lineRule="auto" w:after="240" w:before="0"/>
+        <w:ind w:firstLine="0" w:left="0"/>
+        <w:jc w:val="left"/>
+      </w:pPr>
+      <w:r>
+        <w:rPr>
+          <w:rFonts w:ascii="Arial" w:hAnsi="Arial" w:cs="Arial"/>
+          <w:sz w:val="24"/>
+        </w:rPr>
+        <w:t>NAMUR. NE 43: Standardisation of the Signal Level for the Breakdown Information of Digital Transmitters. [S. l.]: NAMUR, [19--].</w:t>
+      </w:r>
+    </w:p>
+    <w:p>
+      <w:pPr>
+        <w:spacing w:line="240" w:lineRule="auto" w:after="240" w:before="0"/>
+        <w:ind w:firstLine="0" w:left="0"/>
+        <w:jc w:val="left"/>
+      </w:pPr>
+      <w:r>
+        <w:rPr>
+          <w:rFonts w:ascii="Arial" w:hAnsi="Arial" w:cs="Arial"/>
+          <w:sz w:val="24"/>
+        </w:rPr>
+        <w:t>PELANDO. Kit Painel Solar 20w 12v Monocristalino + Controlador 10A. [S. l.], 2026. Disponível em: &lt;https://www.pelando.com.br/d/kit-painel-solar-20w-12v-monocristalino-controlador-10a-prateado-1000v-18v-ea58&gt;. Acesso em: 14 jul. 2026.</w:t>
+      </w:r>
+    </w:p>
+    <w:p>
+      <w:pPr>
+        <w:spacing w:line="240" w:lineRule="auto" w:after="240" w:before="0"/>
+        <w:ind w:firstLine="0" w:left="0"/>
+        <w:jc w:val="left"/>
+      </w:pPr>
+      <w:r>
+        <w:rPr>
+          <w:rFonts w:ascii="Arial" w:hAnsi="Arial" w:cs="Arial"/>
+          <w:sz w:val="24"/>
+        </w:rPr>
+        <w:t>RECICOMP. Placa ESP32 DevKit V1 WiFi Bluetooth. [S. l.], 2026. Disponível em: &lt;https://www.recicomp.com.br/produtos/placa-esp32-devkit-v1-wifi-bluetooth/&gt;. Acesso em: 14 jul. 2026.</w:t>
+      </w:r>
+    </w:p>
+    <w:p>
+      <w:pPr>
+        <w:spacing w:line="240" w:lineRule="auto" w:after="240" w:before="0"/>
+        <w:ind w:firstLine="0" w:left="0"/>
+        <w:jc w:val="left"/>
+      </w:pPr>
+      <w:r>
+        <w:rPr>
+          <w:rFonts w:ascii="Arial" w:hAnsi="Arial" w:cs="Arial"/>
+          <w:sz w:val="24"/>
+        </w:rPr>
+        <w:t>ROBOCORE. Módulo Cartão Micro SD. [S. l.], 2026. Disponível em: &lt;https://www.robocore.net/outros-componentes-eletronicos/modulo-cartao-micro-sd&gt;. Acesso em: 14 jul. 2026.</w:t>
+      </w:r>
+    </w:p>
+    <w:p>
+      <w:pPr>
+        <w:spacing w:line="240" w:lineRule="auto" w:after="240" w:before="0"/>
+        <w:ind w:firstLine="0" w:left="0"/>
+        <w:jc w:val="left"/>
+      </w:pPr>
+      <w:r>
+        <w:rPr>
+          <w:rFonts w:ascii="Arial" w:hAnsi="Arial" w:cs="Arial"/>
+          <w:sz w:val="24"/>
+        </w:rPr>
+        <w:t>RS ROBÓTICA. Módulo RTC DS3231. [S. l.], 2026. Disponível em: &lt;https://www.rsrobotica.com.br/modulo-rtc-ds1307&gt;. Acesso em: 14 jul. 2026.</w:t>
+      </w:r>
+    </w:p>
+    <w:p>
+      <w:pPr>
+        <w:spacing w:line="240" w:lineRule="auto" w:after="240" w:before="0"/>
+        <w:ind w:firstLine="0" w:left="0"/>
+        <w:jc w:val="left"/>
+      </w:pPr>
+      <w:r>
+        <w:rPr>
+          <w:rFonts w:ascii="Arial" w:hAnsi="Arial" w:cs="Arial"/>
+          <w:sz w:val="24"/>
+        </w:rPr>
+        <w:t>RST INSTRUMENTS. Precision Data Loggers for Geotechnical Sensors. Coquitlam, [20--]. Disponível em: &lt;https://rstinstruments.com/product-category/instruments/data-loggers/&gt;. Acesso em: 13 jul. 2026.</w:t>
+      </w:r>
+    </w:p>
+    <w:p>
+      <w:pPr>
+        <w:spacing w:line="240" w:lineRule="auto" w:after="240" w:before="0"/>
+        <w:ind w:firstLine="0" w:left="0"/>
+        <w:jc w:val="left"/>
+      </w:pPr>
+      <w:r>
+        <w:rPr>
+          <w:rFonts w:ascii="Arial" w:hAnsi="Arial" w:cs="Arial"/>
+          <w:sz w:val="24"/>
+        </w:rPr>
+        <w:t>SAMARCO MINERAÇÃO S. A. Desafio SAGA: monitoramento contínuo de piezômetros em barragens de mineração. [S. l.: s. n.], 2026.</w:t>
+      </w:r>
+    </w:p>
+    <w:p>
+      <w:pPr>
+        <w:spacing w:line="240" w:lineRule="auto" w:after="240" w:before="0"/>
+        <w:ind w:firstLine="0" w:left="0"/>
+        <w:jc w:val="left"/>
+      </w:pPr>
+      <w:r>
+        <w:rPr>
+          <w:rFonts w:ascii="Arial" w:hAnsi="Arial" w:cs="Arial"/>
+          <w:sz w:val="24"/>
+        </w:rPr>
+        <w:t>SCIENCEDIRECT. ESPiezometer: ESP32-based field tool for installation and validation of piezometric sensors for groundwater level monitoring. [S. l.], 2026. Disponível em: &lt;https://www.sciencedirect.com/science/article/pii/S2468067226000337&gt;. Acesso em: 13 jul. 2026.</w:t>
+      </w:r>
+    </w:p>
+    <w:p>
+      <w:pPr>
+        <w:spacing w:line="240" w:lineRule="auto" w:after="240" w:before="0"/>
+        <w:ind w:firstLine="0" w:left="0"/>
+        <w:jc w:val="left"/>
+      </w:pPr>
+      <w:r>
+        <w:rPr>
+          <w:rFonts w:ascii="Arial" w:hAnsi="Arial" w:cs="Arial"/>
+          <w:sz w:val="24"/>
+        </w:rPr>
+        <w:t>SISGEO. WR Log Wireless Dataloggers. [S. l.], [20--]. Disponível em: &lt;https://sisgeo.com/products/discontinued/wr-log-wireless-dataloggers/&gt;. Acesso em: 13 jul. 2026.</w:t>
+      </w:r>
+    </w:p>
+    <w:p>
+      <w:pPr>
+        <w:spacing w:line="240" w:lineRule="auto" w:after="240" w:before="0"/>
+        <w:ind w:firstLine="0" w:left="0"/>
+        <w:jc w:val="left"/>
+      </w:pPr>
+      <w:r>
+        <w:rPr>
+          <w:rFonts w:ascii="Arial" w:hAnsi="Arial" w:cs="Arial"/>
+          <w:sz w:val="24"/>
+        </w:rPr>
+        <w:t>SISTEMA NACIONAL DE INFORMAÇÕES SOBRE SEGURANÇA DE BARRAGENS (SNISB). Relatório Anual de Segurança de Barragem. Brasília, DF: ANA, 2025. Disponível em: &lt;https://www.snirh.gov.br/portal/snisb/relatorio-anual-de-seguranca-de-barragem&gt;. Acesso em: 14 jul. 2026.</w:t>
+      </w:r>
+    </w:p>
+    <w:p>
+      <w:pPr>
+        <w:spacing w:line="240" w:lineRule="auto" w:after="240" w:before="0"/>
+        <w:ind w:firstLine="0" w:left="0"/>
+        <w:jc w:val="left"/>
+      </w:pPr>
+      <w:r>
+        <w:rPr>
+          <w:rFonts w:ascii="Arial" w:hAnsi="Arial" w:cs="Arial"/>
+          <w:sz w:val="24"/>
+        </w:rPr>
+        <w:t>TRICE BRASIL. Preço da mão de obra de eletricista em 2026. [S. l.], 2026. Disponível em: &lt;https://www.tricebrasil.com.br/blog/preco-da-mao-de-obra-de-eletricista-em-2026&gt;. Acesso em: 14 jul. 2026.</w:t>
+      </w:r>
+    </w:p>
+    <w:p>
+      <w:pPr>
+        <w:spacing w:line="240" w:lineRule="auto" w:after="240" w:before="0"/>
+        <w:ind w:firstLine="0" w:left="0"/>
+        <w:jc w:val="left"/>
+      </w:pPr>
+      <w:r>
+        <w:rPr>
+          <w:rFonts w:ascii="Arial" w:hAnsi="Arial" w:cs="Arial"/>
+          <w:sz w:val="24"/>
+        </w:rPr>
+        <w:t>UBIDOTS. Preços. [S. l.], 2026. Disponível em: &lt;https://pt.ubidots.com/pricing&gt;. Acesso em: 13 jul. 2026.</w:t>
+      </w:r>
+    </w:p>
+    <w:p>
+      <w:pPr>
+        <w:spacing w:line="240" w:lineRule="auto" w:after="240" w:before="0"/>
+        <w:ind w:firstLine="0" w:left="0"/>
+        <w:jc w:val="left"/>
+      </w:pPr>
+      <w:r>
+        <w:rPr>
+          <w:rFonts w:ascii="Arial" w:hAnsi="Arial" w:cs="Arial"/>
+          <w:sz w:val="24"/>
+        </w:rPr>
+        <w:t>UNIVERSIDADE FEDERAL DE OURO PRETO (UFOP). Sistema de Monitoramento Online de Barragens. Ouro Preto: UFOP, 2019. Disponível em: &lt;https://www.monografias.ufop.br/bitstream/35400000/1818/11/MONOGRAFIA_SistemaMonitoramentoOnline.pdf&gt;. Acesso em: 13 jul. 2026.</w:t>
+      </w:r>
+    </w:p>
+    <w:p>
+      <w:pPr>
+        <w:spacing w:line="240" w:lineRule="auto" w:after="240" w:before="0"/>
+        <w:ind w:firstLine="0" w:left="0"/>
+        <w:jc w:val="left"/>
+      </w:pPr>
+      <w:r>
+        <w:rPr>
+          <w:rFonts w:ascii="Arial" w:hAnsi="Arial" w:cs="Arial"/>
+          <w:sz w:val="24"/>
+        </w:rPr>
+        <w:t>USINAINFO. Sensor de Nível Submersível para Líquidos 4 a 20mA, Sonda Inox 304. [S. l.], 2026. Disponível em: &lt;https://www.usinainfo.com.br/sensor-de-nivel/sensor-de-nivel-submersivel-para-liquidos-4-a-20ma-sonda-inox-304-1m-com-cabo-de-3m-9117.html&gt;. Acesso em: 14 jul. 2026.</w:t>
+      </w:r>
+    </w:p>
+    <w:p>
+      <w:pPr>
+        <w:spacing w:line="240" w:lineRule="auto" w:after="240" w:before="0"/>
+        <w:ind w:firstLine="0" w:left="0"/>
+        <w:jc w:val="left"/>
+      </w:pPr>
+      <w:r>
+        <w:rPr>
+          <w:rFonts w:ascii="Arial" w:hAnsi="Arial" w:cs="Arial"/>
+          <w:sz w:val="24"/>
+        </w:rPr>
+        <w:t>VIVO. Chip M2M para Empresas. [S. l.], 2026. Disponível em: &lt;https://vivo.com.br/para-empresas/produtos-e-servicos/servicos-essenciais/movel/m2m-e-kite-platform&gt;. Acesso em: 14 jul. 2026.</w:t>
+      </w:r>
+    </w:p>
+    <w:p>
+      <w:pPr>
+        <w:spacing w:line="240" w:lineRule="auto" w:after="240" w:before="0"/>
+        <w:ind w:firstLine="0" w:left="0"/>
+        <w:jc w:val="left"/>
+      </w:pPr>
+      <w:r>
+        <w:rPr>
+          <w:rFonts w:ascii="Arial" w:hAnsi="Arial" w:cs="Arial"/>
+          <w:sz w:val="24"/>
+        </w:rPr>
+        <w:t>WORLDSENSING. Piconode: Compact Data Logger. [S. l.], [20--]. Disponível em: &lt;https://www.worldsensing.com/product/piconode-data-acquisition/&gt;. Acesso em: 13 jul. 2026.</w:t>
+      </w:r>
+    </w:p>
     <w:sectPr>
       <w:pgSz w:w="11906" w:h="16838"/>
       <w:pgMar w:top="1701" w:right="1134" w:bottom="1134" w:left="1701" w:header="720" w:footer="720" w:gutter="0"/>

</xml_diff>

<commit_message>
Viabilidade economica por topicos de indicador (estilo do TCC anterior)
Resultados reestruturados em cinco topicos nomeados com o valor na
propria linha: Investimento inicial (R$260 mil), Custo operacional
anual (R$39.155), Economia anual gerada (R$560.845, 93,5%),
Payback do projeto (5,6 meses) e ROI do projeto (116%/978%), cada
um com sua explicacao em linguagem acessivel. Narrativa de origem
dos custos e comparacao com o mercado preservadas.

Co-Authored-By: Claude Fable 5 <noreply@anthropic.com>
Claude-Session: https://claude.ai/code/session_01RKkR7Ama1X95U16pZjmgTV
</commit_message>
<xml_diff>
--- a/docs/tcc/TCC_ENTREGA.docx
+++ b/docs/tcc/TCC_ENTREGA.docx
@@ -2423,7 +2423,7 @@
           <w:b/>
           <w:sz w:val="24"/>
         </w:rPr>
-        <w:t>Quanto passará a gastar</w:t>
+        <w:t>Indicadores de viabilidade do projeto</w:t>
       </w:r>
     </w:p>
     <w:p>
@@ -2437,7 +2437,7 @@
           <w:rFonts w:ascii="Arial" w:hAnsi="Arial" w:cs="Arial"/>
           <w:sz w:val="24"/>
         </w:rPr>
-        <w:t>Depois de instalado, o AquaSense ainda gera custo de manutenção, e ignorá-lo distorceria a comparação. Somamos a conectividade celular dos cinquenta pontos, o serviço de nuvem que recebe e processa os dados, a manutenção preventiva de peças e as inspeções físicas mensais de campo. O total é R$ 39.155 por ano, ou cerca de R$ 783 por ponto por ano. O maior item dessa conta é o chip 4G de cada ponto, calculado no cenário mais caro, com cada unidade operando de forma totalmente independente; existem duas rotas concretas para reduzir esse valor, uma pela contratação de um plano de dados sob medida para o baixo volume que o sistema realmente transmite, outra pela instalação de um único ponto de comunicação compartilhado entre os sensores próximos entre si, o que é o caso típico de uma barragem. Mesmo sem aplicar nenhuma dessas duas reduções, o custo de manutenção anual representa uma fração pequena diante da economia obtida, como mostra o cálculo a seguir.</w:t>
+        <w:t>Com os custos levantados e o gasto atual da empresa verificado, os cinco indicadores abaixo resumem a viabilidade econômica do AquaSense. Cada um traz o valor calculado e a explicação de como chegamos a ele.</w:t>
       </w:r>
     </w:p>
     <w:p>
@@ -2452,7 +2452,7 @@
           <w:b/>
           <w:sz w:val="24"/>
         </w:rPr>
-        <w:t>O que a empresa ganha</w:t>
+        <w:t>Investimento inicial do projeto: R$ 260.000,00</w:t>
       </w:r>
     </w:p>
     <w:p>
@@ -2466,7 +2466,22 @@
           <w:rFonts w:ascii="Arial" w:hAnsi="Arial" w:cs="Arial"/>
           <w:sz w:val="24"/>
         </w:rPr>
-        <w:t>Comparando a economia bruta de R$ 600.000 por ano com o custo de manutenção de R$ 39.155, sobra uma economia líquida de R$ 560.845 por ano a partir do segundo ano de operação, uma redução de 93,5% do que a empresa gastava antes. No primeiro ano, é preciso descontar também o investimento inicial de R$ 260.000, o que ainda deixa uma economia líquida de R$ 300.845 já nos primeiros doze meses.</w:t>
+        <w:t>É o valor único necessário para colocar os cinquenta pontos de monitoramento em operação, conforme a composição detalhada na tabela anterior: hardware, instalação em campo, peças sobressalentes, bancada de homologação e reserva de contingência. Equivale a R$ 5.200,00 por ponto instalado e funcionando, pago uma única vez.</w:t>
+      </w:r>
+    </w:p>
+    <w:p>
+      <w:pPr>
+        <w:spacing w:lineRule="auto" w:line="360" w:after="120" w:before="0"/>
+        <w:ind w:firstLine="709"/>
+        <w:jc w:val="both"/>
+      </w:pPr>
+      <w:r>
+        <w:rPr>
+          <w:rFonts w:ascii="Arial" w:hAnsi="Arial" w:cs="Arial"/>
+          <w:b/>
+          <w:sz w:val="24"/>
+        </w:rPr>
+        <w:t>Custo operacional anual: R$ 39.155,00</w:t>
       </w:r>
     </w:p>
     <w:p>
@@ -2480,7 +2495,94 @@
           <w:rFonts w:ascii="Arial" w:hAnsi="Arial" w:cs="Arial"/>
           <w:sz w:val="24"/>
         </w:rPr>
-        <w:t>Esse resultado permite calcular dois indicadores que costumam aparecer em qualquer análise desse tipo, e que explicamos aqui em palavras simples. O primeiro é o payback, o tempo que a economia gerada leva para pagar de volta o investimento feito. Dividindo o investimento de R$ 260.000 pela economia líquida mensal de aproximadamente R$ 46.737, chegamos a um payback de 5,6 meses: em pouco mais de meio ano de operação, o sistema já se pagou sozinho. O segundo indicador é o ROI, ou retorno sobre o investimento, que mostra quanto volta para o bolso da empresa para cada real investido. No primeiro ano, o ROI é de 116%, o que quer dizer que cada R$ 1,00 investido retorna R$ 2,16: o real investido de volta mais R$ 1,16 de ganho líquido, mesmo já contando o custo de manutenção do primeiro ano. Olhando cinco anos de operação, período em que o investimento inicial é pago uma única vez e só o custo de manutenção se repete, o retorno acumulado chega a 978%, ou seja, cada R$ 1,00 investido vira quase R$ 11,00.</w:t>
+        <w:t>Depois de instalado, o AquaSense ainda gera custo de manutenção, e ignorá-lo distorceria a comparação. O valor soma a conectividade celular dos cinquenta pontos, o serviço de nuvem que recebe e processa os dados, a manutenção preventiva de peças e as inspeções físicas mensais de campo, resultando em cerca de R$ 783,00 por ponto por ano. O maior item é o chip 4G de cada ponto, calculado no cenário mais caro, com cada unidade operando de forma totalmente independente; existem duas rotas concretas para reduzir esse valor, uma pela contratação de um plano de dados sob medida para o baixo volume que o sistema realmente transmite, outra pela instalação de um único ponto de comunicação compartilhado entre sensores próximos entre si, o que é o caso típico de uma barragem.</w:t>
+      </w:r>
+    </w:p>
+    <w:p>
+      <w:pPr>
+        <w:spacing w:lineRule="auto" w:line="360" w:after="120" w:before="0"/>
+        <w:ind w:firstLine="709"/>
+        <w:jc w:val="both"/>
+      </w:pPr>
+      <w:r>
+        <w:rPr>
+          <w:rFonts w:ascii="Arial" w:hAnsi="Arial" w:cs="Arial"/>
+          <w:b/>
+          <w:sz w:val="24"/>
+        </w:rPr>
+        <w:t>Economia anual gerada: R$ 560.845,00 (redução de 93,5%)</w:t>
+      </w:r>
+    </w:p>
+    <w:p>
+      <w:pPr>
+        <w:spacing w:lineRule="auto" w:line="360" w:after="120" w:before="0"/>
+        <w:ind w:firstLine="709"/>
+        <w:jc w:val="both"/>
+      </w:pPr>
+      <w:r>
+        <w:rPr>
+          <w:rFonts w:ascii="Arial" w:hAnsi="Arial" w:cs="Arial"/>
+          <w:sz w:val="24"/>
+        </w:rPr>
+        <w:t>Comparando o gasto atual de R$ 600.000,00 por ano com o custo operacional de R$ 39.155,00, a empresa passa a economizar R$ 560.845,00 todos os anos a partir do segundo ano de operação, uma redução de 93,5% do que gastava antes. No primeiro ano, descontando também o investimento inicial de R$ 260.000,00, a economia líquida ainda é de R$ 300.845,00 nos primeiros doze meses.</w:t>
+      </w:r>
+    </w:p>
+    <w:p>
+      <w:pPr>
+        <w:spacing w:lineRule="auto" w:line="360" w:after="120" w:before="0"/>
+        <w:ind w:firstLine="709"/>
+        <w:jc w:val="both"/>
+      </w:pPr>
+      <w:r>
+        <w:rPr>
+          <w:rFonts w:ascii="Arial" w:hAnsi="Arial" w:cs="Arial"/>
+          <w:b/>
+          <w:sz w:val="24"/>
+        </w:rPr>
+        <w:t>Payback do projeto: 5,6 meses</w:t>
+      </w:r>
+    </w:p>
+    <w:p>
+      <w:pPr>
+        <w:spacing w:lineRule="auto" w:line="360" w:after="120" w:before="0"/>
+        <w:ind w:firstLine="709"/>
+        <w:jc w:val="both"/>
+      </w:pPr>
+      <w:r>
+        <w:rPr>
+          <w:rFonts w:ascii="Arial" w:hAnsi="Arial" w:cs="Arial"/>
+          <w:sz w:val="24"/>
+        </w:rPr>
+        <w:t>Payback é o tempo que a economia gerada leva para pagar de volta o investimento feito. Dividindo o investimento de R$ 260.000,00 pela economia líquida mensal de aproximadamente R$ 46.737,00, chegamos a 5,6 meses: em pouco mais de meio ano de operação, o sistema já se pagou sozinho, e tudo o que economizar dali em diante é ganho da empresa.</w:t>
+      </w:r>
+    </w:p>
+    <w:p>
+      <w:pPr>
+        <w:spacing w:lineRule="auto" w:line="360" w:after="120" w:before="0"/>
+        <w:ind w:firstLine="709"/>
+        <w:jc w:val="both"/>
+      </w:pPr>
+      <w:r>
+        <w:rPr>
+          <w:rFonts w:ascii="Arial" w:hAnsi="Arial" w:cs="Arial"/>
+          <w:b/>
+          <w:sz w:val="24"/>
+        </w:rPr>
+        <w:t>ROI do projeto: 116% no primeiro ano e 978% em cinco anos</w:t>
+      </w:r>
+    </w:p>
+    <w:p>
+      <w:pPr>
+        <w:spacing w:lineRule="auto" w:line="360" w:after="120" w:before="0"/>
+        <w:ind w:firstLine="709"/>
+        <w:jc w:val="both"/>
+      </w:pPr>
+      <w:r>
+        <w:rPr>
+          <w:rFonts w:ascii="Arial" w:hAnsi="Arial" w:cs="Arial"/>
+          <w:sz w:val="24"/>
+        </w:rPr>
+        <w:t>ROI, ou retorno sobre o investimento, mostra quanto volta para a empresa para cada real investido. No primeiro ano, o ROI de 116% significa que cada R$ 1,00 investido retorna R$ 2,16: o real investido de volta mais R$ 1,16 de ganho líquido, já contando o custo de manutenção do período. Em cinco anos de operação, período em que o investimento inicial é pago uma única vez e apenas o custo de manutenção se repete, o retorno acumulado chega a 978%, ou seja, cada R$ 1,00 investido vira quase R$ 11,00.</w:t>
       </w:r>
     </w:p>
     <w:p>

</xml_diff>

<commit_message>
Graficos na viabilidade economica e tabelas no padrao ABNT aberto
Tres graficos gerados em Python (paleta azul/laranja validada por
contraste e daltonismo, imprime bem em P&B): composicao do
investimento (barras horizontais), custo anual manual x AquaSense
(reducao de 93,5% visivel) e saldo acumulado com ponto de
equilibrio em 5,6 meses. Embutidos no docx com legenda ABNT acima
e fonte abaixo; PNGs versionados em docs/tcc/graficos. Todas as
tabelas convertidas de grade completa para tabela aberta ABNT
(linhas horizontais no topo, cabecalho e base).

Co-Authored-By: Claude Fable 5 <noreply@anthropic.com>
Claude-Session: https://claude.ai/code/session_01RKkR7Ama1X95U16pZjmgTV
</commit_message>
<xml_diff>
--- a/docs/tcc/TCC_ENTREGA.docx
+++ b/docs/tcc/TCC_ENTREGA.docx
@@ -999,10 +999,17 @@
     </w:p>
     <w:tbl>
       <w:tblPr>
-        <w:tblStyle w:val="TableGrid"/>
         <w:tblW w:type="auto" w:w="0"/>
+        <w:tblLook w:firstColumn="1" w:firstRow="1" w:lastColumn="0" w:lastRow="0" w:noHBand="0" w:noVBand="1" w:val="04A0"/>
         <w:jc w:val="center"/>
-        <w:tblLook w:firstColumn="1" w:firstRow="1" w:lastColumn="0" w:lastRow="0" w:noHBand="0" w:noVBand="1" w:val="04A0"/>
+        <w:tblBorders>
+          <w:top w:val="single" w:sz="8" w:color="000000"/>
+          <w:bottom w:val="single" w:sz="8" w:color="000000"/>
+          <w:left w:val="none" w:sz="8" w:color="000000"/>
+          <w:right w:val="none" w:sz="8" w:color="000000"/>
+          <w:insideH w:val="none" w:sz="8" w:color="000000"/>
+          <w:insideV w:val="none" w:sz="8" w:color="000000"/>
+        </w:tblBorders>
       </w:tblPr>
       <w:tblGrid>
         <w:gridCol w:w="3024"/>
@@ -1013,6 +1020,9 @@
         <w:tc>
           <w:tcPr>
             <w:tcW w:type="dxa" w:w="3024"/>
+            <w:tcBorders>
+              <w:bottom w:val="single" w:sz="8" w:color="000000"/>
+            </w:tcBorders>
           </w:tcPr>
           <w:p>
             <w:pPr>
@@ -1033,6 +1043,9 @@
         <w:tc>
           <w:tcPr>
             <w:tcW w:type="dxa" w:w="3024"/>
+            <w:tcBorders>
+              <w:bottom w:val="single" w:sz="8" w:color="000000"/>
+            </w:tcBorders>
           </w:tcPr>
           <w:p>
             <w:pPr>
@@ -1053,6 +1066,9 @@
         <w:tc>
           <w:tcPr>
             <w:tcW w:type="dxa" w:w="3024"/>
+            <w:tcBorders>
+              <w:bottom w:val="single" w:sz="8" w:color="000000"/>
+            </w:tcBorders>
           </w:tcPr>
           <w:p>
             <w:pPr>
@@ -1941,10 +1957,17 @@
     </w:p>
     <w:tbl>
       <w:tblPr>
-        <w:tblStyle w:val="TableGrid"/>
         <w:tblW w:type="auto" w:w="0"/>
+        <w:tblLook w:firstColumn="1" w:firstRow="1" w:lastColumn="0" w:lastRow="0" w:noHBand="0" w:noVBand="1" w:val="04A0"/>
         <w:jc w:val="center"/>
-        <w:tblLook w:firstColumn="1" w:firstRow="1" w:lastColumn="0" w:lastRow="0" w:noHBand="0" w:noVBand="1" w:val="04A0"/>
+        <w:tblBorders>
+          <w:top w:val="single" w:sz="8" w:color="000000"/>
+          <w:bottom w:val="single" w:sz="8" w:color="000000"/>
+          <w:left w:val="none" w:sz="8" w:color="000000"/>
+          <w:right w:val="none" w:sz="8" w:color="000000"/>
+          <w:insideH w:val="none" w:sz="8" w:color="000000"/>
+          <w:insideV w:val="none" w:sz="8" w:color="000000"/>
+        </w:tblBorders>
       </w:tblPr>
       <w:tblGrid>
         <w:gridCol w:w="3024"/>
@@ -1955,6 +1978,9 @@
         <w:tc>
           <w:tcPr>
             <w:tcW w:type="dxa" w:w="3024"/>
+            <w:tcBorders>
+              <w:bottom w:val="single" w:sz="8" w:color="000000"/>
+            </w:tcBorders>
           </w:tcPr>
           <w:p>
             <w:pPr>
@@ -1975,6 +2001,9 @@
         <w:tc>
           <w:tcPr>
             <w:tcW w:type="dxa" w:w="3024"/>
+            <w:tcBorders>
+              <w:bottom w:val="single" w:sz="8" w:color="000000"/>
+            </w:tcBorders>
           </w:tcPr>
           <w:p>
             <w:pPr>
@@ -1995,6 +2024,9 @@
         <w:tc>
           <w:tcPr>
             <w:tcW w:type="dxa" w:w="3024"/>
+            <w:tcBorders>
+              <w:bottom w:val="single" w:sz="8" w:color="000000"/>
+            </w:tcBorders>
           </w:tcPr>
           <w:p>
             <w:pPr>
@@ -2379,7 +2411,74 @@
           <w:rFonts w:ascii="Arial" w:hAnsi="Arial" w:cs="Arial"/>
           <w:sz w:val="24"/>
         </w:rPr>
-        <w:t>O investimento total de R$ 260.000 equivale a R$ 5.200 por ponto de monitoramento já instalado e funcionando, dos quais R$ 2.965 são o próprio equipamento e o restante cobre tudo o que é preciso para colocá-lo em operação segura no campo.</w:t>
+        <w:t>O investimento total de R$ 260.000 equivale a R$ 5.200 por ponto de monitoramento já instalado e funcionando, dos quais R$ 2.965 são o próprio equipamento e o restante cobre tudo o que é preciso para colocá-lo em operação segura no campo. O gráfico abaixo apresenta a mesma composição em escala visual.</w:t>
+      </w:r>
+    </w:p>
+    <w:p>
+      <w:pPr>
+        <w:spacing w:before="200" w:after="80"/>
+        <w:jc w:val="center"/>
+      </w:pPr>
+      <w:r>
+        <w:rPr>
+          <w:rFonts w:ascii="Arial" w:hAnsi="Arial" w:cs="Arial"/>
+          <w:b/>
+          <w:sz w:val="22"/>
+        </w:rPr>
+        <w:t>Gráfico 1 – Composição do investimento total de R$ 260.000 (50 pontos)</w:t>
+      </w:r>
+    </w:p>
+    <w:p>
+      <w:pPr>
+        <w:spacing w:after="40"/>
+        <w:jc w:val="center"/>
+      </w:pPr>
+      <w:r>
+        <w:drawing>
+          <wp:inline xmlns:a="http://schemas.openxmlformats.org/drawingml/2006/main" xmlns:pic="http://schemas.openxmlformats.org/drawingml/2006/picture">
+            <wp:extent cx="5220000" cy="2479500"/>
+            <wp:docPr id="1" name="Picture 1"/>
+            <wp:cNvGraphicFramePr>
+              <a:graphicFrameLocks noChangeAspect="1"/>
+            </wp:cNvGraphicFramePr>
+            <a:graphic>
+              <a:graphicData uri="http://schemas.openxmlformats.org/drawingml/2006/picture">
+                <pic:pic>
+                  <pic:nvPicPr>
+                    <pic:cNvPr id="0" name="grafico3_capex.png"/>
+                    <pic:cNvPicPr/>
+                  </pic:nvPicPr>
+                  <pic:blipFill>
+                    <a:blip r:embed="rId9"/>
+                    <a:stretch>
+                      <a:fillRect/>
+                    </a:stretch>
+                  </pic:blipFill>
+                  <pic:spPr>
+                    <a:xfrm>
+                      <a:off x="0" y="0"/>
+                      <a:ext cx="5220000" cy="2479500"/>
+                    </a:xfrm>
+                    <a:prstGeom prst="rect"/>
+                  </pic:spPr>
+                </pic:pic>
+              </a:graphicData>
+            </a:graphic>
+          </wp:inline>
+        </w:drawing>
+      </w:r>
+    </w:p>
+    <w:p>
+      <w:pPr>
+        <w:spacing w:after="200"/>
+        <w:jc w:val="center"/>
+      </w:pPr>
+      <w:r>
+        <w:rPr>
+          <w:rFonts w:ascii="Arial" w:hAnsi="Arial" w:cs="Arial"/>
+          <w:sz w:val="20"/>
+        </w:rPr>
+        <w:t>Fonte: elaborado pelos autores (2026).</w:t>
       </w:r>
     </w:p>
     <w:p>
@@ -2524,7 +2623,74 @@
           <w:rFonts w:ascii="Arial" w:hAnsi="Arial" w:cs="Arial"/>
           <w:sz w:val="24"/>
         </w:rPr>
-        <w:t>Comparando o gasto atual de R$ 600.000,00 por ano com o custo operacional de R$ 39.155,00, a empresa passa a economizar R$ 560.845,00 todos os anos a partir do segundo ano de operação, uma redução de 93,5% do que gastava antes. No primeiro ano, descontando também o investimento inicial de R$ 260.000,00, a economia líquida ainda é de R$ 300.845,00 nos primeiros doze meses.</w:t>
+        <w:t>Comparando o gasto atual de R$ 600.000,00 por ano com o custo operacional de R$ 39.155,00, a empresa passa a economizar R$ 560.845,00 todos os anos a partir do segundo ano de operação, uma redução de 93,5% do que gastava antes. No primeiro ano, descontando também o investimento inicial de R$ 260.000,00, a economia líquida ainda é de R$ 300.845,00 nos primeiros doze meses. O contraste entre os dois custos anuais é apresentado no gráfico a seguir.</w:t>
+      </w:r>
+    </w:p>
+    <w:p>
+      <w:pPr>
+        <w:spacing w:before="200" w:after="80"/>
+        <w:jc w:val="center"/>
+      </w:pPr>
+      <w:r>
+        <w:rPr>
+          <w:rFonts w:ascii="Arial" w:hAnsi="Arial" w:cs="Arial"/>
+          <w:b/>
+          <w:sz w:val="22"/>
+        </w:rPr>
+        <w:t>Gráfico 2 – Custo anual da leitura manual em comparação com a operação do AquaSense</w:t>
+      </w:r>
+    </w:p>
+    <w:p>
+      <w:pPr>
+        <w:spacing w:after="40"/>
+        <w:jc w:val="center"/>
+      </w:pPr>
+      <w:r>
+        <w:drawing>
+          <wp:inline xmlns:a="http://schemas.openxmlformats.org/drawingml/2006/main" xmlns:pic="http://schemas.openxmlformats.org/drawingml/2006/picture">
+            <wp:extent cx="5220000" cy="3132000"/>
+            <wp:docPr id="2" name="Picture 2"/>
+            <wp:cNvGraphicFramePr>
+              <a:graphicFrameLocks noChangeAspect="1"/>
+            </wp:cNvGraphicFramePr>
+            <a:graphic>
+              <a:graphicData uri="http://schemas.openxmlformats.org/drawingml/2006/picture">
+                <pic:pic>
+                  <pic:nvPicPr>
+                    <pic:cNvPr id="0" name="grafico2_custo_anual.png"/>
+                    <pic:cNvPicPr/>
+                  </pic:nvPicPr>
+                  <pic:blipFill>
+                    <a:blip r:embed="rId10"/>
+                    <a:stretch>
+                      <a:fillRect/>
+                    </a:stretch>
+                  </pic:blipFill>
+                  <pic:spPr>
+                    <a:xfrm>
+                      <a:off x="0" y="0"/>
+                      <a:ext cx="5220000" cy="3132000"/>
+                    </a:xfrm>
+                    <a:prstGeom prst="rect"/>
+                  </pic:spPr>
+                </pic:pic>
+              </a:graphicData>
+            </a:graphic>
+          </wp:inline>
+        </w:drawing>
+      </w:r>
+    </w:p>
+    <w:p>
+      <w:pPr>
+        <w:spacing w:after="200"/>
+        <w:jc w:val="center"/>
+      </w:pPr>
+      <w:r>
+        <w:rPr>
+          <w:rFonts w:ascii="Arial" w:hAnsi="Arial" w:cs="Arial"/>
+          <w:sz w:val="20"/>
+        </w:rPr>
+        <w:t>Fonte: elaborado pelos autores (2026).</w:t>
       </w:r>
     </w:p>
     <w:p>
@@ -2553,7 +2719,74 @@
           <w:rFonts w:ascii="Arial" w:hAnsi="Arial" w:cs="Arial"/>
           <w:sz w:val="24"/>
         </w:rPr>
-        <w:t>Payback é o tempo que a economia gerada leva para pagar de volta o investimento feito. Dividindo o investimento de R$ 260.000,00 pela economia líquida mensal de aproximadamente R$ 46.737,00, chegamos a 5,6 meses: em pouco mais de meio ano de operação, o sistema já se pagou sozinho, e tudo o que economizar dali em diante é ganho da empresa.</w:t>
+        <w:t>Payback é o tempo que a economia gerada leva para pagar de volta o investimento feito. Dividindo o investimento de R$ 260.000,00 pela economia líquida mensal de aproximadamente R$ 46.737,00, chegamos a 5,6 meses: em pouco mais de meio ano de operação, o sistema já se pagou sozinho, e tudo o que economizar dali em diante é ganho da empresa. O gráfico a seguir mostra essa trajetória mês a mês, com o saldo saindo do investimento inicial negativo e cruzando o zero antes do sexto mês.</w:t>
+      </w:r>
+    </w:p>
+    <w:p>
+      <w:pPr>
+        <w:spacing w:before="200" w:after="80"/>
+        <w:jc w:val="center"/>
+      </w:pPr>
+      <w:r>
+        <w:rPr>
+          <w:rFonts w:ascii="Arial" w:hAnsi="Arial" w:cs="Arial"/>
+          <w:b/>
+          <w:sz w:val="22"/>
+        </w:rPr>
+        <w:t>Gráfico 3 – Saldo acumulado do investimento ao longo do primeiro ano de operação</w:t>
+      </w:r>
+    </w:p>
+    <w:p>
+      <w:pPr>
+        <w:spacing w:after="40"/>
+        <w:jc w:val="center"/>
+      </w:pPr>
+      <w:r>
+        <w:drawing>
+          <wp:inline xmlns:a="http://schemas.openxmlformats.org/drawingml/2006/main" xmlns:pic="http://schemas.openxmlformats.org/drawingml/2006/picture">
+            <wp:extent cx="5220000" cy="2740500"/>
+            <wp:docPr id="3" name="Picture 3"/>
+            <wp:cNvGraphicFramePr>
+              <a:graphicFrameLocks noChangeAspect="1"/>
+            </wp:cNvGraphicFramePr>
+            <a:graphic>
+              <a:graphicData uri="http://schemas.openxmlformats.org/drawingml/2006/picture">
+                <pic:pic>
+                  <pic:nvPicPr>
+                    <pic:cNvPr id="0" name="grafico1_payback.png"/>
+                    <pic:cNvPicPr/>
+                  </pic:nvPicPr>
+                  <pic:blipFill>
+                    <a:blip r:embed="rId11"/>
+                    <a:stretch>
+                      <a:fillRect/>
+                    </a:stretch>
+                  </pic:blipFill>
+                  <pic:spPr>
+                    <a:xfrm>
+                      <a:off x="0" y="0"/>
+                      <a:ext cx="5220000" cy="2740500"/>
+                    </a:xfrm>
+                    <a:prstGeom prst="rect"/>
+                  </pic:spPr>
+                </pic:pic>
+              </a:graphicData>
+            </a:graphic>
+          </wp:inline>
+        </w:drawing>
+      </w:r>
+    </w:p>
+    <w:p>
+      <w:pPr>
+        <w:spacing w:after="200"/>
+        <w:jc w:val="center"/>
+      </w:pPr>
+      <w:r>
+        <w:rPr>
+          <w:rFonts w:ascii="Arial" w:hAnsi="Arial" w:cs="Arial"/>
+          <w:sz w:val="20"/>
+        </w:rPr>
+        <w:t>Fonte: elaborado pelos autores (2026).</w:t>
       </w:r>
     </w:p>
     <w:p>
@@ -2616,10 +2849,17 @@
     </w:p>
     <w:tbl>
       <w:tblPr>
-        <w:tblStyle w:val="TableGrid"/>
         <w:tblW w:type="auto" w:w="0"/>
+        <w:tblLook w:firstColumn="1" w:firstRow="1" w:lastColumn="0" w:lastRow="0" w:noHBand="0" w:noVBand="1" w:val="04A0"/>
         <w:jc w:val="center"/>
-        <w:tblLook w:firstColumn="1" w:firstRow="1" w:lastColumn="0" w:lastRow="0" w:noHBand="0" w:noVBand="1" w:val="04A0"/>
+        <w:tblBorders>
+          <w:top w:val="single" w:sz="8" w:color="000000"/>
+          <w:bottom w:val="single" w:sz="8" w:color="000000"/>
+          <w:left w:val="none" w:sz="8" w:color="000000"/>
+          <w:right w:val="none" w:sz="8" w:color="000000"/>
+          <w:insideH w:val="none" w:sz="8" w:color="000000"/>
+          <w:insideV w:val="none" w:sz="8" w:color="000000"/>
+        </w:tblBorders>
       </w:tblPr>
       <w:tblGrid>
         <w:gridCol w:w="2268"/>
@@ -2631,6 +2871,9 @@
         <w:tc>
           <w:tcPr>
             <w:tcW w:type="dxa" w:w="2268"/>
+            <w:tcBorders>
+              <w:bottom w:val="single" w:sz="8" w:color="000000"/>
+            </w:tcBorders>
           </w:tcPr>
           <w:p>
             <w:pPr>
@@ -2651,6 +2894,9 @@
         <w:tc>
           <w:tcPr>
             <w:tcW w:type="dxa" w:w="2268"/>
+            <w:tcBorders>
+              <w:bottom w:val="single" w:sz="8" w:color="000000"/>
+            </w:tcBorders>
           </w:tcPr>
           <w:p>
             <w:pPr>
@@ -2671,6 +2917,9 @@
         <w:tc>
           <w:tcPr>
             <w:tcW w:type="dxa" w:w="2268"/>
+            <w:tcBorders>
+              <w:bottom w:val="single" w:sz="8" w:color="000000"/>
+            </w:tcBorders>
           </w:tcPr>
           <w:p>
             <w:pPr>
@@ -2691,6 +2940,9 @@
         <w:tc>
           <w:tcPr>
             <w:tcW w:type="dxa" w:w="2268"/>
+            <w:tcBorders>
+              <w:bottom w:val="single" w:sz="8" w:color="000000"/>
+            </w:tcBorders>
           </w:tcPr>
           <w:p>
             <w:pPr>
@@ -3208,10 +3460,17 @@
     </w:p>
     <w:tbl>
       <w:tblPr>
-        <w:tblStyle w:val="TableGrid"/>
         <w:tblW w:type="auto" w:w="0"/>
+        <w:tblLook w:firstColumn="1" w:firstRow="1" w:lastColumn="0" w:lastRow="0" w:noHBand="0" w:noVBand="1" w:val="04A0"/>
         <w:jc w:val="center"/>
-        <w:tblLook w:firstColumn="1" w:firstRow="1" w:lastColumn="0" w:lastRow="0" w:noHBand="0" w:noVBand="1" w:val="04A0"/>
+        <w:tblBorders>
+          <w:top w:val="single" w:sz="8" w:color="000000"/>
+          <w:bottom w:val="single" w:sz="8" w:color="000000"/>
+          <w:left w:val="none" w:sz="8" w:color="000000"/>
+          <w:right w:val="none" w:sz="8" w:color="000000"/>
+          <w:insideH w:val="none" w:sz="8" w:color="000000"/>
+          <w:insideV w:val="none" w:sz="8" w:color="000000"/>
+        </w:tblBorders>
       </w:tblPr>
       <w:tblGrid>
         <w:gridCol w:w="2268"/>
@@ -3223,6 +3482,9 @@
         <w:tc>
           <w:tcPr>
             <w:tcW w:type="dxa" w:w="2268"/>
+            <w:tcBorders>
+              <w:bottom w:val="single" w:sz="8" w:color="000000"/>
+            </w:tcBorders>
           </w:tcPr>
           <w:p>
             <w:pPr>
@@ -3243,6 +3505,9 @@
         <w:tc>
           <w:tcPr>
             <w:tcW w:type="dxa" w:w="2268"/>
+            <w:tcBorders>
+              <w:bottom w:val="single" w:sz="8" w:color="000000"/>
+            </w:tcBorders>
           </w:tcPr>
           <w:p>
             <w:pPr>
@@ -3263,6 +3528,9 @@
         <w:tc>
           <w:tcPr>
             <w:tcW w:type="dxa" w:w="2268"/>
+            <w:tcBorders>
+              <w:bottom w:val="single" w:sz="8" w:color="000000"/>
+            </w:tcBorders>
           </w:tcPr>
           <w:p>
             <w:pPr>
@@ -3283,6 +3551,9 @@
         <w:tc>
           <w:tcPr>
             <w:tcW w:type="dxa" w:w="2268"/>
+            <w:tcBorders>
+              <w:bottom w:val="single" w:sz="8" w:color="000000"/>
+            </w:tcBorders>
           </w:tcPr>
           <w:p>
             <w:pPr>

</xml_diff>

<commit_message>
Protege o gerador contra a marcacao de titulo removida por engano
Ao preencher o codigo da unidade e facil apagar tambem o "# " inicial,
que e a marcacao de titulo do markdown e nao parte do placeholder. Sem
ela o parser nao encontrava nenhum heading de nivel 1 e o script morria
com IndexError, sem dizer o motivo.

Agora o gerador valida a primeira linha e, se ela nao comecar com "# ",
explica o formato esperado. O titulo passa a ser o primeiro heading de
nivel 1 (em vez de ser procurado pelo texto do placeholder), e o script
avisa quando o codigo da unidade ainda nao foi preenchido ou nao esta
entre cerquilhas como o manual exige.

Preenchido: instrutor orientador (Jairo).

Co-Authored-By: Claude Fable 5 <noreply@anthropic.com>
</commit_message>
<xml_diff>
--- a/docs/tcc/TCC_ENTREGA.docx
+++ b/docs/tcc/TCC_ENTREGA.docx
@@ -1527,14 +1527,7 @@
     <w:p>
       <w:r/>
       <w:r>
-        <w:t xml:space="preserve">Instrutor orientador: </w:t>
-      </w:r>
-      <w:r>
-        <w:rPr>
-          <w:b/>
-          <w:color w:val="C00000"/>
-        </w:rPr>
-        <w:t>[PREENCHER: instrutor orientador]</w:t>
+        <w:t>Instrutor orientador: Jairo</w:t>
       </w:r>
     </w:p>
     <w:tbl>

</xml_diff>

<commit_message>
Reescreve Como levantamos os custos com foco no metodo
Sai a ressalva sobre a equipe nao ter formacao em financas: ela nao
responde a pergunta do orientador (como os custos foram levantados) e
enfraquece um levantamento que se sustenta sozinho.

O texto passa a abrir pelo que de fato da credibilidade ao numero: cada
preco tem loja e data registradas (julho de 2026) e fonte relacionada
nas referencias, entao qualquer valor pode ser reconferido no anuncio
original. Os precos saem do paragrafo corrido para uma sequencia legivel
e o total de R$ 1.804 fica isolado no fechamento, junto da ressalva de
que e piso de referencia, nao custo final.

Numeros, fontes e conclusao inalterados.

Co-Authored-By: Claude Fable 5 <noreply@anthropic.com>
</commit_message>
<xml_diff>
--- a/docs/tcc/TCC_ENTREGA.docx
+++ b/docs/tcc/TCC_ENTREGA.docx
@@ -2227,7 +2227,27 @@
         <w:jc w:val="both"/>
       </w:pPr>
       <w:r>
-        <w:t>Nenhum dos quatro integrantes da equipe tem formação em finanças, então tratamos este levantamento como uma pesquisa de campo: em vez de estimar os preços de memória, buscamos cada componente do sistema em lojas nacionais de eletrônica e em marketplaces, registrando o valor, a loja e a data da consulta (julho de 2026). O transdutor de pressão submersível, peça central do sistema, foi encontrado por R$ 239 na versão genérica de uso industrial; o módulo de comunicação celular 4G, por R$ 580 a R$ 760 dependendo do vendedor; o conjunto de energia solar, com painel, controlador de carga e bateria, por cerca de R$ 389; e o valor de hora de um técnico de campo para instalação, pesquisado em tabelas do setor elétrico, ficou entre R$ 150 e R$ 250. Essa pesquisa de varejo, feita componente por componente, somou R$ 1.804 por unidade, valor que serve de piso de referência: ele cobre a compra avulsa de cada peça, mas não inclui fabricação de placa própria, cabo industrial, conectores de painel nem frete e variação cambial de itens importados, custos que só aparecem quando o sistema é fabricado em série e não montado peça a peça no balcão da loja.</w:t>
+        <w:t>O levantamento foi conduzido como uma pesquisa de preços com fonte rastreável. Em vez de estimar valores por aproximação, a equipe consultou cada componente do sistema em lojas nacionais de eletrônica e em marketplaces, registrando, para cada item, o valor encontrado, a loja consultada e a data da consulta, realizada em julho de 2026. Todas as fontes estão relacionadas ao final deste documento, de modo que qualquer preço apresentado aqui pode ser reconferido no anúncio original.</w:t>
+      </w:r>
+    </w:p>
+    <w:p>
+      <w:pPr>
+        <w:spacing w:after="120"/>
+        <w:ind w:firstLine="709"/>
+        <w:jc w:val="both"/>
+      </w:pPr>
+      <w:r>
+        <w:t>O transdutor de pressão submersível, peça central do sistema, foi encontrado por R$ 239,00 na versão genérica de uso industrial. O módulo de comunicação celular 4G ficou entre R$ 580,00 e R$ 760,00, conforme o vendedor. O conjunto de energia solar, com painel, controlador de carga e bateria, custa cerca de R$ 389,00. A hora técnica para instalação em campo, pesquisada em tabelas de referência do setor elétrico, ficou entre R$ 150,00 e R$ 250,00.</w:t>
+      </w:r>
+    </w:p>
+    <w:p>
+      <w:pPr>
+        <w:spacing w:after="120"/>
+        <w:ind w:firstLine="709"/>
+        <w:jc w:val="both"/>
+      </w:pPr>
+      <w:r>
+        <w:t>Somados, os componentes pesquisados no varejo totalizam R$ 1.804,00 por unidade. Esse valor é tratado no projeto como piso de referência, e não como custo final: ele cobre a compra avulsa de cada peça no balcão da loja, mas não inclui a fabricação de placa própria, o cabo industrial, os conectores de painel, o frete nem a variação cambial dos itens importados, custos que aparecem quando o sistema passa a ser produzido em série.</w:t>
       </w:r>
     </w:p>
     <w:p>

</xml_diff>

<commit_message>
Atualiza equipe do TCC: entra Willian (firmware), sai Gustavo; nomes em ordem alfabetica
Troca aplicada na fonte unica (TCC_AQUASENSE.md) e docx regenerado. A funcao de firmware (store & forward, deep sleep, integracao com a nuvem) passa a ser do Willian, mantida como estava descrita.

Co-Authored-By: Claude Fable 5 <noreply@anthropic.com>
</commit_message>
<xml_diff>
--- a/docs/tcc/TCC_ENTREGA.docx
+++ b/docs/tcc/TCC_ENTREGA.docx
@@ -1627,7 +1627,7 @@
               <w:rPr>
                 <w:sz w:val="18"/>
               </w:rPr>
-              <w:t>Gustavo</w:t>
+              <w:t>Isadora</w:t>
             </w:r>
           </w:p>
         </w:tc>
@@ -1663,7 +1663,7 @@
               <w:rPr>
                 <w:sz w:val="18"/>
               </w:rPr>
-              <w:t>Programação do firmware em C/C++ para o microcontrolador ESP32, implementação do mecanismo de store &amp; forward com carimbo de tempo, controle do modo deep sleep e integração com o backend em nuvem.</w:t>
+              <w:t>Modelagem 3D do gabinete e dos suportes dos sensores, redação da documentação técnica oficial do projeto, cotação comercial de componentes e elaboração do orçamento de hardware (BOM).</w:t>
             </w:r>
           </w:p>
         </w:tc>
@@ -1795,7 +1795,7 @@
               <w:rPr>
                 <w:sz w:val="18"/>
               </w:rPr>
-              <w:t>Isadora</w:t>
+              <w:t>Willian</w:t>
             </w:r>
           </w:p>
         </w:tc>
@@ -1831,7 +1831,7 @@
               <w:rPr>
                 <w:sz w:val="18"/>
               </w:rPr>
-              <w:t>Modelagem 3D do gabinete e dos suportes dos sensores, redação da documentação técnica oficial do projeto, cotação comercial de componentes e elaboração do orçamento de hardware (BOM).</w:t>
+              <w:t>Programação do firmware em C/C++ para o microcontrolador ESP32, implementação do mecanismo de store &amp; forward com carimbo de tempo, controle do modo deep sleep e integração com o backend em nuvem.</w:t>
             </w:r>
           </w:p>
         </w:tc>
@@ -2123,7 +2123,7 @@
         <w:jc w:val="both"/>
       </w:pPr>
       <w:r>
-        <w:t>Na Fase II, de prototipagem e testes modulares, correspondente ao segundo bimestre, Isadora conduziu a pesquisa de preços e a cotação dos componentes junto a fornecedores nacionais, consolidando o orçamento de hardware do projeto. Marcelo dimensionou o circuito de alimentação autônoma da unidade industrial, definindo painel solar, controlador de carga e bateria selada, e especificou o condicionamento do sinal de corrente de 4 a 20 mA por resistor de shunt de precisão. Gustavo desenvolveu a primeira versão do firmware, responsável pela leitura do sensor, pela conexão de rede do microcontrolador e pelo envio das leituras. Em paralelo, Matheus elaborou o projeto mecânico da bancada hidráulica vertical de PVC e do gabinete de campo.</w:t>
+        <w:t>Na Fase II, de prototipagem e testes modulares, correspondente ao segundo bimestre, Isadora conduziu a pesquisa de preços e a cotação dos componentes junto a fornecedores nacionais, consolidando o orçamento de hardware do projeto. Marcelo dimensionou o circuito de alimentação autônoma da unidade industrial, definindo painel solar, controlador de carga e bateria selada, e especificou o condicionamento do sinal de corrente de 4 a 20 mA por resistor de shunt de precisão. Willian desenvolveu a primeira versão do firmware, responsável pela leitura do sensor, pela conexão de rede do microcontrolador e pelo envio das leituras. Em paralelo, Matheus elaborou o projeto mecânico da bancada hidráulica vertical de PVC e do gabinete de campo.</w:t>
       </w:r>
     </w:p>
     <w:p>

</xml_diff>